<commit_message>
Update CrayCare system files
</commit_message>
<xml_diff>
--- a/docs/Deliverables/Functional and Non-Functional Requirements.docx
+++ b/docs/Deliverables/Functional and Non-Functional Requirements.docx
@@ -353,6 +353,9 @@
             <w:right w:w="108" w:type="dxa"/>
           </w:tblCellMar>
         </w:tblPrEx>
+        <w:trPr>
+          <w:cantSplit w:val="true"/>
+        </w:trPr>
         <w:tc>
           <w:tcPr>
             <w:tcW w:w="9000" w:type="dxa"/>
@@ -392,7 +395,7 @@
             </w:pPr>
             <w:r>
               <w:rPr>
-                <w:rFonts w:hint="default" w:ascii="Arial Bold" w:hAnsi="Arial Bold" w:cs="Arial Bold"/>
+                <w:rFonts w:hint="default" w:ascii="Arial" w:hAnsi="Arial" w:cs="Arial" w:eastAsia="Arial"/>
                 <w:b/>
                 <w:bCs/>
                 <w:sz w:val="22"/>
@@ -422,6 +425,9 @@
             <w:right w:w="108" w:type="dxa"/>
           </w:tblCellMar>
         </w:tblPrEx>
+        <w:trPr>
+          <w:cantSplit w:val="true"/>
+        </w:trPr>
         <w:tc>
           <w:tcPr>
             <w:tcW w:w="3001" w:type="dxa"/>
@@ -466,7 +472,7 @@
             </w:pPr>
             <w:r>
               <w:rPr>
-                <w:rFonts w:hint="default" w:ascii="Arial Bold" w:hAnsi="Arial Bold" w:cs="Arial Bold"/>
+                <w:rFonts w:hint="default" w:ascii="Arial" w:hAnsi="Arial" w:cs="Arial" w:eastAsia="Arial"/>
                 <w:b/>
                 <w:bCs w:val="0"/>
                 <w:sz w:val="22"/>
@@ -521,7 +527,7 @@
             </w:pPr>
             <w:r>
               <w:rPr>
-                <w:rFonts w:hint="default" w:ascii="Arial Bold" w:hAnsi="Arial Bold" w:cs="Arial Bold"/>
+                <w:rFonts w:hint="default" w:ascii="Arial" w:hAnsi="Arial" w:cs="Arial" w:eastAsia="Arial"/>
                 <w:b/>
                 <w:bCs w:val="0"/>
                 <w:sz w:val="22"/>
@@ -576,7 +582,7 @@
             </w:pPr>
             <w:r>
               <w:rPr>
-                <w:rFonts w:hint="default" w:ascii="Arial Bold" w:hAnsi="Arial Bold" w:cs="Arial Bold"/>
+                <w:rFonts w:hint="default" w:ascii="Arial" w:hAnsi="Arial" w:cs="Arial" w:eastAsia="Arial"/>
                 <w:b/>
                 <w:bCs w:val="0"/>
                 <w:sz w:val="22"/>
@@ -631,14 +637,14 @@
             </w:pPr>
             <w:r>
               <w:rPr>
-                <w:rFonts w:hint="default" w:ascii="Arial Bold" w:hAnsi="Arial Bold" w:cs="Arial Bold"/>
+                <w:rFonts w:hint="default" w:ascii="Arial" w:hAnsi="Arial" w:cs="Arial" w:eastAsia="Arial"/>
                 <w:b/>
                 <w:bCs w:val="0"/>
                 <w:sz w:val="22"/>
                 <w:szCs w:val="22"/>
                 <w:rtl w:val="0"/>
               </w:rPr>
-              <w:t xml:space="preserve"> Status</w:t>
+              <w:t>Status</w:t>
             </w:r>
           </w:p>
         </w:tc>
@@ -660,6 +666,9 @@
             <w:right w:w="108" w:type="dxa"/>
           </w:tblCellMar>
         </w:tblPrEx>
+        <w:trPr>
+          <w:cantSplit w:val="true"/>
+        </w:trPr>
         <w:tc>
           <w:tcPr>
             <w:tcW w:w="3001" w:type="dxa"/>
@@ -693,12 +702,12 @@
             </w:pPr>
             <w:r>
               <w:rPr>
-                <w:rFonts w:hint="default" w:ascii="Arial Regular" w:hAnsi="Arial Regular" w:cs="Arial Regular"/>
-                <w:sz w:val="22"/>
-                <w:szCs w:val="22"/>
-                <w:rtl w:val="0"/>
-              </w:rPr>
-              <w:t xml:space="preserve">The system must monitor water temperature in real time </w:t>
+                <w:rFonts w:hint="default" w:ascii="Arial" w:hAnsi="Arial" w:cs="Arial" w:eastAsia="Arial"/>
+                <w:sz w:val="22"/>
+                <w:szCs w:val="22"/>
+                <w:rtl w:val="0"/>
+              </w:rPr>
+              <w:t>The system must monitor water temperature in real time.</w:t>
             </w:r>
           </w:p>
         </w:tc>
@@ -735,12 +744,12 @@
             </w:pPr>
             <w:r>
               <w:rPr>
-                <w:rFonts w:hint="default" w:ascii="Arial Regular" w:hAnsi="Arial Regular" w:cs="Arial Regular"/>
-                <w:sz w:val="22"/>
-                <w:szCs w:val="22"/>
-                <w:rtl w:val="0"/>
-              </w:rPr>
-              <w:t xml:space="preserve">Real-time temperature sensing via DS18B20 integrated with ESP32 data acquisition module </w:t>
+                <w:rFonts w:hint="default" w:ascii="Arial" w:hAnsi="Arial" w:cs="Arial" w:eastAsia="Arial"/>
+                <w:sz w:val="22"/>
+                <w:szCs w:val="22"/>
+                <w:rtl w:val="0"/>
+              </w:rPr>
+              <w:t>DS18B20-based real-time temperature monitoring.</w:t>
             </w:r>
           </w:p>
         </w:tc>
@@ -777,7 +786,7 @@
             </w:pPr>
             <w:r>
               <w:rPr>
-                <w:rFonts w:hint="default" w:ascii="Arial Regular" w:hAnsi="Arial Regular" w:cs="Arial Regular"/>
+                <w:rFonts w:hint="default" w:ascii="Arial" w:hAnsi="Arial" w:cs="Arial" w:eastAsia="Arial"/>
                 <w:sz w:val="22"/>
                 <w:szCs w:val="22"/>
                 <w:rtl w:val="0"/>
@@ -819,7 +828,7 @@
             </w:pPr>
             <w:r>
               <w:rPr>
-                <w:rFonts w:hint="default" w:ascii="Arial Regular" w:hAnsi="Arial Regular" w:cs="Arial Regular"/>
+                <w:rFonts w:hint="default" w:ascii="Arial" w:hAnsi="Arial" w:cs="Arial" w:eastAsia="Arial"/>
                 <w:sz w:val="22"/>
                 <w:szCs w:val="22"/>
                 <w:rtl w:val="0"/>
@@ -846,6 +855,9 @@
             <w:right w:w="108" w:type="dxa"/>
           </w:tblCellMar>
         </w:tblPrEx>
+        <w:trPr>
+          <w:cantSplit w:val="true"/>
+        </w:trPr>
         <w:tc>
           <w:tcPr>
             <w:tcW w:w="3001" w:type="dxa"/>
@@ -878,12 +890,12 @@
             </w:pPr>
             <w:r>
               <w:rPr>
-                <w:rFonts w:hint="default" w:ascii="Arial Regular" w:hAnsi="Arial Regular" w:cs="Arial Regular"/>
-                <w:sz w:val="22"/>
-                <w:szCs w:val="22"/>
-                <w:rtl w:val="0"/>
-              </w:rPr>
-              <w:t xml:space="preserve">The system must monitor pH level of water in real time </w:t>
+                <w:rFonts w:hint="default" w:ascii="Arial" w:hAnsi="Arial" w:cs="Arial" w:eastAsia="Arial"/>
+                <w:sz w:val="22"/>
+                <w:szCs w:val="22"/>
+                <w:rtl w:val="0"/>
+              </w:rPr>
+              <w:t>The system must monitor water pH in real time.</w:t>
             </w:r>
           </w:p>
         </w:tc>
@@ -919,12 +931,12 @@
             </w:pPr>
             <w:r>
               <w:rPr>
-                <w:rFonts w:hint="default" w:ascii="Arial Regular" w:hAnsi="Arial Regular" w:cs="Arial Regular"/>
-                <w:sz w:val="22"/>
-                <w:szCs w:val="22"/>
-                <w:rtl w:val="0"/>
-              </w:rPr>
-              <w:t xml:space="preserve">pH level monitoring using calibrated pH sensor probe interfaced with ESP32 </w:t>
+                <w:rFonts w:hint="default" w:ascii="Arial" w:hAnsi="Arial" w:cs="Arial" w:eastAsia="Arial"/>
+                <w:sz w:val="22"/>
+                <w:szCs w:val="22"/>
+                <w:rtl w:val="0"/>
+              </w:rPr>
+              <w:t>Calibrated probe-based real-time pH monitoring.</w:t>
             </w:r>
           </w:p>
         </w:tc>
@@ -948,7 +960,7 @@
             </w:pPr>
             <w:r>
               <w:rPr>
-                <w:rFonts w:hint="default" w:ascii="Arial Regular" w:hAnsi="Arial Regular" w:cs="Arial Regular"/>
+                <w:rFonts w:hint="default" w:ascii="Arial" w:hAnsi="Arial" w:cs="Arial" w:eastAsia="Arial"/>
                 <w:sz w:val="22"/>
                 <w:szCs w:val="22"/>
                 <w:rtl w:val="0"/>
@@ -977,7 +989,7 @@
             </w:pPr>
             <w:r>
               <w:rPr>
-                <w:rFonts w:hint="default" w:ascii="Arial Regular" w:hAnsi="Arial Regular" w:cs="Arial Regular"/>
+                <w:rFonts w:hint="default" w:ascii="Arial" w:hAnsi="Arial" w:cs="Arial" w:eastAsia="Arial"/>
                 <w:sz w:val="22"/>
                 <w:szCs w:val="22"/>
                 <w:rtl w:val="0"/>
@@ -1004,6 +1016,9 @@
             <w:right w:w="108" w:type="dxa"/>
           </w:tblCellMar>
         </w:tblPrEx>
+        <w:trPr>
+          <w:cantSplit w:val="true"/>
+        </w:trPr>
         <w:tc>
           <w:tcPr>
             <w:tcW w:w="3001" w:type="dxa"/>
@@ -1035,12 +1050,12 @@
             </w:pPr>
             <w:r>
               <w:rPr>
-                <w:rFonts w:hint="default" w:ascii="Arial Regular" w:hAnsi="Arial Regular" w:cs="Arial Regular"/>
-                <w:sz w:val="22"/>
-                <w:szCs w:val="22"/>
-                <w:rtl w:val="0"/>
-              </w:rPr>
-              <w:t xml:space="preserve">The system must monitor turbidity of water in real time </w:t>
+                <w:rFonts w:hint="default" w:ascii="Arial" w:hAnsi="Arial" w:cs="Arial" w:eastAsia="Arial"/>
+                <w:sz w:val="22"/>
+                <w:szCs w:val="22"/>
+                <w:rtl w:val="0"/>
+              </w:rPr>
+              <w:t>The system must monitor water turbidity in real time.</w:t>
             </w:r>
           </w:p>
         </w:tc>
@@ -1075,12 +1090,12 @@
             </w:pPr>
             <w:r>
               <w:rPr>
-                <w:rFonts w:hint="default" w:ascii="Arial Regular" w:hAnsi="Arial Regular" w:cs="Arial Regular"/>
-                <w:sz w:val="22"/>
-                <w:szCs w:val="22"/>
-                <w:rtl w:val="0"/>
-              </w:rPr>
-              <w:t xml:space="preserve">Turbidity level detection using turbidity sensor module </w:t>
+                <w:rFonts w:hint="default" w:ascii="Arial" w:hAnsi="Arial" w:cs="Arial" w:eastAsia="Arial"/>
+                <w:sz w:val="22"/>
+                <w:szCs w:val="22"/>
+                <w:rtl w:val="0"/>
+              </w:rPr>
+              <w:t>Sensor-based real-time turbidity monitoring.</w:t>
             </w:r>
           </w:p>
         </w:tc>
@@ -1103,7 +1118,7 @@
             </w:pPr>
             <w:r>
               <w:rPr>
-                <w:rFonts w:hint="default" w:ascii="Arial Regular" w:hAnsi="Arial Regular" w:cs="Arial Regular"/>
+                <w:rFonts w:hint="default" w:ascii="Arial" w:hAnsi="Arial" w:cs="Arial" w:eastAsia="Arial"/>
                 <w:sz w:val="22"/>
                 <w:szCs w:val="22"/>
                 <w:rtl w:val="0"/>
@@ -1131,7 +1146,7 @@
             </w:pPr>
             <w:r>
               <w:rPr>
-                <w:rFonts w:hint="default" w:ascii="Arial Regular" w:hAnsi="Arial Regular" w:cs="Arial Regular"/>
+                <w:rFonts w:hint="default" w:ascii="Arial" w:hAnsi="Arial" w:cs="Arial" w:eastAsia="Arial"/>
                 <w:sz w:val="22"/>
                 <w:szCs w:val="22"/>
                 <w:rtl w:val="0"/>
@@ -1158,6 +1173,9 @@
             <w:right w:w="108" w:type="dxa"/>
           </w:tblCellMar>
         </w:tblPrEx>
+        <w:trPr>
+          <w:cantSplit w:val="true"/>
+        </w:trPr>
         <w:tc>
           <w:tcPr>
             <w:tcW w:w="3001" w:type="dxa"/>
@@ -1189,12 +1207,12 @@
             </w:pPr>
             <w:r>
               <w:rPr>
-                <w:rFonts w:hint="default" w:ascii="Arial Regular" w:hAnsi="Arial Regular" w:cs="Arial Regular"/>
-                <w:sz w:val="22"/>
-                <w:szCs w:val="22"/>
-                <w:rtl w:val="0"/>
-              </w:rPr>
-              <w:t xml:space="preserve">The system must monitor dissolved oxygen (DO) level  in real time </w:t>
+                <w:rFonts w:hint="default" w:ascii="Arial" w:hAnsi="Arial" w:cs="Arial" w:eastAsia="Arial"/>
+                <w:sz w:val="22"/>
+                <w:szCs w:val="22"/>
+                <w:rtl w:val="0"/>
+              </w:rPr>
+              <w:t>The system must monitor dissolved oxygen (DO) in real time.</w:t>
             </w:r>
           </w:p>
         </w:tc>
@@ -1229,12 +1247,12 @@
             </w:pPr>
             <w:r>
               <w:rPr>
-                <w:rFonts w:hint="default" w:ascii="Arial Regular" w:hAnsi="Arial Regular" w:cs="Arial Regular"/>
-                <w:sz w:val="22"/>
-                <w:szCs w:val="22"/>
-                <w:rtl w:val="0"/>
-              </w:rPr>
-              <w:t xml:space="preserve">Dissolved oxygen monitoring using DO sensor module </w:t>
+                <w:rFonts w:hint="default" w:ascii="Arial" w:hAnsi="Arial" w:cs="Arial" w:eastAsia="Arial"/>
+                <w:sz w:val="22"/>
+                <w:szCs w:val="22"/>
+                <w:rtl w:val="0"/>
+              </w:rPr>
+              <w:t>Sensor-based real-time dissolved-oxygen monitoring.</w:t>
             </w:r>
           </w:p>
         </w:tc>
@@ -1257,7 +1275,7 @@
             </w:pPr>
             <w:r>
               <w:rPr>
-                <w:rFonts w:hint="default" w:ascii="Arial Regular" w:hAnsi="Arial Regular" w:cs="Arial Regular"/>
+                <w:rFonts w:hint="default" w:ascii="Arial" w:hAnsi="Arial" w:cs="Arial" w:eastAsia="Arial"/>
                 <w:sz w:val="22"/>
                 <w:szCs w:val="22"/>
                 <w:rtl w:val="0"/>
@@ -1285,7 +1303,7 @@
             </w:pPr>
             <w:r>
               <w:rPr>
-                <w:rFonts w:hint="default" w:ascii="Arial Regular" w:hAnsi="Arial Regular" w:cs="Arial Regular"/>
+                <w:rFonts w:hint="default" w:ascii="Arial" w:hAnsi="Arial" w:cs="Arial" w:eastAsia="Arial"/>
                 <w:sz w:val="22"/>
                 <w:szCs w:val="22"/>
                 <w:rtl w:val="0"/>
@@ -1312,6 +1330,9 @@
             <w:right w:w="108" w:type="dxa"/>
           </w:tblCellMar>
         </w:tblPrEx>
+        <w:trPr>
+          <w:cantSplit w:val="true"/>
+        </w:trPr>
         <w:tc>
           <w:tcPr>
             <w:tcW w:w="3001" w:type="dxa"/>
@@ -1343,12 +1364,12 @@
             </w:pPr>
             <w:r>
               <w:rPr>
-                <w:rFonts w:hint="default" w:ascii="Arial Regular" w:hAnsi="Arial Regular" w:cs="Arial Regular"/>
-                <w:sz w:val="22"/>
-                <w:szCs w:val="22"/>
-                <w:rtl w:val="0"/>
-              </w:rPr>
-              <w:t xml:space="preserve">The system must monitor water level of the tank in real time </w:t>
+                <w:rFonts w:hint="default" w:ascii="Arial" w:hAnsi="Arial" w:cs="Arial" w:eastAsia="Arial"/>
+                <w:sz w:val="22"/>
+                <w:szCs w:val="22"/>
+                <w:rtl w:val="0"/>
+              </w:rPr>
+              <w:t>The system must monitor tank water level in real time.</w:t>
             </w:r>
           </w:p>
         </w:tc>
@@ -1383,12 +1404,12 @@
             </w:pPr>
             <w:r>
               <w:rPr>
-                <w:rFonts w:hint="default" w:ascii="Arial Regular" w:hAnsi="Arial Regular" w:cs="Arial Regular"/>
-                <w:sz w:val="22"/>
-                <w:szCs w:val="22"/>
-                <w:rtl w:val="0"/>
-              </w:rPr>
-              <w:t>Water level detection using ultrasonic module</w:t>
+                <w:rFonts w:hint="default" w:ascii="Arial" w:hAnsi="Arial" w:cs="Arial" w:eastAsia="Arial"/>
+                <w:sz w:val="22"/>
+                <w:szCs w:val="22"/>
+                <w:rtl w:val="0"/>
+              </w:rPr>
+              <w:t>Ultrasonic real-time water-level monitoring.</w:t>
             </w:r>
           </w:p>
         </w:tc>
@@ -1411,7 +1432,7 @@
             </w:pPr>
             <w:r>
               <w:rPr>
-                <w:rFonts w:hint="default" w:ascii="Arial Regular" w:hAnsi="Arial Regular" w:cs="Arial Regular"/>
+                <w:rFonts w:hint="default" w:ascii="Arial" w:hAnsi="Arial" w:cs="Arial" w:eastAsia="Arial"/>
                 <w:sz w:val="22"/>
                 <w:szCs w:val="22"/>
                 <w:rtl w:val="0"/>
@@ -1439,7 +1460,7 @@
             </w:pPr>
             <w:r>
               <w:rPr>
-                <w:rFonts w:hint="default" w:ascii="Arial Regular" w:hAnsi="Arial Regular" w:cs="Arial Regular"/>
+                <w:rFonts w:hint="default" w:ascii="Arial" w:hAnsi="Arial" w:cs="Arial" w:eastAsia="Arial"/>
                 <w:sz w:val="22"/>
                 <w:szCs w:val="22"/>
                 <w:rtl w:val="0"/>
@@ -1466,6 +1487,9 @@
             <w:right w:w="108" w:type="dxa"/>
           </w:tblCellMar>
         </w:tblPrEx>
+        <w:trPr>
+          <w:cantSplit w:val="true"/>
+        </w:trPr>
         <w:tc>
           <w:tcPr>
             <w:tcW w:w="3001" w:type="dxa"/>
@@ -1497,12 +1521,12 @@
             </w:pPr>
             <w:r>
               <w:rPr>
-                <w:rFonts w:hint="default" w:ascii="Arial Regular" w:hAnsi="Arial Regular" w:cs="Arial Regular"/>
-                <w:sz w:val="22"/>
-                <w:szCs w:val="22"/>
-                <w:rtl w:val="0"/>
-              </w:rPr>
-              <w:t xml:space="preserve">The system must support real-time data transmission </w:t>
+                <w:rFonts w:hint="default" w:ascii="Arial" w:hAnsi="Arial" w:cs="Arial" w:eastAsia="Arial"/>
+                <w:sz w:val="22"/>
+                <w:szCs w:val="22"/>
+                <w:rtl w:val="0"/>
+              </w:rPr>
+              <w:t>The system must monitor the feeder hopper level in real time.</w:t>
             </w:r>
           </w:p>
         </w:tc>
@@ -1537,12 +1561,12 @@
             </w:pPr>
             <w:r>
               <w:rPr>
-                <w:rFonts w:hint="default" w:ascii="Arial Regular" w:hAnsi="Arial Regular" w:cs="Arial Regular"/>
-                <w:sz w:val="22"/>
-                <w:szCs w:val="22"/>
-                <w:rtl w:val="0"/>
-              </w:rPr>
-              <w:t xml:space="preserve">Wireless data transmission via ESP32 with WiFi connectivity </w:t>
+                <w:rFonts w:hint="default" w:ascii="Arial" w:hAnsi="Arial" w:cs="Arial" w:eastAsia="Arial"/>
+                <w:sz w:val="22"/>
+                <w:szCs w:val="22"/>
+                <w:rtl w:val="0"/>
+              </w:rPr>
+              <w:t>Ultrasonic-sensor monitoring of hopper level, remaining percentage, and estimated feed weight.</w:t>
             </w:r>
           </w:p>
         </w:tc>
@@ -1565,7 +1589,7 @@
             </w:pPr>
             <w:r>
               <w:rPr>
-                <w:rFonts w:hint="default" w:ascii="Arial Regular" w:hAnsi="Arial Regular" w:cs="Arial Regular"/>
+                <w:rFonts w:hint="default" w:ascii="Arial" w:hAnsi="Arial" w:cs="Arial" w:eastAsia="Arial"/>
                 <w:sz w:val="22"/>
                 <w:szCs w:val="22"/>
                 <w:rtl w:val="0"/>
@@ -1593,7 +1617,7 @@
             </w:pPr>
             <w:r>
               <w:rPr>
-                <w:rFonts w:hint="default" w:ascii="Arial Regular" w:hAnsi="Arial Regular" w:cs="Arial Regular"/>
+                <w:rFonts w:hint="default" w:ascii="Arial" w:hAnsi="Arial" w:cs="Arial" w:eastAsia="Arial"/>
                 <w:sz w:val="22"/>
                 <w:szCs w:val="22"/>
                 <w:rtl w:val="0"/>
@@ -1620,6 +1644,9 @@
             <w:right w:w="108" w:type="dxa"/>
           </w:tblCellMar>
         </w:tblPrEx>
+        <w:trPr>
+          <w:cantSplit w:val="true"/>
+        </w:trPr>
         <w:tc>
           <w:tcPr>
             <w:tcW w:w="3001" w:type="dxa"/>
@@ -1651,12 +1678,169 @@
             </w:pPr>
             <w:r>
               <w:rPr>
-                <w:rFonts w:hint="default" w:ascii="Arial Regular" w:hAnsi="Arial Regular" w:cs="Arial Regular"/>
-                <w:sz w:val="22"/>
-                <w:szCs w:val="22"/>
-                <w:rtl w:val="0"/>
-              </w:rPr>
-              <w:t>The system must circulate and filter water in the grow-out tank</w:t>
+                <w:rFonts w:hint="default" w:ascii="Arial" w:hAnsi="Arial" w:cs="Arial" w:eastAsia="Arial"/>
+                <w:sz w:val="22"/>
+                <w:szCs w:val="22"/>
+                <w:rtl w:val="0"/>
+              </w:rPr>
+              <w:t>The system must transmit sensor data in real time.</w:t>
+            </w:r>
+          </w:p>
+        </w:tc>
+        <w:tc>
+          <w:tcPr>
+            <w:tcW w:w="3123" w:type="dxa"/>
+            <w:vAlign w:val="top"/>
+          </w:tcPr>
+          <w:p>
+            <w:pPr>
+              <w:keepNext w:val="0"/>
+              <w:keepLines w:val="0"/>
+              <w:pageBreakBefore w:val="0"/>
+              <w:widowControl w:val="0"/>
+              <w:pBdr>
+                <w:top w:val="none" w:color="auto" w:sz="0" w:space="0"/>
+                <w:left w:val="none" w:color="auto" w:sz="0" w:space="0"/>
+                <w:bottom w:val="none" w:color="auto" w:sz="0" w:space="0"/>
+                <w:right w:val="none" w:color="auto" w:sz="0" w:space="0"/>
+                <w:between w:val="none" w:color="auto" w:sz="0" w:space="0"/>
+              </w:pBdr>
+              <w:shd w:val="clear" w:fill="auto"/>
+              <w:spacing w:before="0" w:after="0" w:line="240" w:lineRule="auto"/>
+              <w:ind w:left="0" w:leftChars="0" w:right="0" w:rightChars="0" w:firstLine="0" w:firstLineChars="0"/>
+              <w:jc w:val="left"/>
+              <w:rPr>
+                <w:rFonts w:hint="default" w:ascii="Arial Regular" w:hAnsi="Arial Regular" w:cs="Arial Regular"/>
+                <w:sz w:val="22"/>
+                <w:szCs w:val="22"/>
+                <w:rtl w:val="0"/>
+              </w:rPr>
+            </w:pPr>
+            <w:r>
+              <w:rPr>
+                <w:rFonts w:hint="default" w:ascii="Arial" w:hAnsi="Arial" w:cs="Arial" w:eastAsia="Arial"/>
+                <w:sz w:val="22"/>
+                <w:szCs w:val="22"/>
+                <w:rtl w:val="0"/>
+              </w:rPr>
+              <w:t>Wi-Fi-based real-time sensor data transmission.</w:t>
+            </w:r>
+          </w:p>
+        </w:tc>
+        <w:tc>
+          <w:tcPr>
+            <w:tcW w:w="1383" w:type="dxa"/>
+            <w:vAlign w:val="top"/>
+          </w:tcPr>
+          <w:p>
+            <w:pPr>
+              <w:widowControl w:val="0"/>
+              <w:spacing w:line="240" w:lineRule="auto"/>
+              <w:jc w:val="center"/>
+              <w:rPr>
+                <w:rFonts w:hint="default" w:ascii="Arial Regular" w:hAnsi="Arial Regular" w:cs="Arial Regular"/>
+                <w:sz w:val="22"/>
+                <w:szCs w:val="22"/>
+                <w:rtl w:val="0"/>
+              </w:rPr>
+            </w:pPr>
+            <w:r>
+              <w:rPr>
+                <w:rFonts w:hint="default" w:ascii="Arial" w:hAnsi="Arial" w:cs="Arial" w:eastAsia="Arial"/>
+                <w:sz w:val="22"/>
+                <w:szCs w:val="22"/>
+                <w:rtl w:val="0"/>
+              </w:rPr>
+              <w:t>High</w:t>
+            </w:r>
+          </w:p>
+        </w:tc>
+        <w:tc>
+          <w:tcPr>
+            <w:tcW w:w="1493" w:type="dxa"/>
+            <w:vAlign w:val="top"/>
+          </w:tcPr>
+          <w:p>
+            <w:pPr>
+              <w:widowControl w:val="0"/>
+              <w:spacing w:line="240" w:lineRule="auto"/>
+              <w:jc w:val="center"/>
+              <w:rPr>
+                <w:rFonts w:hint="default" w:ascii="Arial Regular" w:hAnsi="Arial Regular" w:cs="Arial Regular"/>
+                <w:sz w:val="22"/>
+                <w:szCs w:val="22"/>
+                <w:rtl w:val="0"/>
+              </w:rPr>
+            </w:pPr>
+            <w:r>
+              <w:rPr>
+                <w:rFonts w:hint="default" w:ascii="Arial" w:hAnsi="Arial" w:cs="Arial" w:eastAsia="Arial"/>
+                <w:sz w:val="22"/>
+                <w:szCs w:val="22"/>
+                <w:rtl w:val="0"/>
+              </w:rPr>
+              <w:t>Implemented</w:t>
+            </w:r>
+          </w:p>
+        </w:tc>
+      </w:tr>
+      <w:tr>
+        <w:tblPrEx>
+          <w:tblBorders>
+            <w:top w:val="single" w:color="auto" w:sz="4" w:space="0"/>
+            <w:left w:val="single" w:color="auto" w:sz="4" w:space="0"/>
+            <w:bottom w:val="single" w:color="auto" w:sz="4" w:space="0"/>
+            <w:right w:val="single" w:color="auto" w:sz="4" w:space="0"/>
+            <w:insideH w:val="single" w:color="auto" w:sz="4" w:space="0"/>
+            <w:insideV w:val="single" w:color="auto" w:sz="4" w:space="0"/>
+          </w:tblBorders>
+          <w:tblCellMar>
+            <w:top w:w="0" w:type="dxa"/>
+            <w:left w:w="108" w:type="dxa"/>
+            <w:bottom w:w="0" w:type="dxa"/>
+            <w:right w:w="108" w:type="dxa"/>
+          </w:tblCellMar>
+        </w:tblPrEx>
+        <w:trPr>
+          <w:cantSplit w:val="true"/>
+        </w:trPr>
+        <w:tc>
+          <w:tcPr>
+            <w:tcW w:w="3001" w:type="dxa"/>
+            <w:vAlign w:val="top"/>
+          </w:tcPr>
+          <w:p>
+            <w:pPr>
+              <w:keepNext w:val="0"/>
+              <w:keepLines w:val="0"/>
+              <w:pageBreakBefore w:val="0"/>
+              <w:widowControl w:val="0"/>
+              <w:pBdr>
+                <w:top w:val="none" w:color="auto" w:sz="0" w:space="0"/>
+                <w:left w:val="none" w:color="auto" w:sz="0" w:space="0"/>
+                <w:bottom w:val="none" w:color="auto" w:sz="0" w:space="0"/>
+                <w:right w:val="none" w:color="auto" w:sz="0" w:space="0"/>
+                <w:between w:val="none" w:color="auto" w:sz="0" w:space="0"/>
+              </w:pBdr>
+              <w:shd w:val="clear" w:fill="auto"/>
+              <w:spacing w:before="0" w:after="0" w:line="240" w:lineRule="auto"/>
+              <w:ind w:left="0" w:leftChars="0" w:right="0" w:rightChars="0" w:firstLine="0" w:firstLineChars="0"/>
+              <w:jc w:val="left"/>
+              <w:rPr>
+                <w:rFonts w:hint="default" w:ascii="Arial Regular" w:hAnsi="Arial Regular" w:cs="Arial Regular"/>
+                <w:sz w:val="22"/>
+                <w:szCs w:val="22"/>
+                <w:rtl w:val="0"/>
+              </w:rPr>
+            </w:pPr>
+            <w:r>
+              <w:rPr>
+                <w:rFonts w:hint="default" w:ascii="Arial" w:hAnsi="Arial" w:cs="Arial" w:eastAsia="Arial"/>
+                <w:sz w:val="22"/>
+                <w:szCs w:val="22"/>
+                <w:rtl w:val="0"/>
+              </w:rPr>
+              <w:t>The system must operate the water pump for tank circulation and the connected filtration setup.</w:t>
             </w:r>
           </w:p>
         </w:tc>
@@ -1691,31 +1875,29 @@
             </w:pPr>
             <w:r>
               <w:rPr>
-                <w:rFonts w:hint="default" w:ascii="Arial Regular" w:hAnsi="Arial Regular" w:cs="Arial Regular"/>
-                <w:sz w:val="22"/>
-                <w:szCs w:val="22"/>
-                <w:rtl w:val="0"/>
-              </w:rPr>
-              <w:t>Water circulation and filtration using pump-based RAS (Recirculating Aquaculture System)</w:t>
-            </w:r>
-            <w:r>
-              <w:rPr>
-                <w:rFonts w:hint="default" w:ascii="Arial Regular" w:hAnsi="Arial Regular" w:cs="Arial Regular"/>
+                <w:rFonts w:hint="default" w:ascii="Arial" w:hAnsi="Arial" w:cs="Arial" w:eastAsia="Arial"/>
+                <w:sz w:val="22"/>
+                <w:szCs w:val="22"/>
+                <w:rtl w:val="0"/>
+              </w:rPr>
+              <w:t>Relay-controlled water circulation and connected filtration support.</w:t>
+            </w:r>
+            <w:r>
+              <w:rPr>
+                <w:rFonts w:hint="default" w:ascii="Arial" w:hAnsi="Arial" w:cs="Arial" w:eastAsia="Arial"/>
                 <w:sz w:val="22"/>
                 <w:szCs w:val="22"/>
                 <w:rtl w:val="0"/>
                 <w:lang w:val="en-US"/>
               </w:rPr>
-              <w:t xml:space="preserve"> </w:t>
-            </w:r>
-            <w:r>
-              <w:rPr>
-                <w:rFonts w:hint="default" w:ascii="Arial Regular" w:hAnsi="Arial Regular" w:cs="Arial Regular"/>
-                <w:sz w:val="22"/>
-                <w:szCs w:val="22"/>
-                <w:rtl w:val="0"/>
-              </w:rPr>
-              <w:t xml:space="preserve">controlled via relay module  </w:t>
+            </w:r>
+            <w:r>
+              <w:rPr>
+                <w:rFonts w:hint="default" w:ascii="Arial" w:hAnsi="Arial" w:cs="Arial" w:eastAsia="Arial"/>
+                <w:sz w:val="22"/>
+                <w:szCs w:val="22"/>
+                <w:rtl w:val="0"/>
+              </w:rPr>
             </w:r>
           </w:p>
         </w:tc>
@@ -1738,7 +1920,7 @@
             </w:pPr>
             <w:r>
               <w:rPr>
-                <w:rFonts w:hint="default" w:ascii="Arial Regular" w:hAnsi="Arial Regular" w:cs="Arial Regular"/>
+                <w:rFonts w:hint="default" w:ascii="Arial" w:hAnsi="Arial" w:cs="Arial" w:eastAsia="Arial"/>
                 <w:sz w:val="22"/>
                 <w:szCs w:val="22"/>
                 <w:rtl w:val="0"/>
@@ -1766,7 +1948,7 @@
             </w:pPr>
             <w:r>
               <w:rPr>
-                <w:rFonts w:hint="default" w:ascii="Arial Regular" w:hAnsi="Arial Regular" w:cs="Arial Regular"/>
+                <w:rFonts w:hint="default" w:ascii="Arial" w:hAnsi="Arial" w:cs="Arial" w:eastAsia="Arial"/>
                 <w:sz w:val="22"/>
                 <w:szCs w:val="22"/>
                 <w:rtl w:val="0"/>
@@ -1811,54 +1993,6 @@
           <w:lang w:val="en-US"/>
         </w:rPr>
       </w:pPr>
-    </w:p>
-    <w:p>
-      <w:pPr>
-        <w:keepNext w:val="0"/>
-        <w:keepLines w:val="0"/>
-        <w:pageBreakBefore w:val="0"/>
-        <w:widowControl/>
-        <w:numPr>
-          <w:ilvl w:val="0"/>
-          <w:numId w:val="0"/>
-        </w:numPr>
-        <w:kinsoku/>
-        <w:wordWrap/>
-        <w:overflowPunct/>
-        <w:topLinePunct w:val="0"/>
-        <w:autoSpaceDE/>
-        <w:autoSpaceDN/>
-        <w:bidi w:val="0"/>
-        <w:adjustRightInd/>
-        <w:snapToGrid/>
-        <w:spacing w:line="480" w:lineRule="auto"/>
-        <w:ind w:left="719" w:leftChars="0"/>
-        <w:jc w:val="both"/>
-        <w:textAlignment w:val="auto"/>
-        <w:rPr>
-          <w:rFonts w:hint="default" w:ascii="Arial Italic" w:hAnsi="Arial Italic" w:cs="Arial Italic"/>
-          <w:b w:val="0"/>
-          <w:bCs w:val="0"/>
-          <w:i/>
-          <w:iCs/>
-          <w:sz w:val="22"/>
-          <w:szCs w:val="22"/>
-          <w:lang w:val="en-US"/>
-        </w:rPr>
-      </w:pPr>
-      <w:r>
-        <w:rPr>
-          <w:rFonts w:hint="default" w:ascii="Arial Italic" w:hAnsi="Arial Italic" w:cs="Arial Italic"/>
-          <w:b w:val="0"/>
-          <w:bCs w:val="0"/>
-          <w:i/>
-          <w:iCs/>
-          <w:sz w:val="22"/>
-          <w:szCs w:val="22"/>
-          <w:lang w:val="en-US"/>
-        </w:rPr>
-        <w:t>Continuation of Table 3.1</w:t>
-      </w:r>
     </w:p>
     <w:tbl>
       <w:tblPr>
@@ -1904,6 +2038,9 @@
             <w:right w:w="108" w:type="dxa"/>
           </w:tblCellMar>
         </w:tblPrEx>
+        <w:trPr>
+          <w:cantSplit w:val="true"/>
+        </w:trPr>
         <w:tc>
           <w:tcPr>
             <w:tcW w:w="9000" w:type="dxa"/>
@@ -1942,7 +2079,7 @@
             </w:pPr>
             <w:r>
               <w:rPr>
-                <w:rFonts w:hint="default" w:ascii="Arial Bold" w:hAnsi="Arial Bold" w:cs="Arial Bold"/>
+                <w:rFonts w:hint="default" w:ascii="Arial" w:hAnsi="Arial" w:cs="Arial" w:eastAsia="Arial"/>
                 <w:b/>
                 <w:bCs/>
                 <w:sz w:val="22"/>
@@ -1972,6 +2109,9 @@
             <w:right w:w="108" w:type="dxa"/>
           </w:tblCellMar>
         </w:tblPrEx>
+        <w:trPr>
+          <w:cantSplit w:val="true"/>
+        </w:trPr>
         <w:tc>
           <w:tcPr>
             <w:tcW w:w="3001" w:type="dxa"/>
@@ -2013,7 +2153,7 @@
             </w:pPr>
             <w:r>
               <w:rPr>
-                <w:rFonts w:hint="default" w:ascii="Arial Bold" w:hAnsi="Arial Bold" w:cs="Arial Bold"/>
+                <w:rFonts w:hint="default" w:ascii="Arial" w:hAnsi="Arial" w:cs="Arial" w:eastAsia="Arial"/>
                 <w:b/>
                 <w:bCs w:val="0"/>
                 <w:sz w:val="22"/>
@@ -2065,7 +2205,7 @@
             </w:pPr>
             <w:r>
               <w:rPr>
-                <w:rFonts w:hint="default" w:ascii="Arial Bold" w:hAnsi="Arial Bold" w:cs="Arial Bold"/>
+                <w:rFonts w:hint="default" w:ascii="Arial" w:hAnsi="Arial" w:cs="Arial" w:eastAsia="Arial"/>
                 <w:b/>
                 <w:bCs w:val="0"/>
                 <w:sz w:val="22"/>
@@ -2117,7 +2257,7 @@
             </w:pPr>
             <w:r>
               <w:rPr>
-                <w:rFonts w:hint="default" w:ascii="Arial Bold" w:hAnsi="Arial Bold" w:cs="Arial Bold"/>
+                <w:rFonts w:hint="default" w:ascii="Arial" w:hAnsi="Arial" w:cs="Arial" w:eastAsia="Arial"/>
                 <w:b/>
                 <w:bCs w:val="0"/>
                 <w:sz w:val="22"/>
@@ -2169,14 +2309,14 @@
             </w:pPr>
             <w:r>
               <w:rPr>
-                <w:rFonts w:hint="default" w:ascii="Arial Bold" w:hAnsi="Arial Bold" w:cs="Arial Bold"/>
+                <w:rFonts w:hint="default" w:ascii="Arial" w:hAnsi="Arial" w:cs="Arial" w:eastAsia="Arial"/>
                 <w:b/>
                 <w:bCs w:val="0"/>
                 <w:sz w:val="22"/>
                 <w:szCs w:val="22"/>
                 <w:rtl w:val="0"/>
               </w:rPr>
-              <w:t xml:space="preserve"> Status</w:t>
+              <w:t>Status</w:t>
             </w:r>
           </w:p>
         </w:tc>
@@ -2198,6 +2338,9 @@
             <w:right w:w="108" w:type="dxa"/>
           </w:tblCellMar>
         </w:tblPrEx>
+        <w:trPr>
+          <w:cantSplit w:val="true"/>
+        </w:trPr>
         <w:tc>
           <w:tcPr>
             <w:tcW w:w="3001" w:type="dxa"/>
@@ -2229,12 +2372,12 @@
             </w:pPr>
             <w:r>
               <w:rPr>
-                <w:rFonts w:hint="default" w:ascii="Arial Regular" w:hAnsi="Arial Regular" w:cs="Arial Regular"/>
-                <w:sz w:val="22"/>
-                <w:szCs w:val="22"/>
-                <w:rtl w:val="0"/>
-              </w:rPr>
-              <w:t>The system must provide oxygen supply to crayfish tanks</w:t>
+                <w:rFonts w:hint="default" w:ascii="Arial" w:hAnsi="Arial" w:cs="Arial" w:eastAsia="Arial"/>
+                <w:sz w:val="22"/>
+                <w:szCs w:val="22"/>
+                <w:rtl w:val="0"/>
+              </w:rPr>
+              <w:t>The system must aerate crayfish tanks.</w:t>
             </w:r>
           </w:p>
         </w:tc>
@@ -2269,12 +2412,12 @@
             </w:pPr>
             <w:r>
               <w:rPr>
-                <w:rFonts w:hint="default" w:ascii="Arial Regular" w:hAnsi="Arial Regular" w:cs="Arial Regular"/>
-                <w:sz w:val="22"/>
-                <w:szCs w:val="22"/>
-                <w:rtl w:val="0"/>
-              </w:rPr>
-              <w:t xml:space="preserve">Aeration system using air pump (aerator) controlled via relay module </w:t>
+                <w:rFonts w:hint="default" w:ascii="Arial" w:hAnsi="Arial" w:cs="Arial" w:eastAsia="Arial"/>
+                <w:sz w:val="22"/>
+                <w:szCs w:val="22"/>
+                <w:rtl w:val="0"/>
+              </w:rPr>
+              <w:t>Relay-controlled tank aeration.</w:t>
             </w:r>
           </w:p>
         </w:tc>
@@ -2297,7 +2440,7 @@
             </w:pPr>
             <w:r>
               <w:rPr>
-                <w:rFonts w:hint="default" w:ascii="Arial Regular" w:hAnsi="Arial Regular" w:cs="Arial Regular"/>
+                <w:rFonts w:hint="default" w:ascii="Arial" w:hAnsi="Arial" w:cs="Arial" w:eastAsia="Arial"/>
                 <w:sz w:val="22"/>
                 <w:szCs w:val="22"/>
                 <w:rtl w:val="0"/>
@@ -2325,7 +2468,7 @@
             </w:pPr>
             <w:r>
               <w:rPr>
-                <w:rFonts w:hint="default" w:ascii="Arial Regular" w:hAnsi="Arial Regular" w:cs="Arial Regular"/>
+                <w:rFonts w:hint="default" w:ascii="Arial" w:hAnsi="Arial" w:cs="Arial" w:eastAsia="Arial"/>
                 <w:sz w:val="22"/>
                 <w:szCs w:val="22"/>
                 <w:rtl w:val="0"/>
@@ -2352,6 +2495,9 @@
             <w:right w:w="108" w:type="dxa"/>
           </w:tblCellMar>
         </w:tblPrEx>
+        <w:trPr>
+          <w:cantSplit w:val="true"/>
+        </w:trPr>
         <w:tc>
           <w:tcPr>
             <w:tcW w:w="3001" w:type="dxa"/>
@@ -2383,12 +2529,12 @@
             </w:pPr>
             <w:r>
               <w:rPr>
-                <w:rFonts w:hint="default" w:ascii="Arial Regular" w:hAnsi="Arial Regular" w:cs="Arial Regular"/>
-                <w:sz w:val="22"/>
-                <w:szCs w:val="22"/>
-                <w:rtl w:val="0"/>
-              </w:rPr>
-              <w:t xml:space="preserve">The system must automate feeding in grow-out tank </w:t>
+                <w:rFonts w:hint="default" w:ascii="Arial" w:hAnsi="Arial" w:cs="Arial" w:eastAsia="Arial"/>
+                <w:sz w:val="22"/>
+                <w:szCs w:val="22"/>
+                <w:rtl w:val="0"/>
+              </w:rPr>
+              <w:t>The system must automate feeding in the grow-out tank.</w:t>
             </w:r>
           </w:p>
         </w:tc>
@@ -2423,12 +2569,12 @@
             </w:pPr>
             <w:r>
               <w:rPr>
-                <w:rFonts w:hint="default" w:ascii="Arial Regular" w:hAnsi="Arial Regular" w:cs="Arial Regular"/>
-                <w:sz w:val="22"/>
-                <w:szCs w:val="22"/>
-                <w:rtl w:val="0"/>
-              </w:rPr>
-              <w:t xml:space="preserve">Automated feeding mechanism using servo motor-based feeder system </w:t>
+                <w:rFonts w:hint="default" w:ascii="Arial" w:hAnsi="Arial" w:cs="Arial" w:eastAsia="Arial"/>
+                <w:sz w:val="22"/>
+                <w:szCs w:val="22"/>
+                <w:rtl w:val="0"/>
+              </w:rPr>
+              <w:t>Servo-operated automatic feed dispensing.</w:t>
             </w:r>
           </w:p>
         </w:tc>
@@ -2451,7 +2597,7 @@
             </w:pPr>
             <w:r>
               <w:rPr>
-                <w:rFonts w:hint="default" w:ascii="Arial Regular" w:hAnsi="Arial Regular" w:cs="Arial Regular"/>
+                <w:rFonts w:hint="default" w:ascii="Arial" w:hAnsi="Arial" w:cs="Arial" w:eastAsia="Arial"/>
                 <w:sz w:val="22"/>
                 <w:szCs w:val="22"/>
                 <w:rtl w:val="0"/>
@@ -2479,7 +2625,7 @@
             </w:pPr>
             <w:r>
               <w:rPr>
-                <w:rFonts w:hint="default" w:ascii="Arial Regular" w:hAnsi="Arial Regular" w:cs="Arial Regular"/>
+                <w:rFonts w:hint="default" w:ascii="Arial" w:hAnsi="Arial" w:cs="Arial" w:eastAsia="Arial"/>
                 <w:sz w:val="22"/>
                 <w:szCs w:val="22"/>
                 <w:rtl w:val="0"/>
@@ -2506,6 +2652,9 @@
             <w:right w:w="108" w:type="dxa"/>
           </w:tblCellMar>
         </w:tblPrEx>
+        <w:trPr>
+          <w:cantSplit w:val="true"/>
+        </w:trPr>
         <w:tc>
           <w:tcPr>
             <w:tcW w:w="3001" w:type="dxa"/>
@@ -2537,12 +2686,12 @@
             </w:pPr>
             <w:r>
               <w:rPr>
-                <w:rFonts w:hint="default" w:ascii="Arial Regular" w:hAnsi="Arial Regular" w:cs="Arial Regular"/>
-                <w:sz w:val="22"/>
-                <w:szCs w:val="22"/>
-                <w:rtl w:val="0"/>
-              </w:rPr>
-              <w:t>The system must monitor the feeder hopper level in real time</w:t>
+                <w:rFonts w:hint="default" w:ascii="Arial" w:hAnsi="Arial" w:cs="Arial" w:eastAsia="Arial"/>
+                <w:sz w:val="22"/>
+                <w:szCs w:val="22"/>
+                <w:rtl w:val="0"/>
+              </w:rPr>
+              <w:t>The system must automatically control the aerator and water pump in AUTO mode based on configured thresholds and valid sensor readings.</w:t>
             </w:r>
           </w:p>
         </w:tc>
@@ -2577,12 +2726,12 @@
             </w:pPr>
             <w:r>
               <w:rPr>
-                <w:rFonts w:hint="default" w:ascii="Arial Regular" w:hAnsi="Arial Regular" w:cs="Arial Regular"/>
-                <w:sz w:val="22"/>
-                <w:szCs w:val="22"/>
-                <w:rtl w:val="0"/>
-              </w:rPr>
-              <w:t>Feed-level sensing through the ESP32, including percentage and estimated remaining grams based on the configured hopper capacity</w:t>
+                <w:rFonts w:hint="default" w:ascii="Arial" w:hAnsi="Arial" w:cs="Arial" w:eastAsia="Arial"/>
+                <w:sz w:val="22"/>
+                <w:szCs w:val="22"/>
+                <w:rtl w:val="0"/>
+              </w:rPr>
+              <w:t>Threshold-based AUTO control for aerators and the water pump using valid sensor readings.</w:t>
             </w:r>
           </w:p>
         </w:tc>
@@ -2605,7 +2754,7 @@
             </w:pPr>
             <w:r>
               <w:rPr>
-                <w:rFonts w:hint="default" w:ascii="Arial Regular" w:hAnsi="Arial Regular" w:cs="Arial Regular"/>
+                <w:rFonts w:hint="default" w:ascii="Arial" w:hAnsi="Arial" w:cs="Arial" w:eastAsia="Arial"/>
                 <w:sz w:val="22"/>
                 <w:szCs w:val="22"/>
                 <w:rtl w:val="0"/>
@@ -2629,14 +2778,16 @@
                 <w:sz w:val="22"/>
                 <w:szCs w:val="22"/>
                 <w:rtl w:val="0"/>
-              </w:rPr>
-            </w:pPr>
-            <w:r>
-              <w:rPr>
-                <w:rFonts w:hint="default" w:ascii="Arial Regular" w:hAnsi="Arial Regular" w:cs="Arial Regular"/>
-                <w:sz w:val="22"/>
-                <w:szCs w:val="22"/>
-                <w:rtl w:val="0"/>
+                <w:lang w:val="en-US"/>
+              </w:rPr>
+            </w:pPr>
+            <w:r>
+              <w:rPr>
+                <w:rFonts w:hint="default" w:ascii="Arial" w:hAnsi="Arial" w:cs="Arial" w:eastAsia="Arial"/>
+                <w:sz w:val="22"/>
+                <w:szCs w:val="22"/>
+                <w:rtl w:val="0"/>
+                <w:lang w:val="en-US"/>
               </w:rPr>
               <w:t>Implemented</w:t>
             </w:r>
@@ -2660,9 +2811,13 @@
             <w:right w:w="108" w:type="dxa"/>
           </w:tblCellMar>
         </w:tblPrEx>
-        <w:tc>
-          <w:tcPr>
-            <w:tcW w:w="3001" w:type="dxa"/>
+        <w:trPr>
+          <w:cantSplit w:val="true"/>
+        </w:trPr>
+        <w:tc>
+          <w:tcPr>
+            <w:tcW w:w="9000" w:type="dxa"/>
+            <w:gridSpan w:val="4"/>
             <w:vAlign w:val="top"/>
           </w:tcPr>
           <w:p>
@@ -2671,130 +2826,35 @@
               <w:keepLines w:val="0"/>
               <w:pageBreakBefore w:val="0"/>
               <w:widowControl w:val="0"/>
-              <w:pBdr>
-                <w:top w:val="none" w:color="auto" w:sz="0" w:space="0"/>
-                <w:left w:val="none" w:color="auto" w:sz="0" w:space="0"/>
-                <w:bottom w:val="none" w:color="auto" w:sz="0" w:space="0"/>
-                <w:right w:val="none" w:color="auto" w:sz="0" w:space="0"/>
-                <w:between w:val="none" w:color="auto" w:sz="0" w:space="0"/>
-              </w:pBdr>
-              <w:shd w:val="clear" w:fill="auto"/>
-              <w:spacing w:before="0" w:after="0" w:line="240" w:lineRule="auto"/>
-              <w:ind w:left="0" w:leftChars="0" w:right="0" w:rightChars="0" w:firstLine="0" w:firstLineChars="0"/>
+              <w:kinsoku/>
+              <w:wordWrap/>
+              <w:overflowPunct/>
+              <w:topLinePunct w:val="0"/>
+              <w:autoSpaceDE/>
+              <w:autoSpaceDN/>
+              <w:bidi w:val="0"/>
+              <w:adjustRightInd/>
+              <w:snapToGrid/>
+              <w:spacing w:before="181" w:beforeLines="50" w:after="181" w:afterLines="50" w:line="240" w:lineRule="auto"/>
               <w:jc w:val="left"/>
-              <w:rPr>
-                <w:rFonts w:hint="default" w:ascii="Arial Regular" w:hAnsi="Arial Regular" w:cs="Arial Regular"/>
-                <w:sz w:val="22"/>
-                <w:szCs w:val="22"/>
-                <w:rtl w:val="0"/>
-              </w:rPr>
-            </w:pPr>
-            <w:r>
-              <w:rPr>
-                <w:rFonts w:hint="default" w:ascii="Arial Regular" w:hAnsi="Arial Regular" w:cs="Arial Regular"/>
-                <w:sz w:val="22"/>
-                <w:szCs w:val="22"/>
-                <w:rtl w:val="0"/>
-              </w:rPr>
-              <w:t>The system must automatically trigger actuators based on sensor threshold rules to maintain water quality.</w:t>
-            </w:r>
-          </w:p>
-        </w:tc>
-        <w:tc>
-          <w:tcPr>
-            <w:tcW w:w="3123" w:type="dxa"/>
-            <w:vAlign w:val="top"/>
-          </w:tcPr>
-          <w:p>
-            <w:pPr>
-              <w:keepNext w:val="0"/>
-              <w:keepLines w:val="0"/>
-              <w:pageBreakBefore w:val="0"/>
-              <w:widowControl w:val="0"/>
-              <w:pBdr>
-                <w:top w:val="none" w:color="auto" w:sz="0" w:space="0"/>
-                <w:left w:val="none" w:color="auto" w:sz="0" w:space="0"/>
-                <w:bottom w:val="none" w:color="auto" w:sz="0" w:space="0"/>
-                <w:right w:val="none" w:color="auto" w:sz="0" w:space="0"/>
-                <w:between w:val="none" w:color="auto" w:sz="0" w:space="0"/>
-              </w:pBdr>
-              <w:shd w:val="clear" w:fill="auto"/>
-              <w:spacing w:before="0" w:after="0" w:line="240" w:lineRule="auto"/>
-              <w:ind w:left="0" w:leftChars="0" w:right="0" w:rightChars="0" w:firstLine="0" w:firstLineChars="0"/>
-              <w:jc w:val="left"/>
-              <w:rPr>
-                <w:rFonts w:hint="default" w:ascii="Arial Regular" w:hAnsi="Arial Regular" w:cs="Arial Regular"/>
-                <w:sz w:val="22"/>
-                <w:szCs w:val="22"/>
-                <w:rtl w:val="0"/>
-              </w:rPr>
-            </w:pPr>
-            <w:r>
-              <w:rPr>
-                <w:rFonts w:hint="default" w:ascii="Arial Regular" w:hAnsi="Arial Regular" w:cs="Arial Regular"/>
-                <w:sz w:val="22"/>
-                <w:szCs w:val="22"/>
-                <w:rtl w:val="0"/>
-              </w:rPr>
-              <w:t>Automated relay triggers (ON/OFF) for the aerator and water pump when dissolved oxygen, temperature, or water level readings meet configured sensor safety thresholds.</w:t>
-            </w:r>
-          </w:p>
-        </w:tc>
-        <w:tc>
-          <w:tcPr>
-            <w:tcW w:w="1383" w:type="dxa"/>
-            <w:vAlign w:val="top"/>
-          </w:tcPr>
-          <w:p>
-            <w:pPr>
-              <w:widowControl w:val="0"/>
-              <w:spacing w:line="240" w:lineRule="auto"/>
-              <w:jc w:val="center"/>
-              <w:rPr>
-                <w:rFonts w:hint="default" w:ascii="Arial Regular" w:hAnsi="Arial Regular" w:cs="Arial Regular"/>
-                <w:sz w:val="22"/>
-                <w:szCs w:val="22"/>
-                <w:rtl w:val="0"/>
-              </w:rPr>
-            </w:pPr>
-            <w:r>
-              <w:rPr>
-                <w:rFonts w:hint="default" w:ascii="Arial Regular" w:hAnsi="Arial Regular" w:cs="Arial Regular"/>
-                <w:sz w:val="22"/>
-                <w:szCs w:val="22"/>
-                <w:rtl w:val="0"/>
-              </w:rPr>
-              <w:t>High</w:t>
-            </w:r>
-          </w:p>
-        </w:tc>
-        <w:tc>
-          <w:tcPr>
-            <w:tcW w:w="1493" w:type="dxa"/>
-            <w:vAlign w:val="top"/>
-          </w:tcPr>
-          <w:p>
-            <w:pPr>
-              <w:widowControl w:val="0"/>
-              <w:spacing w:line="240" w:lineRule="auto"/>
-              <w:jc w:val="center"/>
-              <w:rPr>
-                <w:rFonts w:hint="default" w:ascii="Arial Regular" w:hAnsi="Arial Regular" w:cs="Arial Regular"/>
-                <w:sz w:val="22"/>
-                <w:szCs w:val="22"/>
-                <w:rtl w:val="0"/>
-                <w:lang w:val="en-US"/>
-              </w:rPr>
-            </w:pPr>
-            <w:r>
-              <w:rPr>
-                <w:rFonts w:hint="default" w:ascii="Arial Regular" w:hAnsi="Arial Regular" w:cs="Arial Regular"/>
-                <w:sz w:val="22"/>
-                <w:szCs w:val="22"/>
-                <w:rtl w:val="0"/>
-                <w:lang w:val="en-US"/>
-              </w:rPr>
-              <w:t>Implemented</w:t>
+              <w:textAlignment w:val="auto"/>
+              <w:rPr>
+                <w:rFonts w:hint="default" w:ascii="Arial Regular" w:hAnsi="Arial Regular" w:cs="Arial Regular"/>
+                <w:sz w:val="22"/>
+                <w:szCs w:val="22"/>
+                <w:rtl w:val="0"/>
+              </w:rPr>
+            </w:pPr>
+            <w:r>
+              <w:rPr>
+                <w:rFonts w:hint="default" w:ascii="Arial" w:hAnsi="Arial" w:cs="Arial" w:eastAsia="Arial"/>
+                <w:b/>
+                <w:bCs/>
+                <w:sz w:val="22"/>
+                <w:szCs w:val="22"/>
+                <w:rtl w:val="0"/>
+              </w:rPr>
+              <w:t>Software Requirements</w:t>
             </w:r>
           </w:p>
         </w:tc>
@@ -2816,68 +2876,9 @@
             <w:right w:w="108" w:type="dxa"/>
           </w:tblCellMar>
         </w:tblPrEx>
-        <w:tc>
-          <w:tcPr>
-            <w:tcW w:w="9000" w:type="dxa"/>
-            <w:gridSpan w:val="4"/>
-            <w:vAlign w:val="top"/>
-          </w:tcPr>
-          <w:p>
-            <w:pPr>
-              <w:keepNext w:val="0"/>
-              <w:keepLines w:val="0"/>
-              <w:pageBreakBefore w:val="0"/>
-              <w:widowControl w:val="0"/>
-              <w:kinsoku/>
-              <w:wordWrap/>
-              <w:overflowPunct/>
-              <w:topLinePunct w:val="0"/>
-              <w:autoSpaceDE/>
-              <w:autoSpaceDN/>
-              <w:bidi w:val="0"/>
-              <w:adjustRightInd/>
-              <w:snapToGrid/>
-              <w:spacing w:before="181" w:beforeLines="50" w:after="181" w:afterLines="50" w:line="240" w:lineRule="auto"/>
-              <w:jc w:val="left"/>
-              <w:textAlignment w:val="auto"/>
-              <w:rPr>
-                <w:rFonts w:hint="default" w:ascii="Arial Regular" w:hAnsi="Arial Regular" w:cs="Arial Regular"/>
-                <w:sz w:val="22"/>
-                <w:szCs w:val="22"/>
-                <w:rtl w:val="0"/>
-              </w:rPr>
-            </w:pPr>
-            <w:r>
-              <w:rPr>
-                <w:rFonts w:hint="default" w:ascii="Arial Bold" w:hAnsi="Arial Bold" w:cs="Arial Bold"/>
-                <w:b/>
-                <w:bCs/>
-                <w:sz w:val="22"/>
-                <w:szCs w:val="22"/>
-                <w:rtl w:val="0"/>
-              </w:rPr>
-              <w:t>Software Requirements</w:t>
-            </w:r>
-          </w:p>
-        </w:tc>
-      </w:tr>
-      <w:tr>
-        <w:tblPrEx>
-          <w:tblBorders>
-            <w:top w:val="single" w:color="auto" w:sz="4" w:space="0"/>
-            <w:left w:val="single" w:color="auto" w:sz="4" w:space="0"/>
-            <w:bottom w:val="single" w:color="auto" w:sz="4" w:space="0"/>
-            <w:right w:val="single" w:color="auto" w:sz="4" w:space="0"/>
-            <w:insideH w:val="single" w:color="auto" w:sz="4" w:space="0"/>
-            <w:insideV w:val="single" w:color="auto" w:sz="4" w:space="0"/>
-          </w:tblBorders>
-          <w:tblCellMar>
-            <w:top w:w="0" w:type="dxa"/>
-            <w:left w:w="108" w:type="dxa"/>
-            <w:bottom w:w="0" w:type="dxa"/>
-            <w:right w:w="108" w:type="dxa"/>
-          </w:tblCellMar>
-        </w:tblPrEx>
+        <w:trPr>
+          <w:cantSplit w:val="true"/>
+        </w:trPr>
         <w:tc>
           <w:tcPr>
             <w:tcW w:w="3001" w:type="dxa"/>
@@ -2919,7 +2920,7 @@
             </w:pPr>
             <w:r>
               <w:rPr>
-                <w:rFonts w:hint="default" w:ascii="Arial Bold" w:hAnsi="Arial Bold" w:cs="Arial Bold"/>
+                <w:rFonts w:hint="default" w:ascii="Arial" w:hAnsi="Arial" w:cs="Arial" w:eastAsia="Arial"/>
                 <w:b/>
                 <w:bCs w:val="0"/>
                 <w:sz w:val="22"/>
@@ -2971,7 +2972,7 @@
             </w:pPr>
             <w:r>
               <w:rPr>
-                <w:rFonts w:hint="default" w:ascii="Arial Bold" w:hAnsi="Arial Bold" w:cs="Arial Bold"/>
+                <w:rFonts w:hint="default" w:ascii="Arial" w:hAnsi="Arial" w:cs="Arial" w:eastAsia="Arial"/>
                 <w:b/>
                 <w:bCs w:val="0"/>
                 <w:sz w:val="22"/>
@@ -3023,7 +3024,7 @@
             </w:pPr>
             <w:r>
               <w:rPr>
-                <w:rFonts w:hint="default" w:ascii="Arial Bold" w:hAnsi="Arial Bold" w:cs="Arial Bold"/>
+                <w:rFonts w:hint="default" w:ascii="Arial" w:hAnsi="Arial" w:cs="Arial" w:eastAsia="Arial"/>
                 <w:b/>
                 <w:bCs w:val="0"/>
                 <w:sz w:val="22"/>
@@ -3075,14 +3076,14 @@
             </w:pPr>
             <w:r>
               <w:rPr>
-                <w:rFonts w:hint="default" w:ascii="Arial Bold" w:hAnsi="Arial Bold" w:cs="Arial Bold"/>
+                <w:rFonts w:hint="default" w:ascii="Arial" w:hAnsi="Arial" w:cs="Arial" w:eastAsia="Arial"/>
                 <w:b/>
                 <w:bCs w:val="0"/>
                 <w:sz w:val="22"/>
                 <w:szCs w:val="22"/>
                 <w:rtl w:val="0"/>
               </w:rPr>
-              <w:t xml:space="preserve"> Status</w:t>
+              <w:t>Status</w:t>
             </w:r>
           </w:p>
         </w:tc>
@@ -3104,6 +3105,9 @@
             <w:right w:w="108" w:type="dxa"/>
           </w:tblCellMar>
         </w:tblPrEx>
+        <w:trPr>
+          <w:cantSplit w:val="true"/>
+        </w:trPr>
         <w:tc>
           <w:tcPr>
             <w:tcW w:w="3001" w:type="dxa"/>
@@ -3135,12 +3139,12 @@
             </w:pPr>
             <w:r>
               <w:rPr>
-                <w:rFonts w:hint="default" w:ascii="Arial Regular" w:hAnsi="Arial Regular" w:cs="Arial Regular"/>
-                <w:sz w:val="22"/>
-                <w:szCs w:val="22"/>
-                <w:rtl w:val="0"/>
-              </w:rPr>
-              <w:t>The system must allow secure user authentication and account recovery</w:t>
+                <w:rFonts w:hint="default" w:ascii="Arial" w:hAnsi="Arial" w:cs="Arial" w:eastAsia="Arial"/>
+                <w:sz w:val="22"/>
+                <w:szCs w:val="22"/>
+                <w:rtl w:val="0"/>
+              </w:rPr>
+              <w:t>The system must allow secure user authentication and account recovery.</w:t>
             </w:r>
           </w:p>
         </w:tc>
@@ -3175,12 +3179,12 @@
             </w:pPr>
             <w:r>
               <w:rPr>
-                <w:rFonts w:hint="default" w:ascii="Arial Regular" w:hAnsi="Arial Regular" w:cs="Arial Regular"/>
-                <w:sz w:val="22"/>
-                <w:szCs w:val="22"/>
-                <w:rtl w:val="0"/>
-              </w:rPr>
-              <w:t>Email-and-password registration, email verification, sign-in, Google sign-in, password reset, and sign-out with active-account validation</w:t>
+                <w:rFonts w:hint="default" w:ascii="Arial" w:hAnsi="Arial" w:cs="Arial" w:eastAsia="Arial"/>
+                <w:sz w:val="22"/>
+                <w:szCs w:val="22"/>
+                <w:rtl w:val="0"/>
+              </w:rPr>
+              <w:t>Email/password and Google authentication with verification, recovery, and account-status checks.</w:t>
             </w:r>
           </w:p>
         </w:tc>
@@ -3203,7 +3207,7 @@
             </w:pPr>
             <w:r>
               <w:rPr>
-                <w:rFonts w:hint="default" w:ascii="Arial Regular" w:hAnsi="Arial Regular" w:cs="Arial Regular"/>
+                <w:rFonts w:hint="default" w:ascii="Arial" w:hAnsi="Arial" w:cs="Arial" w:eastAsia="Arial"/>
                 <w:sz w:val="22"/>
                 <w:szCs w:val="22"/>
                 <w:rtl w:val="0"/>
@@ -3231,7 +3235,7 @@
             </w:pPr>
             <w:r>
               <w:rPr>
-                <w:rFonts w:hint="default" w:ascii="Arial Regular" w:hAnsi="Arial Regular" w:cs="Arial Regular"/>
+                <w:rFonts w:hint="default" w:ascii="Arial" w:hAnsi="Arial" w:cs="Arial" w:eastAsia="Arial"/>
                 <w:sz w:val="22"/>
                 <w:szCs w:val="22"/>
                 <w:rtl w:val="0"/>
@@ -3258,6 +3262,9 @@
             <w:right w:w="108" w:type="dxa"/>
           </w:tblCellMar>
         </w:tblPrEx>
+        <w:trPr>
+          <w:cantSplit w:val="true"/>
+        </w:trPr>
         <w:tc>
           <w:tcPr>
             <w:tcW w:w="3001" w:type="dxa"/>
@@ -3289,12 +3296,12 @@
             </w:pPr>
             <w:r>
               <w:rPr>
-                <w:rFonts w:hint="default" w:ascii="Arial Regular" w:hAnsi="Arial Regular" w:cs="Arial Regular"/>
-                <w:sz w:val="22"/>
-                <w:szCs w:val="22"/>
-                <w:rtl w:val="0"/>
-              </w:rPr>
-              <w:t>The system must support role-based user access</w:t>
+                <w:rFonts w:hint="default" w:ascii="Arial" w:hAnsi="Arial" w:cs="Arial" w:eastAsia="Arial"/>
+                <w:sz w:val="22"/>
+                <w:szCs w:val="22"/>
+                <w:rtl w:val="0"/>
+              </w:rPr>
+              <w:t>The system must support role-based user access.</w:t>
             </w:r>
           </w:p>
         </w:tc>
@@ -3329,12 +3336,12 @@
             </w:pPr>
             <w:r>
               <w:rPr>
-                <w:rFonts w:hint="default" w:ascii="Arial Regular" w:hAnsi="Arial Regular" w:cs="Arial Regular"/>
-                <w:sz w:val="22"/>
-                <w:szCs w:val="22"/>
-                <w:rtl w:val="0"/>
-              </w:rPr>
-              <w:t>Role-based access control for the single System Admin and registered Tank Owners, with permissions enforced in the application and Firebase Security Rules</w:t>
+                <w:rFonts w:hint="default" w:ascii="Arial" w:hAnsi="Arial" w:cs="Arial" w:eastAsia="Arial"/>
+                <w:sz w:val="22"/>
+                <w:szCs w:val="22"/>
+                <w:rtl w:val="0"/>
+              </w:rPr>
+              <w:t>Role-based access for the System Admin and Tank Owners.</w:t>
             </w:r>
           </w:p>
         </w:tc>
@@ -3357,7 +3364,7 @@
             </w:pPr>
             <w:r>
               <w:rPr>
-                <w:rFonts w:hint="default" w:ascii="Arial Regular" w:hAnsi="Arial Regular" w:cs="Arial Regular"/>
+                <w:rFonts w:hint="default" w:ascii="Arial" w:hAnsi="Arial" w:cs="Arial" w:eastAsia="Arial"/>
                 <w:sz w:val="22"/>
                 <w:szCs w:val="22"/>
                 <w:rtl w:val="0"/>
@@ -3385,7 +3392,7 @@
             </w:pPr>
             <w:r>
               <w:rPr>
-                <w:rFonts w:hint="default" w:ascii="Arial Regular" w:hAnsi="Arial Regular" w:cs="Arial Regular"/>
+                <w:rFonts w:hint="default" w:ascii="Arial" w:hAnsi="Arial" w:cs="Arial" w:eastAsia="Arial"/>
                 <w:sz w:val="22"/>
                 <w:szCs w:val="22"/>
                 <w:rtl w:val="0"/>
@@ -3412,6 +3419,9 @@
             <w:right w:w="108" w:type="dxa"/>
           </w:tblCellMar>
         </w:tblPrEx>
+        <w:trPr>
+          <w:cantSplit w:val="true"/>
+        </w:trPr>
         <w:tc>
           <w:tcPr>
             <w:tcW w:w="3001" w:type="dxa"/>
@@ -3443,12 +3453,12 @@
             </w:pPr>
             <w:r>
               <w:rPr>
-                <w:rFonts w:hint="default" w:ascii="Arial Regular" w:hAnsi="Arial Regular" w:cs="Arial Regular"/>
-                <w:sz w:val="22"/>
-                <w:szCs w:val="22"/>
-                <w:rtl w:val="0"/>
-              </w:rPr>
-              <w:t>The system must restrict tank-operation write actions to the designated owner</w:t>
+                <w:rFonts w:hint="default" w:ascii="Arial" w:hAnsi="Arial" w:cs="Arial" w:eastAsia="Arial"/>
+                <w:sz w:val="22"/>
+                <w:szCs w:val="22"/>
+                <w:rtl w:val="0"/>
+              </w:rPr>
+              <w:t>The system must restrict tank-operation write actions to the designated owner.</w:t>
             </w:r>
           </w:p>
         </w:tc>
@@ -3483,12 +3493,12 @@
             </w:pPr>
             <w:r>
               <w:rPr>
-                <w:rFonts w:hint="default" w:ascii="Arial Regular" w:hAnsi="Arial Regular" w:cs="Arial Regular"/>
-                <w:sz w:val="22"/>
-                <w:szCs w:val="22"/>
-                <w:rtl w:val="0"/>
-              </w:rPr>
-              <w:t>Owner-only threshold, feeding, actuator, sampling, and tank-operation writes; the System Admin manages accounts and hardware assignment</w:t>
+                <w:rFonts w:hint="default" w:ascii="Arial" w:hAnsi="Arial" w:cs="Arial" w:eastAsia="Arial"/>
+                <w:sz w:val="22"/>
+                <w:szCs w:val="22"/>
+                <w:rtl w:val="0"/>
+              </w:rPr>
+              <w:t>Owner-only access to tank monitoring and control records.</w:t>
             </w:r>
           </w:p>
         </w:tc>
@@ -3511,7 +3521,7 @@
             </w:pPr>
             <w:r>
               <w:rPr>
-                <w:rFonts w:hint="default" w:ascii="Arial Regular" w:hAnsi="Arial Regular" w:cs="Arial Regular"/>
+                <w:rFonts w:hint="default" w:ascii="Arial" w:hAnsi="Arial" w:cs="Arial" w:eastAsia="Arial"/>
                 <w:sz w:val="22"/>
                 <w:szCs w:val="22"/>
                 <w:rtl w:val="0"/>
@@ -3539,7 +3549,7 @@
             </w:pPr>
             <w:r>
               <w:rPr>
-                <w:rFonts w:hint="default" w:ascii="Arial Regular" w:hAnsi="Arial Regular" w:cs="Arial Regular"/>
+                <w:rFonts w:hint="default" w:ascii="Arial" w:hAnsi="Arial" w:cs="Arial" w:eastAsia="Arial"/>
                 <w:sz w:val="22"/>
                 <w:szCs w:val="22"/>
                 <w:rtl w:val="0"/>
@@ -3566,6 +3576,9 @@
             <w:right w:w="108" w:type="dxa"/>
           </w:tblCellMar>
         </w:tblPrEx>
+        <w:trPr>
+          <w:cantSplit w:val="true"/>
+        </w:trPr>
         <w:tc>
           <w:tcPr>
             <w:tcW w:w="3001" w:type="dxa"/>
@@ -3597,12 +3610,12 @@
             </w:pPr>
             <w:r>
               <w:rPr>
-                <w:rFonts w:hint="default" w:ascii="Arial Regular" w:hAnsi="Arial Regular" w:cs="Arial Regular"/>
-                <w:sz w:val="22"/>
-                <w:szCs w:val="22"/>
-                <w:rtl w:val="0"/>
-              </w:rPr>
-              <w:t>The system must allow the administrator to manage owner accounts and hardware assignment</w:t>
+                <w:rFonts w:hint="default" w:ascii="Arial" w:hAnsi="Arial" w:cs="Arial" w:eastAsia="Arial"/>
+                <w:sz w:val="22"/>
+                <w:szCs w:val="22"/>
+                <w:rtl w:val="0"/>
+              </w:rPr>
+              <w:t>The system must allow the administrator to manage owner accounts and hardware assignment.</w:t>
             </w:r>
           </w:p>
         </w:tc>
@@ -3612,37 +3625,12 @@
             <w:vAlign w:val="top"/>
           </w:tcPr>
           <w:p>
-            <w:pPr>
-              <w:keepNext w:val="0"/>
-              <w:keepLines w:val="0"/>
-              <w:pageBreakBefore w:val="0"/>
-              <w:widowControl w:val="0"/>
-              <w:pBdr>
-                <w:top w:val="none" w:color="auto" w:sz="0" w:space="0"/>
-                <w:left w:val="none" w:color="auto" w:sz="0" w:space="0"/>
-                <w:bottom w:val="none" w:color="auto" w:sz="0" w:space="0"/>
-                <w:right w:val="none" w:color="auto" w:sz="0" w:space="0"/>
-                <w:between w:val="none" w:color="auto" w:sz="0" w:space="0"/>
-              </w:pBdr>
-              <w:shd w:val="clear" w:fill="auto"/>
-              <w:spacing w:before="0" w:after="0" w:line="240" w:lineRule="auto"/>
-              <w:ind w:left="0" w:leftChars="0" w:right="0" w:rightChars="0" w:firstLine="0" w:firstLineChars="0"/>
-              <w:jc w:val="left"/>
-              <w:rPr>
-                <w:rFonts w:hint="default" w:ascii="Arial Regular" w:hAnsi="Arial Regular" w:cs="Arial Regular"/>
-                <w:sz w:val="22"/>
-                <w:szCs w:val="22"/>
-                <w:rtl w:val="0"/>
-              </w:rPr>
-            </w:pPr>
-            <w:r>
-              <w:rPr>
-                <w:rFonts w:hint="default" w:ascii="Arial Regular" w:hAnsi="Arial Regular" w:cs="Arial Regular"/>
-                <w:sz w:val="22"/>
-                <w:szCs w:val="22"/>
-                <w:rtl w:val="0"/>
-              </w:rPr>
-              <w:t>Administrative interface for viewing owner accounts, enabling or disabling accounts, and safely assigning or reassigning the ESP32 hardware to one initialized owner tank</w:t>
+            <w:r>
+              <w:rPr>
+                <w:rFonts w:ascii="Arial" w:hAnsi="Arial" w:eastAsia="Arial" w:cs="Arial"/>
+                <w:sz w:val="22"/>
+              </w:rPr>
+              <w:t>Owner-account management and hardware assignment for one active tank.</w:t>
             </w:r>
           </w:p>
         </w:tc>
@@ -3665,7 +3653,7 @@
             </w:pPr>
             <w:r>
               <w:rPr>
-                <w:rFonts w:hint="default" w:ascii="Arial Regular" w:hAnsi="Arial Regular" w:cs="Arial Regular"/>
+                <w:rFonts w:hint="default" w:ascii="Arial" w:hAnsi="Arial" w:cs="Arial" w:eastAsia="Arial"/>
                 <w:sz w:val="22"/>
                 <w:szCs w:val="22"/>
                 <w:rtl w:val="0"/>
@@ -3693,7 +3681,7 @@
             </w:pPr>
             <w:r>
               <w:rPr>
-                <w:rFonts w:hint="default" w:ascii="Arial Regular" w:hAnsi="Arial Regular" w:cs="Arial Regular"/>
+                <w:rFonts w:hint="default" w:ascii="Arial" w:hAnsi="Arial" w:cs="Arial" w:eastAsia="Arial"/>
                 <w:sz w:val="22"/>
                 <w:szCs w:val="22"/>
                 <w:rtl w:val="0"/>
@@ -3720,6 +3708,9 @@
             <w:right w:w="108" w:type="dxa"/>
           </w:tblCellMar>
         </w:tblPrEx>
+        <w:trPr>
+          <w:cantSplit w:val="true"/>
+        </w:trPr>
         <w:tc>
           <w:tcPr>
             <w:tcW w:w="3001" w:type="dxa"/>
@@ -3751,12 +3742,12 @@
             </w:pPr>
             <w:r>
               <w:rPr>
-                <w:rFonts w:hint="default" w:ascii="Arial Regular" w:hAnsi="Arial Regular" w:cs="Arial Regular"/>
-                <w:sz w:val="22"/>
-                <w:szCs w:val="22"/>
-                <w:rtl w:val="0"/>
-              </w:rPr>
-              <w:t xml:space="preserve">The system must display real-time sensor data </w:t>
+                <w:rFonts w:hint="default" w:ascii="Arial" w:hAnsi="Arial" w:cs="Arial" w:eastAsia="Arial"/>
+                <w:sz w:val="22"/>
+                <w:szCs w:val="22"/>
+                <w:rtl w:val="0"/>
+              </w:rPr>
+              <w:t>The system must allow the assigned tank owner to view current sensor readings and device connectivity remotely.</w:t>
             </w:r>
           </w:p>
         </w:tc>
@@ -3791,12 +3782,12 @@
             </w:pPr>
             <w:r>
               <w:rPr>
-                <w:rFonts w:hint="default" w:ascii="Arial Regular" w:hAnsi="Arial Regular" w:cs="Arial Regular"/>
-                <w:sz w:val="22"/>
-                <w:szCs w:val="22"/>
-                <w:rtl w:val="0"/>
-              </w:rPr>
-              <w:t xml:space="preserve">Mobile application dashboard with live IoT sensor visualization and status indicators </w:t>
+                <w:rFonts w:hint="default" w:ascii="Arial" w:hAnsi="Arial" w:cs="Arial" w:eastAsia="Arial"/>
+                <w:sz w:val="22"/>
+                <w:szCs w:val="22"/>
+                <w:rtl w:val="0"/>
+              </w:rPr>
+              <w:t>Remote sensor monitoring with device and data-connectivity indicators.</w:t>
             </w:r>
           </w:p>
         </w:tc>
@@ -3819,7 +3810,7 @@
             </w:pPr>
             <w:r>
               <w:rPr>
-                <w:rFonts w:hint="default" w:ascii="Arial Regular" w:hAnsi="Arial Regular" w:cs="Arial Regular"/>
+                <w:rFonts w:hint="default" w:ascii="Arial" w:hAnsi="Arial" w:cs="Arial" w:eastAsia="Arial"/>
                 <w:sz w:val="22"/>
                 <w:szCs w:val="22"/>
                 <w:rtl w:val="0"/>
@@ -3847,7 +3838,7 @@
             </w:pPr>
             <w:r>
               <w:rPr>
-                <w:rFonts w:hint="default" w:ascii="Arial Regular" w:hAnsi="Arial Regular" w:cs="Arial Regular"/>
+                <w:rFonts w:hint="default" w:ascii="Arial" w:hAnsi="Arial" w:cs="Arial" w:eastAsia="Arial"/>
                 <w:sz w:val="22"/>
                 <w:szCs w:val="22"/>
                 <w:rtl w:val="0"/>
@@ -3874,6 +3865,9 @@
             <w:right w:w="108" w:type="dxa"/>
           </w:tblCellMar>
         </w:tblPrEx>
+        <w:trPr>
+          <w:cantSplit w:val="true"/>
+        </w:trPr>
         <w:tc>
           <w:tcPr>
             <w:tcW w:w="3001" w:type="dxa"/>
@@ -3905,12 +3899,12 @@
             </w:pPr>
             <w:r>
               <w:rPr>
-                <w:rFonts w:hint="default" w:ascii="Arial Regular" w:hAnsi="Arial Regular" w:cs="Arial Regular"/>
-                <w:sz w:val="22"/>
-                <w:szCs w:val="22"/>
-                <w:rtl w:val="0"/>
-              </w:rPr>
-              <w:t>The system must record the initial tank and baseline sampling setup</w:t>
+                <w:rFonts w:hint="default" w:ascii="Arial" w:hAnsi="Arial" w:cs="Arial" w:eastAsia="Arial"/>
+                <w:sz w:val="22"/>
+                <w:szCs w:val="22"/>
+                <w:rtl w:val="0"/>
+              </w:rPr>
+              <w:t>The system must record the initial tank and baseline sampling setup.</w:t>
             </w:r>
           </w:p>
         </w:tc>
@@ -3945,12 +3939,12 @@
             </w:pPr>
             <w:r>
               <w:rPr>
-                <w:rFonts w:hint="default" w:ascii="Arial Regular" w:hAnsi="Arial Regular" w:cs="Arial Regular"/>
-                <w:sz w:val="22"/>
-                <w:szCs w:val="22"/>
-                <w:rtl w:val="0"/>
-              </w:rPr>
-              <w:t>Tank initialization form for stocking date, initial population, fixed batch sample size, total baseline sample weight, and total baseline sample length; the baseline sampling record is saved with the new active batch</w:t>
+                <w:rFonts w:hint="default" w:ascii="Arial" w:hAnsi="Arial" w:cs="Arial" w:eastAsia="Arial"/>
+                <w:sz w:val="22"/>
+                <w:szCs w:val="22"/>
+                <w:rtl w:val="0"/>
+              </w:rPr>
+              <w:t>Tank initialization with stocking and baseline sampling records.</w:t>
             </w:r>
           </w:p>
         </w:tc>
@@ -3973,7 +3967,7 @@
             </w:pPr>
             <w:r>
               <w:rPr>
-                <w:rFonts w:hint="default" w:ascii="Arial Regular" w:hAnsi="Arial Regular" w:cs="Arial Regular"/>
+                <w:rFonts w:hint="default" w:ascii="Arial" w:hAnsi="Arial" w:cs="Arial" w:eastAsia="Arial"/>
                 <w:sz w:val="22"/>
                 <w:szCs w:val="22"/>
                 <w:rtl w:val="0"/>
@@ -4001,7 +3995,164 @@
             </w:pPr>
             <w:r>
               <w:rPr>
-                <w:rFonts w:hint="default" w:ascii="Arial Regular" w:hAnsi="Arial Regular" w:cs="Arial Regular"/>
+                <w:rFonts w:hint="default" w:ascii="Arial" w:hAnsi="Arial" w:cs="Arial" w:eastAsia="Arial"/>
+                <w:sz w:val="22"/>
+                <w:szCs w:val="22"/>
+                <w:rtl w:val="0"/>
+              </w:rPr>
+              <w:t>Implemented</w:t>
+            </w:r>
+          </w:p>
+        </w:tc>
+      </w:tr>
+      <w:tr>
+        <w:tblPrEx>
+          <w:tblBorders>
+            <w:top w:val="single" w:color="auto" w:sz="4" w:space="0"/>
+            <w:left w:val="single" w:color="auto" w:sz="4" w:space="0"/>
+            <w:bottom w:val="single" w:color="auto" w:sz="4" w:space="0"/>
+            <w:right w:val="single" w:color="auto" w:sz="4" w:space="0"/>
+            <w:insideH w:val="single" w:color="auto" w:sz="4" w:space="0"/>
+            <w:insideV w:val="single" w:color="auto" w:sz="4" w:space="0"/>
+          </w:tblBorders>
+          <w:tblCellMar>
+            <w:top w:w="0" w:type="dxa"/>
+            <w:left w:w="108" w:type="dxa"/>
+            <w:bottom w:w="0" w:type="dxa"/>
+            <w:right w:w="108" w:type="dxa"/>
+          </w:tblCellMar>
+        </w:tblPrEx>
+        <w:trPr>
+          <w:cantSplit w:val="true"/>
+        </w:trPr>
+        <w:tc>
+          <w:tcPr>
+            <w:tcW w:w="3001" w:type="dxa"/>
+            <w:vAlign w:val="top"/>
+          </w:tcPr>
+          <w:p>
+            <w:pPr>
+              <w:keepNext w:val="0"/>
+              <w:keepLines w:val="0"/>
+              <w:pageBreakBefore w:val="0"/>
+              <w:widowControl w:val="0"/>
+              <w:pBdr>
+                <w:top w:val="none" w:color="auto" w:sz="0" w:space="0"/>
+                <w:left w:val="none" w:color="auto" w:sz="0" w:space="0"/>
+                <w:bottom w:val="none" w:color="auto" w:sz="0" w:space="0"/>
+                <w:right w:val="none" w:color="auto" w:sz="0" w:space="0"/>
+                <w:between w:val="none" w:color="auto" w:sz="0" w:space="0"/>
+              </w:pBdr>
+              <w:shd w:val="clear" w:fill="auto"/>
+              <w:spacing w:before="0" w:after="0" w:line="240" w:lineRule="auto"/>
+              <w:ind w:left="0" w:leftChars="0" w:right="0" w:rightChars="0" w:firstLine="0" w:firstLineChars="0"/>
+              <w:jc w:val="left"/>
+              <w:rPr>
+                <w:rFonts w:hint="default" w:ascii="Arial Regular" w:hAnsi="Arial Regular" w:cs="Arial Regular"/>
+                <w:sz w:val="22"/>
+                <w:szCs w:val="22"/>
+                <w:rtl w:val="0"/>
+              </w:rPr>
+            </w:pPr>
+            <w:r>
+              <w:rPr>
+                <w:rFonts w:hint="default" w:ascii="Arial" w:hAnsi="Arial" w:cs="Arial" w:eastAsia="Arial"/>
+                <w:sz w:val="22"/>
+                <w:szCs w:val="22"/>
+                <w:rtl w:val="0"/>
+              </w:rPr>
+              <w:t>The system must allow the assigned tank owner to configure water-quality and feed-level thresholds.</w:t>
+            </w:r>
+          </w:p>
+        </w:tc>
+        <w:tc>
+          <w:tcPr>
+            <w:tcW w:w="3123" w:type="dxa"/>
+            <w:vAlign w:val="top"/>
+          </w:tcPr>
+          <w:p>
+            <w:pPr>
+              <w:keepNext w:val="0"/>
+              <w:keepLines w:val="0"/>
+              <w:pageBreakBefore w:val="0"/>
+              <w:widowControl w:val="0"/>
+              <w:pBdr>
+                <w:top w:val="none" w:color="auto" w:sz="0" w:space="0"/>
+                <w:left w:val="none" w:color="auto" w:sz="0" w:space="0"/>
+                <w:bottom w:val="none" w:color="auto" w:sz="0" w:space="0"/>
+                <w:right w:val="none" w:color="auto" w:sz="0" w:space="0"/>
+                <w:between w:val="none" w:color="auto" w:sz="0" w:space="0"/>
+              </w:pBdr>
+              <w:shd w:val="clear" w:fill="auto"/>
+              <w:spacing w:before="0" w:after="0" w:line="240" w:lineRule="auto"/>
+              <w:ind w:left="0" w:leftChars="0" w:right="0" w:rightChars="0" w:firstLine="0" w:firstLineChars="0"/>
+              <w:jc w:val="left"/>
+              <w:rPr>
+                <w:rFonts w:hint="default" w:ascii="Arial Regular" w:hAnsi="Arial Regular" w:cs="Arial Regular"/>
+                <w:sz w:val="22"/>
+                <w:szCs w:val="22"/>
+                <w:rtl w:val="0"/>
+              </w:rPr>
+            </w:pPr>
+            <w:r>
+              <w:rPr>
+                <w:rFonts w:hint="default" w:ascii="Arial" w:hAnsi="Arial" w:cs="Arial" w:eastAsia="Arial"/>
+                <w:sz w:val="22"/>
+                <w:szCs w:val="22"/>
+                <w:rtl w:val="0"/>
+              </w:rPr>
+              <w:t>Configurable water-quality and feed-level thresholds with input validation.</w:t>
+            </w:r>
+          </w:p>
+        </w:tc>
+        <w:tc>
+          <w:tcPr>
+            <w:tcW w:w="1383" w:type="dxa"/>
+            <w:vAlign w:val="top"/>
+          </w:tcPr>
+          <w:p>
+            <w:pPr>
+              <w:widowControl w:val="0"/>
+              <w:spacing w:line="240" w:lineRule="auto"/>
+              <w:jc w:val="center"/>
+              <w:rPr>
+                <w:rFonts w:hint="default" w:ascii="Arial Regular" w:hAnsi="Arial Regular" w:cs="Arial Regular"/>
+                <w:sz w:val="22"/>
+                <w:szCs w:val="22"/>
+                <w:rtl w:val="0"/>
+              </w:rPr>
+            </w:pPr>
+            <w:r>
+              <w:rPr>
+                <w:rFonts w:hint="default" w:ascii="Arial" w:hAnsi="Arial" w:cs="Arial" w:eastAsia="Arial"/>
+                <w:sz w:val="22"/>
+                <w:szCs w:val="22"/>
+                <w:rtl w:val="0"/>
+              </w:rPr>
+              <w:t>High</w:t>
+            </w:r>
+          </w:p>
+        </w:tc>
+        <w:tc>
+          <w:tcPr>
+            <w:tcW w:w="1493" w:type="dxa"/>
+            <w:vAlign w:val="top"/>
+          </w:tcPr>
+          <w:p>
+            <w:pPr>
+              <w:widowControl w:val="0"/>
+              <w:spacing w:line="240" w:lineRule="auto"/>
+              <w:jc w:val="center"/>
+              <w:rPr>
+                <w:rFonts w:hint="default" w:ascii="Arial Regular" w:hAnsi="Arial Regular" w:cs="Arial Regular"/>
+                <w:sz w:val="22"/>
+                <w:szCs w:val="22"/>
+                <w:rtl w:val="0"/>
+              </w:rPr>
+            </w:pPr>
+            <w:r>
+              <w:rPr>
+                <w:rFonts w:hint="default" w:ascii="Arial" w:hAnsi="Arial" w:cs="Arial" w:eastAsia="Arial"/>
                 <w:sz w:val="22"/>
                 <w:szCs w:val="22"/>
                 <w:rtl w:val="0"/>
@@ -4045,54 +4196,6 @@
           <w:lang w:val="en-US"/>
         </w:rPr>
       </w:pPr>
-    </w:p>
-    <w:p>
-      <w:pPr>
-        <w:keepNext w:val="0"/>
-        <w:keepLines w:val="0"/>
-        <w:pageBreakBefore w:val="0"/>
-        <w:widowControl/>
-        <w:numPr>
-          <w:ilvl w:val="0"/>
-          <w:numId w:val="0"/>
-        </w:numPr>
-        <w:kinsoku/>
-        <w:wordWrap/>
-        <w:overflowPunct/>
-        <w:topLinePunct w:val="0"/>
-        <w:autoSpaceDE/>
-        <w:autoSpaceDN/>
-        <w:bidi w:val="0"/>
-        <w:adjustRightInd/>
-        <w:snapToGrid/>
-        <w:spacing w:after="361" w:afterLines="100" w:line="480" w:lineRule="auto"/>
-        <w:ind w:left="719" w:leftChars="0"/>
-        <w:jc w:val="both"/>
-        <w:textAlignment w:val="auto"/>
-        <w:rPr>
-          <w:rFonts w:hint="default" w:ascii="Arial Italic" w:hAnsi="Arial Italic" w:cs="Arial Italic"/>
-          <w:b w:val="0"/>
-          <w:bCs w:val="0"/>
-          <w:i/>
-          <w:iCs/>
-          <w:sz w:val="22"/>
-          <w:szCs w:val="22"/>
-          <w:lang w:val="en-US"/>
-        </w:rPr>
-      </w:pPr>
-      <w:r>
-        <w:rPr>
-          <w:rFonts w:hint="default" w:ascii="Arial Italic" w:hAnsi="Arial Italic" w:cs="Arial Italic"/>
-          <w:b w:val="0"/>
-          <w:bCs w:val="0"/>
-          <w:i/>
-          <w:iCs/>
-          <w:sz w:val="22"/>
-          <w:szCs w:val="22"/>
-          <w:lang w:val="en-US"/>
-        </w:rPr>
-        <w:t>Continuation of Table 3.1</w:t>
-      </w:r>
     </w:p>
     <w:tbl>
       <w:tblPr>
@@ -4138,6 +4241,9 @@
             <w:right w:w="108" w:type="dxa"/>
           </w:tblCellMar>
         </w:tblPrEx>
+        <w:trPr>
+          <w:cantSplit w:val="true"/>
+        </w:trPr>
         <w:tc>
           <w:tcPr>
             <w:tcW w:w="9000" w:type="dxa"/>
@@ -4171,7 +4277,7 @@
             </w:pPr>
             <w:r>
               <w:rPr>
-                <w:rFonts w:hint="default" w:ascii="Arial Bold" w:hAnsi="Arial Bold" w:cs="Arial Bold"/>
+                <w:rFonts w:hint="default" w:ascii="Arial" w:hAnsi="Arial" w:cs="Arial" w:eastAsia="Arial"/>
                 <w:b/>
                 <w:bCs/>
                 <w:sz w:val="22"/>
@@ -4200,6 +4306,9 @@
             <w:right w:w="108" w:type="dxa"/>
           </w:tblCellMar>
         </w:tblPrEx>
+        <w:trPr>
+          <w:cantSplit w:val="true"/>
+        </w:trPr>
         <w:tc>
           <w:tcPr>
             <w:tcW w:w="3001" w:type="dxa"/>
@@ -4241,7 +4350,7 @@
             </w:pPr>
             <w:r>
               <w:rPr>
-                <w:rFonts w:hint="default" w:ascii="Arial Bold" w:hAnsi="Arial Bold" w:cs="Arial Bold"/>
+                <w:rFonts w:hint="default" w:ascii="Arial" w:hAnsi="Arial" w:cs="Arial" w:eastAsia="Arial"/>
                 <w:b/>
                 <w:bCs w:val="0"/>
                 <w:sz w:val="22"/>
@@ -4293,7 +4402,7 @@
             </w:pPr>
             <w:r>
               <w:rPr>
-                <w:rFonts w:hint="default" w:ascii="Arial Bold" w:hAnsi="Arial Bold" w:cs="Arial Bold"/>
+                <w:rFonts w:hint="default" w:ascii="Arial" w:hAnsi="Arial" w:cs="Arial" w:eastAsia="Arial"/>
                 <w:b/>
                 <w:bCs w:val="0"/>
                 <w:sz w:val="22"/>
@@ -4345,7 +4454,7 @@
             </w:pPr>
             <w:r>
               <w:rPr>
-                <w:rFonts w:hint="default" w:ascii="Arial Bold" w:hAnsi="Arial Bold" w:cs="Arial Bold"/>
+                <w:rFonts w:hint="default" w:ascii="Arial" w:hAnsi="Arial" w:cs="Arial" w:eastAsia="Arial"/>
                 <w:b/>
                 <w:bCs w:val="0"/>
                 <w:sz w:val="22"/>
@@ -4397,14 +4506,14 @@
             </w:pPr>
             <w:r>
               <w:rPr>
-                <w:rFonts w:hint="default" w:ascii="Arial Bold" w:hAnsi="Arial Bold" w:cs="Arial Bold"/>
+                <w:rFonts w:hint="default" w:ascii="Arial" w:hAnsi="Arial" w:cs="Arial" w:eastAsia="Arial"/>
                 <w:b/>
                 <w:bCs w:val="0"/>
                 <w:sz w:val="22"/>
                 <w:szCs w:val="22"/>
                 <w:rtl w:val="0"/>
               </w:rPr>
-              <w:t xml:space="preserve"> Status</w:t>
+              <w:t>Status</w:t>
             </w:r>
           </w:p>
         </w:tc>
@@ -4426,6 +4535,9 @@
             <w:right w:w="108" w:type="dxa"/>
           </w:tblCellMar>
         </w:tblPrEx>
+        <w:trPr>
+          <w:cantSplit w:val="true"/>
+        </w:trPr>
         <w:tc>
           <w:tcPr>
             <w:tcW w:w="3001" w:type="dxa"/>
@@ -4457,21 +4569,20 @@
             </w:pPr>
             <w:r>
               <w:rPr>
-                <w:rFonts w:hint="default" w:ascii="Arial Regular" w:hAnsi="Arial Regular" w:cs="Arial Regular"/>
-                <w:sz w:val="22"/>
-                <w:szCs w:val="22"/>
-                <w:rtl w:val="0"/>
-              </w:rPr>
-              <w:t>The system must record sampling data</w:t>
-            </w:r>
-            <w:r>
-              <w:rPr>
-                <w:rFonts w:hint="default" w:ascii="Arial Regular" w:hAnsi="Arial Regular" w:cs="Arial Regular"/>
-                <w:sz w:val="22"/>
-                <w:szCs w:val="22"/>
-                <w:rtl w:val="0"/>
-              </w:rPr>
-              <w:tab/>
+                <w:rFonts w:hint="default" w:ascii="Arial" w:hAnsi="Arial" w:cs="Arial" w:eastAsia="Arial"/>
+                <w:sz w:val="22"/>
+                <w:szCs w:val="22"/>
+                <w:rtl w:val="0"/>
+              </w:rPr>
+              <w:t>The system must record sampling data.</w:t>
+            </w:r>
+            <w:r>
+              <w:rPr>
+                <w:rFonts w:hint="default" w:ascii="Arial" w:hAnsi="Arial" w:cs="Arial" w:eastAsia="Arial"/>
+                <w:sz w:val="22"/>
+                <w:szCs w:val="22"/>
+                <w:rtl w:val="0"/>
+              </w:rPr>
             </w:r>
           </w:p>
         </w:tc>
@@ -4506,12 +4617,12 @@
             </w:pPr>
             <w:r>
               <w:rPr>
-                <w:rFonts w:hint="default" w:ascii="Arial Regular" w:hAnsi="Arial Regular" w:cs="Arial Regular"/>
-                <w:sz w:val="22"/>
-                <w:szCs w:val="22"/>
-                <w:rtl w:val="0"/>
-              </w:rPr>
-              <w:t>Sampling input form for sample count, total weight, and total length with auto-computed Average Body Weight, Average Body Length</w:t>
+                <w:rFonts w:hint="default" w:ascii="Arial" w:hAnsi="Arial" w:cs="Arial" w:eastAsia="Arial"/>
+                <w:sz w:val="22"/>
+                <w:szCs w:val="22"/>
+                <w:rtl w:val="0"/>
+              </w:rPr>
+              <w:t>Sampling records for count, total weight, and total length, with app-computed averages.</w:t>
             </w:r>
           </w:p>
         </w:tc>
@@ -4534,7 +4645,7 @@
             </w:pPr>
             <w:r>
               <w:rPr>
-                <w:rFonts w:hint="default" w:ascii="Arial Regular" w:hAnsi="Arial Regular" w:cs="Arial Regular"/>
+                <w:rFonts w:hint="default" w:ascii="Arial" w:hAnsi="Arial" w:cs="Arial" w:eastAsia="Arial"/>
                 <w:sz w:val="22"/>
                 <w:szCs w:val="22"/>
                 <w:rtl w:val="0"/>
@@ -4562,7 +4673,7 @@
             </w:pPr>
             <w:r>
               <w:rPr>
-                <w:rFonts w:hint="default" w:ascii="Arial Regular" w:hAnsi="Arial Regular" w:cs="Arial Regular"/>
+                <w:rFonts w:hint="default" w:ascii="Arial" w:hAnsi="Arial" w:cs="Arial" w:eastAsia="Arial"/>
                 <w:sz w:val="22"/>
                 <w:szCs w:val="22"/>
                 <w:rtl w:val="0"/>
@@ -4589,6 +4700,9 @@
             <w:right w:w="108" w:type="dxa"/>
           </w:tblCellMar>
         </w:tblPrEx>
+        <w:trPr>
+          <w:cantSplit w:val="true"/>
+        </w:trPr>
         <w:tc>
           <w:tcPr>
             <w:tcW w:w="3001" w:type="dxa"/>
@@ -4620,12 +4734,12 @@
             </w:pPr>
             <w:r>
               <w:rPr>
-                <w:rFonts w:hint="default" w:ascii="Arial Regular" w:hAnsi="Arial Regular" w:cs="Arial Regular"/>
-                <w:sz w:val="22"/>
-                <w:szCs w:val="22"/>
-                <w:rtl w:val="0"/>
-              </w:rPr>
-              <w:t>The system must present the current growth stage</w:t>
+                <w:rFonts w:hint="default" w:ascii="Arial" w:hAnsi="Arial" w:cs="Arial" w:eastAsia="Arial"/>
+                <w:sz w:val="22"/>
+                <w:szCs w:val="22"/>
+                <w:rtl w:val="0"/>
+              </w:rPr>
+              <w:t>The system must show the current crayfish growth stage.</w:t>
             </w:r>
           </w:p>
         </w:tc>
@@ -4660,12 +4774,12 @@
             </w:pPr>
             <w:r>
               <w:rPr>
-                <w:rFonts w:hint="default" w:ascii="Arial Regular" w:hAnsi="Arial Regular" w:cs="Arial Regular"/>
-                <w:sz w:val="22"/>
-                <w:szCs w:val="22"/>
-                <w:rtl w:val="0"/>
-              </w:rPr>
-              <w:t>Automatic presentation of Early Juvenile, Advanced Juvenile, Pre-Adult, or Market Size using the latest valid Average Body Weight or Average Body Length measurement; sensor thresholds remain separately configured by the owner</w:t>
+                <w:rFonts w:hint="default" w:ascii="Arial" w:hAnsi="Arial" w:cs="Arial" w:eastAsia="Arial"/>
+                <w:sz w:val="22"/>
+                <w:szCs w:val="22"/>
+                <w:rtl w:val="0"/>
+              </w:rPr>
+              <w:t>Automatic growth-stage display based on the latest valid body weight or length.</w:t>
             </w:r>
           </w:p>
         </w:tc>
@@ -4688,7 +4802,7 @@
             </w:pPr>
             <w:r>
               <w:rPr>
-                <w:rFonts w:hint="default" w:ascii="Arial Regular" w:hAnsi="Arial Regular" w:cs="Arial Regular"/>
+                <w:rFonts w:hint="default" w:ascii="Arial" w:hAnsi="Arial" w:cs="Arial" w:eastAsia="Arial"/>
                 <w:sz w:val="22"/>
                 <w:szCs w:val="22"/>
                 <w:rtl w:val="0"/>
@@ -4716,7 +4830,7 @@
             </w:pPr>
             <w:r>
               <w:rPr>
-                <w:rFonts w:hint="default" w:ascii="Arial Regular" w:hAnsi="Arial Regular" w:cs="Arial Regular"/>
+                <w:rFonts w:hint="default" w:ascii="Arial" w:hAnsi="Arial" w:cs="Arial" w:eastAsia="Arial"/>
                 <w:sz w:val="22"/>
                 <w:szCs w:val="22"/>
                 <w:rtl w:val="0"/>
@@ -4743,6 +4857,9 @@
             <w:right w:w="108" w:type="dxa"/>
           </w:tblCellMar>
         </w:tblPrEx>
+        <w:trPr>
+          <w:cantSplit w:val="true"/>
+        </w:trPr>
         <w:tc>
           <w:tcPr>
             <w:tcW w:w="3001" w:type="dxa"/>
@@ -4774,12 +4891,12 @@
             </w:pPr>
             <w:r>
               <w:rPr>
-                <w:rFonts w:hint="default" w:ascii="Arial Regular" w:hAnsi="Arial Regular" w:cs="Arial Regular"/>
-                <w:sz w:val="22"/>
-                <w:szCs w:val="22"/>
-                <w:rtl w:val="0"/>
-              </w:rPr>
-              <w:t>The system must detect and explain unusual multivariate water-sensor patterns using machine learning</w:t>
+                <w:rFonts w:hint="default" w:ascii="Arial" w:hAnsi="Arial" w:cs="Arial" w:eastAsia="Arial"/>
+                <w:sz w:val="22"/>
+                <w:szCs w:val="22"/>
+                <w:rtl w:val="0"/>
+              </w:rPr>
+              <w:t>The system must detect and explain unusual multivariate water-sensor patterns using machine learning.</w:t>
             </w:r>
           </w:p>
         </w:tc>
@@ -4790,7 +4907,11 @@
           </w:tcPr>
           <w:p>
             <w:r>
-              <w:t>Scheduled Isolation Forest WQAD analyzes combined temperature, pH, dissolved oxygen, turbidity, water level, and recent pattern features. It returns Normal, Unusual, or Insufficient with an anomaly score, contributing sensors, cautious insight, and recommended verification steps without controlling devices. Rule-derived Increasing, Decreasing, or Stable labels provide context for the contributor insight and recommendation.</w:t>
+              <w:rPr>
+                <w:rFonts w:ascii="Arial" w:hAnsi="Arial" w:eastAsia="Arial" w:cs="Arial"/>
+                <w:sz w:val="22"/>
+              </w:rPr>
+              <w:t>Scheduled Isolation Forest analysis with status, anomaly score, contributing sensors, insight, and recommendation.</w:t>
             </w:r>
           </w:p>
         </w:tc>
@@ -4813,7 +4934,7 @@
             </w:pPr>
             <w:r>
               <w:rPr>
-                <w:rFonts w:hint="default" w:ascii="Arial Regular" w:hAnsi="Arial Regular" w:cs="Arial Regular"/>
+                <w:rFonts w:hint="default" w:ascii="Arial" w:hAnsi="Arial" w:cs="Arial" w:eastAsia="Arial"/>
                 <w:sz w:val="22"/>
                 <w:szCs w:val="22"/>
                 <w:rtl w:val="0"/>
@@ -4841,12 +4962,12 @@
             </w:pPr>
             <w:r>
               <w:rPr>
-                <w:rFonts w:hint="default" w:ascii="Arial Regular" w:hAnsi="Arial Regular" w:cs="Arial Regular"/>
-                <w:sz w:val="22"/>
-                <w:szCs w:val="22"/>
-                <w:rtl w:val="0"/>
-              </w:rPr>
-              <w:t>Implemented</w:t>
+                <w:rFonts w:hint="default" w:ascii="Arial" w:hAnsi="Arial" w:cs="Arial" w:eastAsia="Arial"/>
+                <w:sz w:val="22"/>
+                <w:szCs w:val="22"/>
+                <w:rtl w:val="0"/>
+              </w:rPr>
+              <w:t>Prototype</w:t>
             </w:r>
           </w:p>
         </w:tc>
@@ -4868,6 +4989,9 @@
             <w:right w:w="108" w:type="dxa"/>
           </w:tblCellMar>
         </w:tblPrEx>
+        <w:trPr>
+          <w:cantSplit w:val="true"/>
+        </w:trPr>
         <w:tc>
           <w:tcPr>
             <w:tcW w:w="3001" w:type="dxa"/>
@@ -4899,12 +5023,12 @@
             </w:pPr>
             <w:r>
               <w:rPr>
-                <w:rFonts w:hint="default" w:ascii="Arial Regular" w:hAnsi="Arial Regular" w:cs="Arial Regular"/>
-                <w:sz w:val="22"/>
-                <w:szCs w:val="22"/>
-                <w:rtl w:val="0"/>
-              </w:rPr>
-              <w:t>The system must display growth overview and trends</w:t>
+                <w:rFonts w:hint="default" w:ascii="Arial" w:hAnsi="Arial" w:cs="Arial" w:eastAsia="Arial"/>
+                <w:sz w:val="22"/>
+                <w:szCs w:val="22"/>
+                <w:rtl w:val="0"/>
+              </w:rPr>
+              <w:t>The system must show crayfish growth and production trends.</w:t>
             </w:r>
           </w:p>
         </w:tc>
@@ -4939,12 +5063,12 @@
             </w:pPr>
             <w:r>
               <w:rPr>
-                <w:rFonts w:hint="default" w:ascii="Arial Regular" w:hAnsi="Arial Regular" w:cs="Arial Regular"/>
-                <w:sz w:val="22"/>
-                <w:szCs w:val="22"/>
-                <w:rtl w:val="0"/>
-              </w:rPr>
-              <w:t>Growth overview and charts showing the baseline, latest sampling, ABW, ABL, estimated biomass, mortality, and change across sampling periods</w:t>
+                <w:rFonts w:hint="default" w:ascii="Arial" w:hAnsi="Arial" w:cs="Arial" w:eastAsia="Arial"/>
+                <w:sz w:val="22"/>
+                <w:szCs w:val="22"/>
+                <w:rtl w:val="0"/>
+              </w:rPr>
+              <w:t>Growth and production views showing sample length, sample weight, biomass, survival rate, mortality, and culture-day summaries.</w:t>
             </w:r>
           </w:p>
         </w:tc>
@@ -4967,7 +5091,7 @@
             </w:pPr>
             <w:r>
               <w:rPr>
-                <w:rFonts w:hint="default" w:ascii="Arial Regular" w:hAnsi="Arial Regular" w:cs="Arial Regular"/>
+                <w:rFonts w:hint="default" w:ascii="Arial" w:hAnsi="Arial" w:cs="Arial" w:eastAsia="Arial"/>
                 <w:sz w:val="22"/>
                 <w:szCs w:val="22"/>
                 <w:rtl w:val="0"/>
@@ -4995,7 +5119,7 @@
             </w:pPr>
             <w:r>
               <w:rPr>
-                <w:rFonts w:hint="default" w:ascii="Arial Regular" w:hAnsi="Arial Regular" w:cs="Arial Regular"/>
+                <w:rFonts w:hint="default" w:ascii="Arial" w:hAnsi="Arial" w:cs="Arial" w:eastAsia="Arial"/>
                 <w:sz w:val="22"/>
                 <w:szCs w:val="22"/>
                 <w:rtl w:val="0"/>
@@ -5022,6 +5146,9 @@
             <w:right w:w="108" w:type="dxa"/>
           </w:tblCellMar>
         </w:tblPrEx>
+        <w:trPr>
+          <w:cantSplit w:val="true"/>
+        </w:trPr>
         <w:tc>
           <w:tcPr>
             <w:tcW w:w="3001" w:type="dxa"/>
@@ -5053,12 +5180,12 @@
             </w:pPr>
             <w:r>
               <w:rPr>
-                <w:rFonts w:hint="default" w:ascii="Arial Regular" w:hAnsi="Arial Regular" w:cs="Arial Regular"/>
-                <w:sz w:val="22"/>
-                <w:szCs w:val="22"/>
-                <w:rtl w:val="0"/>
-              </w:rPr>
-              <w:t>The system must configure feed schedule</w:t>
+                <w:rFonts w:hint="default" w:ascii="Arial" w:hAnsi="Arial" w:cs="Arial" w:eastAsia="Arial"/>
+                <w:sz w:val="22"/>
+                <w:szCs w:val="22"/>
+                <w:rtl w:val="0"/>
+              </w:rPr>
+              <w:t>The system must allow the tank owner to manage recurring feeding schedules.</w:t>
             </w:r>
           </w:p>
         </w:tc>
@@ -5093,12 +5220,12 @@
             </w:pPr>
             <w:r>
               <w:rPr>
-                <w:rFonts w:hint="default" w:ascii="Arial Regular" w:hAnsi="Arial Regular" w:cs="Arial Regular"/>
-                <w:sz w:val="22"/>
-                <w:szCs w:val="22"/>
-                <w:rtl w:val="0"/>
-              </w:rPr>
-              <w:t xml:space="preserve">Time-based feeding schedule interface with AM/PM grouping, native time picker, and per-schedule status tracking (Completed, Pending, Skipped, Upcoming) with countdown to next feeding </w:t>
+                <w:rFonts w:hint="default" w:ascii="Arial" w:hAnsi="Arial" w:cs="Arial" w:eastAsia="Arial"/>
+                <w:sz w:val="22"/>
+                <w:szCs w:val="22"/>
+                <w:rtl w:val="0"/>
+              </w:rPr>
+              <w:t>Recurring feeding schedules with weekday, time, amount, status, and conflict controls.</w:t>
             </w:r>
           </w:p>
         </w:tc>
@@ -5121,7 +5248,7 @@
             </w:pPr>
             <w:r>
               <w:rPr>
-                <w:rFonts w:hint="default" w:ascii="Arial Regular" w:hAnsi="Arial Regular" w:cs="Arial Regular"/>
+                <w:rFonts w:hint="default" w:ascii="Arial" w:hAnsi="Arial" w:cs="Arial" w:eastAsia="Arial"/>
                 <w:sz w:val="22"/>
                 <w:szCs w:val="22"/>
                 <w:rtl w:val="0"/>
@@ -5149,10 +5276,72 @@
             </w:pPr>
             <w:r>
               <w:rPr>
-                <w:rFonts w:hint="default" w:ascii="Arial Regular" w:hAnsi="Arial Regular" w:cs="Arial Regular"/>
-                <w:sz w:val="22"/>
-                <w:szCs w:val="22"/>
-                <w:rtl w:val="0"/>
+                <w:rFonts w:hint="default" w:ascii="Arial" w:hAnsi="Arial" w:cs="Arial" w:eastAsia="Arial"/>
+                <w:sz w:val="22"/>
+                <w:szCs w:val="22"/>
+                <w:rtl w:val="0"/>
+              </w:rPr>
+              <w:t>Implemented</w:t>
+            </w:r>
+          </w:p>
+        </w:tc>
+      </w:tr>
+      <w:tr>
+        <w:tc>
+          <w:tcPr>
+            <w:tcW w:w="3001" w:type="dxa"/>
+            <w:vAlign w:val="top"/>
+          </w:tcPr>
+          <w:p>
+            <w:r>
+              <w:rPr>
+                <w:rFonts w:ascii="Arial" w:hAnsi="Arial" w:eastAsia="Arial" w:cs="Arial"/>
+                <w:sz w:val="22"/>
+              </w:rPr>
+              <w:t>The system must allow the assigned tank owner to dispense feed manually.</w:t>
+            </w:r>
+          </w:p>
+        </w:tc>
+        <w:tc>
+          <w:tcPr>
+            <w:tcW w:w="3123" w:type="dxa"/>
+            <w:vAlign w:val="top"/>
+          </w:tcPr>
+          <w:p>
+            <w:r>
+              <w:rPr>
+                <w:rFonts w:ascii="Arial" w:hAnsi="Arial" w:eastAsia="Arial" w:cs="Arial"/>
+                <w:sz w:val="22"/>
+              </w:rPr>
+              <w:t>Feed Now control with amount validation, feeding-schedule conflict protection, and execution status.</w:t>
+            </w:r>
+          </w:p>
+        </w:tc>
+        <w:tc>
+          <w:tcPr>
+            <w:tcW w:w="1383" w:type="dxa"/>
+            <w:vAlign w:val="top"/>
+          </w:tcPr>
+          <w:p>
+            <w:r>
+              <w:rPr>
+                <w:rFonts w:ascii="Arial" w:hAnsi="Arial" w:eastAsia="Arial" w:cs="Arial"/>
+                <w:sz w:val="22"/>
+              </w:rPr>
+              <w:t>Medium</w:t>
+            </w:r>
+          </w:p>
+        </w:tc>
+        <w:tc>
+          <w:tcPr>
+            <w:tcW w:w="1493" w:type="dxa"/>
+            <w:vAlign w:val="top"/>
+          </w:tcPr>
+          <w:p>
+            <w:r>
+              <w:rPr>
+                <w:rFonts w:ascii="Arial" w:hAnsi="Arial" w:eastAsia="Arial" w:cs="Arial"/>
+                <w:sz w:val="22"/>
               </w:rPr>
               <w:t>Implemented</w:t>
             </w:r>
@@ -5194,54 +5383,6 @@
           <w:lang w:val="en-US"/>
         </w:rPr>
       </w:pPr>
-    </w:p>
-    <w:p>
-      <w:pPr>
-        <w:keepNext w:val="0"/>
-        <w:keepLines w:val="0"/>
-        <w:pageBreakBefore w:val="0"/>
-        <w:widowControl/>
-        <w:numPr>
-          <w:ilvl w:val="0"/>
-          <w:numId w:val="0"/>
-        </w:numPr>
-        <w:kinsoku/>
-        <w:wordWrap/>
-        <w:overflowPunct/>
-        <w:topLinePunct w:val="0"/>
-        <w:autoSpaceDE/>
-        <w:autoSpaceDN/>
-        <w:bidi w:val="0"/>
-        <w:adjustRightInd/>
-        <w:snapToGrid/>
-        <w:spacing w:line="480" w:lineRule="auto"/>
-        <w:ind w:left="719" w:leftChars="0"/>
-        <w:jc w:val="both"/>
-        <w:textAlignment w:val="auto"/>
-        <w:rPr>
-          <w:rFonts w:hint="default" w:ascii="Arial Italic" w:hAnsi="Arial Italic" w:cs="Arial Italic"/>
-          <w:b w:val="0"/>
-          <w:bCs w:val="0"/>
-          <w:i/>
-          <w:iCs/>
-          <w:sz w:val="22"/>
-          <w:szCs w:val="22"/>
-          <w:lang w:val="en-US"/>
-        </w:rPr>
-      </w:pPr>
-      <w:r>
-        <w:rPr>
-          <w:rFonts w:hint="default" w:ascii="Arial Italic" w:hAnsi="Arial Italic" w:cs="Arial Italic"/>
-          <w:b w:val="0"/>
-          <w:bCs w:val="0"/>
-          <w:i/>
-          <w:iCs/>
-          <w:sz w:val="22"/>
-          <w:szCs w:val="22"/>
-          <w:lang w:val="en-US"/>
-        </w:rPr>
-        <w:t>Continuation of Table 3.1</w:t>
-      </w:r>
     </w:p>
     <w:tbl>
       <w:tblPr>
@@ -5287,6 +5428,9 @@
             <w:right w:w="108" w:type="dxa"/>
           </w:tblCellMar>
         </w:tblPrEx>
+        <w:trPr>
+          <w:cantSplit w:val="true"/>
+        </w:trPr>
         <w:tc>
           <w:tcPr>
             <w:tcW w:w="9000" w:type="dxa"/>
@@ -5320,7 +5464,7 @@
             </w:pPr>
             <w:r>
               <w:rPr>
-                <w:rFonts w:hint="default" w:ascii="Arial Bold" w:hAnsi="Arial Bold" w:cs="Arial Bold"/>
+                <w:rFonts w:hint="default" w:ascii="Arial" w:hAnsi="Arial" w:cs="Arial" w:eastAsia="Arial"/>
                 <w:b/>
                 <w:bCs/>
                 <w:sz w:val="22"/>
@@ -5349,6 +5493,9 @@
             <w:right w:w="108" w:type="dxa"/>
           </w:tblCellMar>
         </w:tblPrEx>
+        <w:trPr>
+          <w:cantSplit w:val="true"/>
+        </w:trPr>
         <w:tc>
           <w:tcPr>
             <w:tcW w:w="3001" w:type="dxa"/>
@@ -5390,7 +5537,7 @@
             </w:pPr>
             <w:r>
               <w:rPr>
-                <w:rFonts w:hint="default" w:ascii="Arial Bold" w:hAnsi="Arial Bold" w:cs="Arial Bold"/>
+                <w:rFonts w:hint="default" w:ascii="Arial" w:hAnsi="Arial" w:cs="Arial" w:eastAsia="Arial"/>
                 <w:b/>
                 <w:bCs w:val="0"/>
                 <w:sz w:val="22"/>
@@ -5442,7 +5589,7 @@
             </w:pPr>
             <w:r>
               <w:rPr>
-                <w:rFonts w:hint="default" w:ascii="Arial Bold" w:hAnsi="Arial Bold" w:cs="Arial Bold"/>
+                <w:rFonts w:hint="default" w:ascii="Arial" w:hAnsi="Arial" w:cs="Arial" w:eastAsia="Arial"/>
                 <w:b/>
                 <w:bCs w:val="0"/>
                 <w:sz w:val="22"/>
@@ -5494,7 +5641,7 @@
             </w:pPr>
             <w:r>
               <w:rPr>
-                <w:rFonts w:hint="default" w:ascii="Arial Bold" w:hAnsi="Arial Bold" w:cs="Arial Bold"/>
+                <w:rFonts w:hint="default" w:ascii="Arial" w:hAnsi="Arial" w:cs="Arial" w:eastAsia="Arial"/>
                 <w:b/>
                 <w:bCs w:val="0"/>
                 <w:sz w:val="22"/>
@@ -5546,14 +5693,14 @@
             </w:pPr>
             <w:r>
               <w:rPr>
-                <w:rFonts w:hint="default" w:ascii="Arial Bold" w:hAnsi="Arial Bold" w:cs="Arial Bold"/>
+                <w:rFonts w:hint="default" w:ascii="Arial" w:hAnsi="Arial" w:cs="Arial" w:eastAsia="Arial"/>
                 <w:b/>
                 <w:bCs w:val="0"/>
                 <w:sz w:val="22"/>
                 <w:szCs w:val="22"/>
                 <w:rtl w:val="0"/>
               </w:rPr>
-              <w:t xml:space="preserve"> Status</w:t>
+              <w:t>Status</w:t>
             </w:r>
           </w:p>
         </w:tc>
@@ -5575,6 +5722,9 @@
             <w:right w:w="108" w:type="dxa"/>
           </w:tblCellMar>
         </w:tblPrEx>
+        <w:trPr>
+          <w:cantSplit w:val="true"/>
+        </w:trPr>
         <w:tc>
           <w:tcPr>
             <w:tcW w:w="3001" w:type="dxa"/>
@@ -5606,12 +5756,12 @@
             </w:pPr>
             <w:r>
               <w:rPr>
-                <w:rFonts w:hint="default" w:ascii="Arial Regular" w:hAnsi="Arial Regular" w:cs="Arial Regular"/>
-                <w:sz w:val="22"/>
-                <w:szCs w:val="22"/>
-                <w:rtl w:val="0"/>
-              </w:rPr>
-              <w:t>The system must track feeding progress</w:t>
+                <w:rFonts w:hint="default" w:ascii="Arial" w:hAnsi="Arial" w:cs="Arial" w:eastAsia="Arial"/>
+                <w:sz w:val="22"/>
+                <w:szCs w:val="22"/>
+                <w:rtl w:val="0"/>
+              </w:rPr>
+              <w:t>The system must track daily feeding progress.</w:t>
             </w:r>
           </w:p>
         </w:tc>
@@ -5646,12 +5796,12 @@
             </w:pPr>
             <w:r>
               <w:rPr>
-                <w:rFonts w:hint="default" w:ascii="Arial Regular" w:hAnsi="Arial Regular" w:cs="Arial Regular"/>
-                <w:sz w:val="22"/>
-                <w:szCs w:val="22"/>
-                <w:rtl w:val="0"/>
-              </w:rPr>
-              <w:t>Dashboard feeding schedule card showing completed versus total feedings today, last fed time, next feeding countdown, and progress bar</w:t>
+                <w:rFonts w:hint="default" w:ascii="Arial" w:hAnsi="Arial" w:cs="Arial" w:eastAsia="Arial"/>
+                <w:sz w:val="22"/>
+                <w:szCs w:val="22"/>
+                <w:rtl w:val="0"/>
+              </w:rPr>
+              <w:t>Daily feeding progress with completed, previous, and upcoming feeding details.</w:t>
             </w:r>
           </w:p>
         </w:tc>
@@ -5674,7 +5824,7 @@
             </w:pPr>
             <w:r>
               <w:rPr>
-                <w:rFonts w:hint="default" w:ascii="Arial Regular" w:hAnsi="Arial Regular" w:cs="Arial Regular"/>
+                <w:rFonts w:hint="default" w:ascii="Arial" w:hAnsi="Arial" w:cs="Arial" w:eastAsia="Arial"/>
                 <w:sz w:val="22"/>
                 <w:szCs w:val="22"/>
                 <w:rtl w:val="0"/>
@@ -5702,7 +5852,7 @@
             </w:pPr>
             <w:r>
               <w:rPr>
-                <w:rFonts w:hint="default" w:ascii="Arial Regular" w:hAnsi="Arial Regular" w:cs="Arial Regular"/>
+                <w:rFonts w:hint="default" w:ascii="Arial" w:hAnsi="Arial" w:cs="Arial" w:eastAsia="Arial"/>
                 <w:sz w:val="22"/>
                 <w:szCs w:val="22"/>
                 <w:rtl w:val="0"/>
@@ -5729,6 +5879,9 @@
             <w:right w:w="108" w:type="dxa"/>
           </w:tblCellMar>
         </w:tblPrEx>
+        <w:trPr>
+          <w:cantSplit w:val="true"/>
+        </w:trPr>
         <w:tc>
           <w:tcPr>
             <w:tcW w:w="3001" w:type="dxa"/>
@@ -5760,12 +5913,12 @@
             </w:pPr>
             <w:r>
               <w:rPr>
-                <w:rFonts w:hint="default" w:ascii="Arial Regular" w:hAnsi="Arial Regular" w:cs="Arial Regular"/>
-                <w:sz w:val="22"/>
-                <w:szCs w:val="22"/>
-                <w:rtl w:val="0"/>
-              </w:rPr>
-              <w:t>The system must generate and download reports</w:t>
+                <w:rFonts w:hint="default" w:ascii="Arial" w:hAnsi="Arial" w:cs="Arial" w:eastAsia="Arial"/>
+                <w:sz w:val="22"/>
+                <w:szCs w:val="22"/>
+                <w:rtl w:val="0"/>
+              </w:rPr>
+              <w:t>The system must generate downloadable PDF and CSV reports for the selected batch, including growth, survival rate, mortality, harvest, and anomaly-detection records.</w:t>
             </w:r>
           </w:p>
         </w:tc>
@@ -5800,12 +5953,12 @@
             </w:pPr>
             <w:r>
               <w:rPr>
-                <w:rFonts w:hint="default" w:ascii="Arial Regular" w:hAnsi="Arial Regular" w:cs="Arial Regular"/>
-                <w:sz w:val="22"/>
-                <w:szCs w:val="22"/>
-                <w:rtl w:val="0"/>
-              </w:rPr>
-              <w:t>PDF and CSV export for growth and production records and Water Quality Anomaly Detection history, using the selected reporting period and the same validated calculations shown in the application</w:t>
+                <w:rFonts w:hint="default" w:ascii="Arial" w:hAnsi="Arial" w:cs="Arial" w:eastAsia="Arial"/>
+                <w:sz w:val="22"/>
+                <w:szCs w:val="22"/>
+                <w:rtl w:val="0"/>
+              </w:rPr>
+              <w:t>PDF and CSV exports containing selected-batch growth, survival rate, mortality, and harvest data, plus recent anomaly-detection records.</w:t>
             </w:r>
           </w:p>
         </w:tc>
@@ -5828,7 +5981,7 @@
             </w:pPr>
             <w:r>
               <w:rPr>
-                <w:rFonts w:hint="default" w:ascii="Arial Regular" w:hAnsi="Arial Regular" w:cs="Arial Regular"/>
+                <w:rFonts w:hint="default" w:ascii="Arial" w:hAnsi="Arial" w:cs="Arial" w:eastAsia="Arial"/>
                 <w:sz w:val="22"/>
                 <w:szCs w:val="22"/>
                 <w:rtl w:val="0"/>
@@ -5856,7 +6009,7 @@
             </w:pPr>
             <w:r>
               <w:rPr>
-                <w:rFonts w:hint="default" w:ascii="Arial Regular" w:hAnsi="Arial Regular" w:cs="Arial Regular"/>
+                <w:rFonts w:hint="default" w:ascii="Arial" w:hAnsi="Arial" w:cs="Arial" w:eastAsia="Arial"/>
                 <w:sz w:val="22"/>
                 <w:szCs w:val="22"/>
                 <w:rtl w:val="0"/>
@@ -5883,6 +6036,9 @@
             <w:right w:w="108" w:type="dxa"/>
           </w:tblCellMar>
         </w:tblPrEx>
+        <w:trPr>
+          <w:cantSplit w:val="true"/>
+        </w:trPr>
         <w:tc>
           <w:tcPr>
             <w:tcW w:w="3001" w:type="dxa"/>
@@ -5915,7 +6071,7 @@
             </w:pPr>
             <w:r>
               <w:rPr>
-                <w:rFonts w:hint="default" w:ascii="Arial Regular" w:hAnsi="Arial Regular" w:cs="Arial Regular"/>
+                <w:rFonts w:hint="default" w:ascii="Arial" w:hAnsi="Arial" w:cs="Arial" w:eastAsia="Arial"/>
                 <w:sz w:val="22"/>
                 <w:szCs w:val="22"/>
                 <w:rtl w:val="0"/>
@@ -5956,12 +6112,12 @@
             </w:pPr>
             <w:r>
               <w:rPr>
-                <w:rFonts w:hint="default" w:ascii="Arial Regular" w:hAnsi="Arial Regular" w:cs="Arial Regular"/>
-                <w:sz w:val="22"/>
-                <w:szCs w:val="22"/>
-                <w:rtl w:val="0"/>
-              </w:rPr>
-              <w:t>FCM-based push notification system that detects sensor threshold violations and zone transitions from Cloud Firestore, sends real-time push alerts with customizable sound/vibration preferences, and includes automated feeding and sampling reminders.</w:t>
+                <w:rFonts w:hint="default" w:ascii="Arial" w:hAnsi="Arial" w:cs="Arial" w:eastAsia="Arial"/>
+                <w:sz w:val="22"/>
+                <w:szCs w:val="22"/>
+                <w:rtl w:val="0"/>
+              </w:rPr>
+              <w:t>Push and in-app alerts for water conditions, operations, feeding, and sampling.</w:t>
             </w:r>
           </w:p>
         </w:tc>
@@ -5985,7 +6141,7 @@
             </w:pPr>
             <w:r>
               <w:rPr>
-                <w:rFonts w:hint="default" w:ascii="Arial Regular" w:hAnsi="Arial Regular" w:cs="Arial Regular"/>
+                <w:rFonts w:hint="default" w:ascii="Arial" w:hAnsi="Arial" w:cs="Arial" w:eastAsia="Arial"/>
                 <w:sz w:val="22"/>
                 <w:szCs w:val="22"/>
                 <w:rtl w:val="0"/>
@@ -6014,7 +6170,7 @@
             </w:pPr>
             <w:r>
               <w:rPr>
-                <w:rFonts w:hint="default" w:ascii="Arial Regular" w:hAnsi="Arial Regular" w:cs="Arial Regular"/>
+                <w:rFonts w:hint="default" w:ascii="Arial" w:hAnsi="Arial" w:cs="Arial" w:eastAsia="Arial"/>
                 <w:sz w:val="22"/>
                 <w:szCs w:val="22"/>
                 <w:rtl w:val="0"/>
@@ -6041,6 +6197,9 @@
             <w:right w:w="108" w:type="dxa"/>
           </w:tblCellMar>
         </w:tblPrEx>
+        <w:trPr>
+          <w:cantSplit w:val="true"/>
+        </w:trPr>
         <w:tc>
           <w:tcPr>
             <w:tcW w:w="3001" w:type="dxa"/>
@@ -6073,12 +6232,12 @@
             </w:pPr>
             <w:r>
               <w:rPr>
-                <w:rFonts w:hint="default" w:ascii="Arial Regular" w:hAnsi="Arial Regular" w:cs="Arial Regular"/>
-                <w:sz w:val="22"/>
-                <w:szCs w:val="22"/>
-                <w:rtl w:val="0"/>
-              </w:rPr>
-              <w:t xml:space="preserve">The system must store historical sensor data </w:t>
+                <w:rFonts w:hint="default" w:ascii="Arial" w:hAnsi="Arial" w:cs="Arial" w:eastAsia="Arial"/>
+                <w:sz w:val="22"/>
+                <w:szCs w:val="22"/>
+                <w:rtl w:val="0"/>
+              </w:rPr>
+              <w:t>The system must store historical sensor data.</w:t>
             </w:r>
           </w:p>
         </w:tc>
@@ -6114,12 +6273,12 @@
             </w:pPr>
             <w:r>
               <w:rPr>
-                <w:rFonts w:hint="default" w:ascii="Arial Regular" w:hAnsi="Arial Regular" w:cs="Arial Regular"/>
-                <w:sz w:val="22"/>
-                <w:szCs w:val="22"/>
-                <w:rtl w:val="0"/>
-              </w:rPr>
-              <w:t xml:space="preserve">Cloud-based database for continuous data logging and storage </w:t>
+                <w:rFonts w:hint="default" w:ascii="Arial" w:hAnsi="Arial" w:cs="Arial" w:eastAsia="Arial"/>
+                <w:sz w:val="22"/>
+                <w:szCs w:val="22"/>
+                <w:rtl w:val="0"/>
+              </w:rPr>
+              <w:t>Cloud-based storage of historical sensor readings.</w:t>
             </w:r>
           </w:p>
         </w:tc>
@@ -6143,7 +6302,7 @@
             </w:pPr>
             <w:r>
               <w:rPr>
-                <w:rFonts w:hint="default" w:ascii="Arial Regular" w:hAnsi="Arial Regular" w:cs="Arial Regular"/>
+                <w:rFonts w:hint="default" w:ascii="Arial" w:hAnsi="Arial" w:cs="Arial" w:eastAsia="Arial"/>
                 <w:sz w:val="22"/>
                 <w:szCs w:val="22"/>
                 <w:rtl w:val="0"/>
@@ -6172,7 +6331,7 @@
             </w:pPr>
             <w:r>
               <w:rPr>
-                <w:rFonts w:hint="default" w:ascii="Arial Regular" w:hAnsi="Arial Regular" w:cs="Arial Regular"/>
+                <w:rFonts w:hint="default" w:ascii="Arial" w:hAnsi="Arial" w:cs="Arial" w:eastAsia="Arial"/>
                 <w:sz w:val="22"/>
                 <w:szCs w:val="22"/>
                 <w:rtl w:val="0"/>
@@ -6199,6 +6358,9 @@
             <w:right w:w="108" w:type="dxa"/>
           </w:tblCellMar>
         </w:tblPrEx>
+        <w:trPr>
+          <w:cantSplit w:val="true"/>
+        </w:trPr>
         <w:tc>
           <w:tcPr>
             <w:tcW w:w="3001" w:type="dxa"/>
@@ -6231,12 +6393,12 @@
             </w:pPr>
             <w:r>
               <w:rPr>
-                <w:rFonts w:hint="default" w:ascii="Arial Regular" w:hAnsi="Arial Regular" w:cs="Arial Regular"/>
-                <w:sz w:val="22"/>
-                <w:szCs w:val="22"/>
-                <w:rtl w:val="0"/>
-              </w:rPr>
-              <w:t>The system must preserve sensor information during internet interruptions</w:t>
+                <w:rFonts w:hint="default" w:ascii="Arial" w:hAnsi="Arial" w:cs="Arial" w:eastAsia="Arial"/>
+                <w:sz w:val="22"/>
+                <w:szCs w:val="22"/>
+                <w:rtl w:val="0"/>
+              </w:rPr>
+              <w:t>The system must display the latest available sensor data during network interruptions.</w:t>
             </w:r>
           </w:p>
         </w:tc>
@@ -6272,12 +6434,12 @@
             </w:pPr>
             <w:r>
               <w:rPr>
-                <w:rFonts w:hint="default" w:ascii="Arial Regular" w:hAnsi="Arial Regular" w:cs="Arial Regular"/>
-                <w:sz w:val="22"/>
-                <w:szCs w:val="22"/>
-                <w:rtl w:val="0"/>
-              </w:rPr>
-              <w:t>The mobile application displays the last cached readings through local and Firebase offline persistence, while the ESP32 buffers sensor history and synchronizes it after connectivity returns</w:t>
+                <w:rFonts w:hint="default" w:ascii="Arial" w:hAnsi="Arial" w:cs="Arial" w:eastAsia="Arial"/>
+                <w:sz w:val="22"/>
+                <w:szCs w:val="22"/>
+                <w:rtl w:val="0"/>
+              </w:rPr>
+              <w:t>Offline access to cached sensor readings.</w:t>
             </w:r>
           </w:p>
         </w:tc>
@@ -6301,7 +6463,7 @@
             </w:pPr>
             <w:r>
               <w:rPr>
-                <w:rFonts w:hint="default" w:ascii="Arial Regular" w:hAnsi="Arial Regular" w:cs="Arial Regular"/>
+                <w:rFonts w:hint="default" w:ascii="Arial" w:hAnsi="Arial" w:cs="Arial" w:eastAsia="Arial"/>
                 <w:sz w:val="22"/>
                 <w:szCs w:val="22"/>
                 <w:rtl w:val="0"/>
@@ -6330,7 +6492,7 @@
             </w:pPr>
             <w:r>
               <w:rPr>
-                <w:rFonts w:hint="default" w:ascii="Arial Regular" w:hAnsi="Arial Regular" w:cs="Arial Regular"/>
+                <w:rFonts w:hint="default" w:ascii="Arial" w:hAnsi="Arial" w:cs="Arial" w:eastAsia="Arial"/>
                 <w:sz w:val="22"/>
                 <w:szCs w:val="22"/>
                 <w:rtl w:val="0"/>
@@ -6357,6 +6519,9 @@
             <w:right w:w="108" w:type="dxa"/>
           </w:tblCellMar>
         </w:tblPrEx>
+        <w:trPr>
+          <w:cantSplit w:val="true"/>
+        </w:trPr>
         <w:tc>
           <w:tcPr>
             <w:tcW w:w="3001" w:type="dxa"/>
@@ -6389,12 +6554,12 @@
             </w:pPr>
             <w:r>
               <w:rPr>
-                <w:rFonts w:hint="default" w:ascii="Arial Regular" w:hAnsi="Arial Regular" w:cs="Arial Regular"/>
-                <w:sz w:val="22"/>
-                <w:szCs w:val="22"/>
-                <w:rtl w:val="0"/>
-              </w:rPr>
-              <w:t xml:space="preserve">The system must allow manual control of hardware </w:t>
+                <w:rFonts w:hint="default" w:ascii="Arial" w:hAnsi="Arial" w:cs="Arial" w:eastAsia="Arial"/>
+                <w:sz w:val="22"/>
+                <w:szCs w:val="22"/>
+                <w:rtl w:val="0"/>
+              </w:rPr>
+              <w:t>The system must allow the assigned tank owner to set each actuator to OFF, AUTO, or ON.</w:t>
             </w:r>
           </w:p>
         </w:tc>
@@ -6430,12 +6595,12 @@
             </w:pPr>
             <w:r>
               <w:rPr>
-                <w:rFonts w:hint="default" w:ascii="Arial Regular" w:hAnsi="Arial Regular" w:cs="Arial Regular"/>
-                <w:sz w:val="22"/>
-                <w:szCs w:val="22"/>
-                <w:rtl w:val="0"/>
-              </w:rPr>
-              <w:t xml:space="preserve">Mobile control interface for manual override of devices (ON/OFF controls) </w:t>
+                <w:rFonts w:hint="default" w:ascii="Arial" w:hAnsi="Arial" w:cs="Arial" w:eastAsia="Arial"/>
+                <w:sz w:val="22"/>
+                <w:szCs w:val="22"/>
+                <w:rtl w:val="0"/>
+              </w:rPr>
+              <w:t>OFF, AUTO, and ON actuator modes with offline protection and activity logs.</w:t>
             </w:r>
           </w:p>
         </w:tc>
@@ -6460,7 +6625,7 @@
             </w:pPr>
             <w:r>
               <w:rPr>
-                <w:rFonts w:hint="default" w:ascii="Arial Regular" w:hAnsi="Arial Regular" w:cs="Arial Regular"/>
+                <w:rFonts w:hint="default" w:ascii="Arial" w:hAnsi="Arial" w:cs="Arial" w:eastAsia="Arial"/>
                 <w:sz w:val="22"/>
                 <w:szCs w:val="22"/>
                 <w:rtl w:val="0"/>
@@ -6490,7 +6655,7 @@
             </w:pPr>
             <w:r>
               <w:rPr>
-                <w:rFonts w:hint="default" w:ascii="Arial Regular" w:hAnsi="Arial Regular" w:cs="Arial Regular"/>
+                <w:rFonts w:hint="default" w:ascii="Arial" w:hAnsi="Arial" w:cs="Arial" w:eastAsia="Arial"/>
                 <w:sz w:val="22"/>
                 <w:szCs w:val="22"/>
                 <w:rtl w:val="0"/>
@@ -6517,6 +6682,9 @@
             <w:right w:w="108" w:type="dxa"/>
           </w:tblCellMar>
         </w:tblPrEx>
+        <w:trPr>
+          <w:cantSplit w:val="true"/>
+        </w:trPr>
         <w:tc>
           <w:tcPr>
             <w:tcW w:w="3001" w:type="dxa"/>
@@ -6549,12 +6717,12 @@
             </w:pPr>
             <w:r>
               <w:rPr>
-                <w:rFonts w:hint="default" w:ascii="Arial Regular" w:hAnsi="Arial Regular" w:cs="Arial Regular"/>
-                <w:sz w:val="22"/>
-                <w:szCs w:val="22"/>
-                <w:rtl w:val="0"/>
-              </w:rPr>
-              <w:t>The system must provide historical water-sensor analytics</w:t>
+                <w:rFonts w:hint="default" w:ascii="Arial" w:hAnsi="Arial" w:cs="Arial" w:eastAsia="Arial"/>
+                <w:sz w:val="22"/>
+                <w:szCs w:val="22"/>
+                <w:rtl w:val="0"/>
+              </w:rPr>
+              <w:t>The system must provide historical water-sensor analytics.</w:t>
             </w:r>
           </w:p>
         </w:tc>
@@ -6590,12 +6758,12 @@
             </w:pPr>
             <w:r>
               <w:rPr>
-                <w:rFonts w:hint="default" w:ascii="Arial Regular" w:hAnsi="Arial Regular" w:cs="Arial Regular"/>
-                <w:sz w:val="22"/>
-                <w:szCs w:val="22"/>
-                <w:rtl w:val="0"/>
-              </w:rPr>
-              <w:t>Analytics charts and minimum, maximum, and average values for Live, 24H, 7D, 30D, and Custom ranges</w:t>
+                <w:rFonts w:hint="default" w:ascii="Arial" w:hAnsi="Arial" w:cs="Arial" w:eastAsia="Arial"/>
+                <w:sz w:val="22"/>
+                <w:szCs w:val="22"/>
+                <w:rtl w:val="0"/>
+              </w:rPr>
+              <w:t>Historical sensor charts with minimum, maximum, and average values across selectable ranges.</w:t>
             </w:r>
           </w:p>
         </w:tc>
@@ -6620,7 +6788,7 @@
             </w:pPr>
             <w:r>
               <w:rPr>
-                <w:rFonts w:hint="default" w:ascii="Arial Regular" w:hAnsi="Arial Regular" w:cs="Arial Regular"/>
+                <w:rFonts w:hint="default" w:ascii="Arial" w:hAnsi="Arial" w:cs="Arial" w:eastAsia="Arial"/>
                 <w:sz w:val="22"/>
                 <w:szCs w:val="22"/>
                 <w:rtl w:val="0"/>
@@ -6650,7 +6818,7 @@
             </w:pPr>
             <w:r>
               <w:rPr>
-                <w:rFonts w:hint="default" w:ascii="Arial Regular" w:hAnsi="Arial Regular" w:cs="Arial Regular"/>
+                <w:rFonts w:hint="default" w:ascii="Arial" w:hAnsi="Arial" w:cs="Arial" w:eastAsia="Arial"/>
                 <w:sz w:val="22"/>
                 <w:szCs w:val="22"/>
                 <w:rtl w:val="0"/>
@@ -6677,6 +6845,9 @@
             <w:right w:w="108" w:type="dxa"/>
           </w:tblCellMar>
         </w:tblPrEx>
+        <w:trPr>
+          <w:cantSplit w:val="true"/>
+        </w:trPr>
         <w:tc>
           <w:tcPr>
             <w:tcW w:w="3001" w:type="dxa"/>
@@ -6709,12 +6880,12 @@
             </w:pPr>
             <w:r>
               <w:rPr>
-                <w:rFonts w:hint="default" w:ascii="Arial Regular" w:hAnsi="Arial Regular" w:cs="Arial Regular"/>
-                <w:sz w:val="22"/>
-                <w:szCs w:val="22"/>
-                <w:rtl w:val="0"/>
-              </w:rPr>
-              <w:t>The system must allow users to manage their profile and credentials</w:t>
+                <w:rFonts w:hint="default" w:ascii="Arial" w:hAnsi="Arial" w:cs="Arial" w:eastAsia="Arial"/>
+                <w:sz w:val="22"/>
+                <w:szCs w:val="22"/>
+                <w:rtl w:val="0"/>
+              </w:rPr>
+              <w:t>The system must allow users to manage their profiles and credentials.</w:t>
             </w:r>
           </w:p>
         </w:tc>
@@ -6750,12 +6921,12 @@
             </w:pPr>
             <w:r>
               <w:rPr>
-                <w:rFonts w:hint="default" w:ascii="Arial Regular" w:hAnsi="Arial Regular" w:cs="Arial Regular"/>
-                <w:sz w:val="22"/>
-                <w:szCs w:val="22"/>
-                <w:rtl w:val="0"/>
-              </w:rPr>
-              <w:t>Profile editing and password creation or change based on the account's supported sign-in method</w:t>
+                <w:rFonts w:hint="default" w:ascii="Arial" w:hAnsi="Arial" w:cs="Arial" w:eastAsia="Arial"/>
+                <w:sz w:val="22"/>
+                <w:szCs w:val="22"/>
+                <w:rtl w:val="0"/>
+              </w:rPr>
+              <w:t>Profile and password management based on the user's sign-in method.</w:t>
             </w:r>
           </w:p>
         </w:tc>
@@ -6780,7 +6951,7 @@
             </w:pPr>
             <w:r>
               <w:rPr>
-                <w:rFonts w:hint="default" w:ascii="Arial Regular" w:hAnsi="Arial Regular" w:cs="Arial Regular"/>
+                <w:rFonts w:hint="default" w:ascii="Arial" w:hAnsi="Arial" w:cs="Arial" w:eastAsia="Arial"/>
                 <w:sz w:val="22"/>
                 <w:szCs w:val="22"/>
                 <w:rtl w:val="0"/>
@@ -6810,7 +6981,7 @@
             </w:pPr>
             <w:r>
               <w:rPr>
-                <w:rFonts w:hint="default" w:ascii="Arial Regular" w:hAnsi="Arial Regular" w:cs="Arial Regular"/>
+                <w:rFonts w:hint="default" w:ascii="Arial" w:hAnsi="Arial" w:cs="Arial" w:eastAsia="Arial"/>
                 <w:sz w:val="22"/>
                 <w:szCs w:val="22"/>
                 <w:rtl w:val="0"/>
@@ -6837,6 +7008,9 @@
             <w:right w:w="108" w:type="dxa"/>
           </w:tblCellMar>
         </w:tblPrEx>
+        <w:trPr>
+          <w:cantSplit w:val="true"/>
+        </w:trPr>
         <w:tc>
           <w:tcPr>
             <w:tcW w:w="3001" w:type="dxa"/>
@@ -6869,12 +7043,12 @@
             </w:pPr>
             <w:r>
               <w:rPr>
-                <w:rFonts w:hint="default" w:ascii="Arial Regular" w:hAnsi="Arial Regular" w:cs="Arial Regular"/>
-                <w:sz w:val="22"/>
-                <w:szCs w:val="22"/>
-                <w:rtl w:val="0"/>
-              </w:rPr>
-              <w:t>The system must manage notifications and owner preferences</w:t>
+                <w:rFonts w:hint="default" w:ascii="Arial" w:hAnsi="Arial" w:cs="Arial" w:eastAsia="Arial"/>
+                <w:sz w:val="22"/>
+                <w:szCs w:val="22"/>
+                <w:rtl w:val="0"/>
+              </w:rPr>
+              <w:t>The system must manage notifications and owner preferences.</w:t>
             </w:r>
           </w:p>
         </w:tc>
@@ -6910,12 +7084,12 @@
             </w:pPr>
             <w:r>
               <w:rPr>
-                <w:rFonts w:hint="default" w:ascii="Arial Regular" w:hAnsi="Arial Regular" w:cs="Arial Regular"/>
-                <w:sz w:val="22"/>
-                <w:szCs w:val="22"/>
-                <w:rtl w:val="0"/>
-              </w:rPr>
-              <w:t>Grouped in-app notification history with read state, category filters, and owner controls for alert categories, sound, and vibration</w:t>
+                <w:rFonts w:hint="default" w:ascii="Arial" w:hAnsi="Arial" w:cs="Arial" w:eastAsia="Arial"/>
+                <w:sz w:val="22"/>
+                <w:szCs w:val="22"/>
+                <w:rtl w:val="0"/>
+              </w:rPr>
+              <w:t>Notification history, read status, category filters, and alert preferences.</w:t>
             </w:r>
           </w:p>
         </w:tc>
@@ -6940,7 +7114,7 @@
             </w:pPr>
             <w:r>
               <w:rPr>
-                <w:rFonts w:hint="default" w:ascii="Arial Regular" w:hAnsi="Arial Regular" w:cs="Arial Regular"/>
+                <w:rFonts w:hint="default" w:ascii="Arial" w:hAnsi="Arial" w:cs="Arial" w:eastAsia="Arial"/>
                 <w:sz w:val="22"/>
                 <w:szCs w:val="22"/>
                 <w:rtl w:val="0"/>
@@ -6970,7 +7144,7 @@
             </w:pPr>
             <w:r>
               <w:rPr>
-                <w:rFonts w:hint="default" w:ascii="Arial Regular" w:hAnsi="Arial Regular" w:cs="Arial Regular"/>
+                <w:rFonts w:hint="default" w:ascii="Arial" w:hAnsi="Arial" w:cs="Arial" w:eastAsia="Arial"/>
                 <w:sz w:val="22"/>
                 <w:szCs w:val="22"/>
                 <w:rtl w:val="0"/>
@@ -6997,6 +7171,9 @@
             <w:right w:w="108" w:type="dxa"/>
           </w:tblCellMar>
         </w:tblPrEx>
+        <w:trPr>
+          <w:cantSplit w:val="true"/>
+        </w:trPr>
         <w:tc>
           <w:tcPr>
             <w:tcW w:w="3001" w:type="dxa"/>
@@ -7029,12 +7206,12 @@
             </w:pPr>
             <w:r>
               <w:rPr>
-                <w:rFonts w:hint="default" w:ascii="Arial Regular" w:hAnsi="Arial Regular" w:cs="Arial Regular"/>
-                <w:sz w:val="22"/>
-                <w:szCs w:val="22"/>
-                <w:rtl w:val="0"/>
-              </w:rPr>
-              <w:t>The system must manage production and batch records</w:t>
+                <w:rFonts w:hint="default" w:ascii="Arial" w:hAnsi="Arial" w:cs="Arial" w:eastAsia="Arial"/>
+                <w:sz w:val="22"/>
+                <w:szCs w:val="22"/>
+                <w:rtl w:val="0"/>
+              </w:rPr>
+              <w:t>The system must manage production and batch records.</w:t>
             </w:r>
           </w:p>
         </w:tc>
@@ -7070,12 +7247,12 @@
             </w:pPr>
             <w:r>
               <w:rPr>
-                <w:rFonts w:hint="default" w:ascii="Arial Regular" w:hAnsi="Arial Regular" w:cs="Arial Regular"/>
-                <w:sz w:val="22"/>
-                <w:szCs w:val="22"/>
-                <w:rtl w:val="0"/>
-              </w:rPr>
-              <w:t>Validated mortality and harvest records, live-population updates, batch completion, and access to previous batch history</w:t>
+                <w:rFonts w:hint="default" w:ascii="Arial" w:hAnsi="Arial" w:cs="Arial" w:eastAsia="Arial"/>
+                <w:sz w:val="22"/>
+                <w:szCs w:val="22"/>
+                <w:rtl w:val="0"/>
+              </w:rPr>
+              <w:t>Batch, sampling, mortality, harvest, population, and completion records.</w:t>
             </w:r>
           </w:p>
         </w:tc>
@@ -7100,7 +7277,7 @@
             </w:pPr>
             <w:r>
               <w:rPr>
-                <w:rFonts w:hint="default" w:ascii="Arial Regular" w:hAnsi="Arial Regular" w:cs="Arial Regular"/>
+                <w:rFonts w:hint="default" w:ascii="Arial" w:hAnsi="Arial" w:cs="Arial" w:eastAsia="Arial"/>
                 <w:sz w:val="22"/>
                 <w:szCs w:val="22"/>
                 <w:rtl w:val="0"/>
@@ -7130,7 +7307,7 @@
             </w:pPr>
             <w:r>
               <w:rPr>
-                <w:rFonts w:hint="default" w:ascii="Arial Regular" w:hAnsi="Arial Regular" w:cs="Arial Regular"/>
+                <w:rFonts w:hint="default" w:ascii="Arial" w:hAnsi="Arial" w:cs="Arial" w:eastAsia="Arial"/>
                 <w:sz w:val="22"/>
                 <w:szCs w:val="22"/>
                 <w:rtl w:val="0"/>
@@ -7157,6 +7334,9 @@
             <w:right w:w="108" w:type="dxa"/>
           </w:tblCellMar>
         </w:tblPrEx>
+        <w:trPr>
+          <w:cantSplit w:val="true"/>
+        </w:trPr>
         <w:tc>
           <w:tcPr>
             <w:tcW w:w="3001" w:type="dxa"/>
@@ -7189,12 +7369,12 @@
             </w:pPr>
             <w:r>
               <w:rPr>
-                <w:rFonts w:hint="default" w:ascii="Arial Regular" w:hAnsi="Arial Regular" w:cs="Arial Regular"/>
-                <w:sz w:val="22"/>
-                <w:szCs w:val="22"/>
-                <w:rtl w:val="0"/>
-              </w:rPr>
-              <w:t>The system must maintain feeding and actuator activity logs</w:t>
+                <w:rFonts w:hint="default" w:ascii="Arial" w:hAnsi="Arial" w:cs="Arial" w:eastAsia="Arial"/>
+                <w:sz w:val="22"/>
+                <w:szCs w:val="22"/>
+                <w:rtl w:val="0"/>
+              </w:rPr>
+              <w:t>The system must maintain feeding and actuator activity logs.</w:t>
             </w:r>
           </w:p>
         </w:tc>
@@ -7230,12 +7410,12 @@
             </w:pPr>
             <w:r>
               <w:rPr>
-                <w:rFonts w:hint="default" w:ascii="Arial Regular" w:hAnsi="Arial Regular" w:cs="Arial Regular"/>
-                <w:sz w:val="22"/>
-                <w:szCs w:val="22"/>
-                <w:rtl w:val="0"/>
-              </w:rPr>
-              <w:t>ESP-confirmed feeding outcomes and actuator activity history with time, status, and applicable failure or skip reason</w:t>
+                <w:rFonts w:hint="default" w:ascii="Arial" w:hAnsi="Arial" w:cs="Arial" w:eastAsia="Arial"/>
+                <w:sz w:val="22"/>
+                <w:szCs w:val="22"/>
+                <w:rtl w:val="0"/>
+              </w:rPr>
+              <w:t>Feeding and actuator logs with time, outcome, and failure or skip details.</w:t>
             </w:r>
           </w:p>
         </w:tc>
@@ -7260,7 +7440,7 @@
             </w:pPr>
             <w:r>
               <w:rPr>
-                <w:rFonts w:hint="default" w:ascii="Arial Regular" w:hAnsi="Arial Regular" w:cs="Arial Regular"/>
+                <w:rFonts w:hint="default" w:ascii="Arial" w:hAnsi="Arial" w:cs="Arial" w:eastAsia="Arial"/>
                 <w:sz w:val="22"/>
                 <w:szCs w:val="22"/>
                 <w:rtl w:val="0"/>
@@ -7290,7 +7470,7 @@
             </w:pPr>
             <w:r>
               <w:rPr>
-                <w:rFonts w:hint="default" w:ascii="Arial Regular" w:hAnsi="Arial Regular" w:cs="Arial Regular"/>
+                <w:rFonts w:hint="default" w:ascii="Arial" w:hAnsi="Arial" w:cs="Arial" w:eastAsia="Arial"/>
                 <w:sz w:val="22"/>
                 <w:szCs w:val="22"/>
                 <w:rtl w:val="0"/>
@@ -7317,6 +7497,9 @@
             <w:right w:w="108" w:type="dxa"/>
           </w:tblCellMar>
         </w:tblPrEx>
+        <w:trPr>
+          <w:cantSplit w:val="true"/>
+        </w:trPr>
         <w:tc>
           <w:tcPr>
             <w:tcW w:w="3001" w:type="dxa"/>
@@ -7349,12 +7532,12 @@
             </w:pPr>
             <w:r>
               <w:rPr>
-                <w:rFonts w:hint="default" w:ascii="Arial Regular" w:hAnsi="Arial Regular" w:cs="Arial Regular"/>
-                <w:sz w:val="22"/>
-                <w:szCs w:val="22"/>
-                <w:rtl w:val="0"/>
-              </w:rPr>
-              <w:t>The system must provide an Android home-screen monitoring widget</w:t>
+                <w:rFonts w:hint="default" w:ascii="Arial" w:hAnsi="Arial" w:cs="Arial" w:eastAsia="Arial"/>
+                <w:sz w:val="22"/>
+                <w:szCs w:val="22"/>
+                <w:rtl w:val="0"/>
+              </w:rPr>
+              <w:t>The system must provide an Android home-screen monitoring widget.</w:t>
             </w:r>
           </w:p>
         </w:tc>
@@ -7390,12 +7573,12 @@
             </w:pPr>
             <w:r>
               <w:rPr>
-                <w:rFonts w:hint="default" w:ascii="Arial Regular" w:hAnsi="Arial Regular" w:cs="Arial Regular"/>
-                <w:sz w:val="22"/>
-                <w:szCs w:val="22"/>
-                <w:rtl w:val="0"/>
-              </w:rPr>
-              <w:t>Home-screen summary of connectivity, Water Quality Anomaly Detection, current sensor readings, and next feeding information</w:t>
+                <w:rFonts w:hint="default" w:ascii="Arial" w:hAnsi="Arial" w:cs="Arial" w:eastAsia="Arial"/>
+                <w:sz w:val="22"/>
+                <w:szCs w:val="22"/>
+                <w:rtl w:val="0"/>
+              </w:rPr>
+              <w:t>Android home-screen widget for connectivity, anomaly status, sensor readings, and feeding details.</w:t>
             </w:r>
           </w:p>
         </w:tc>
@@ -7420,7 +7603,7 @@
             </w:pPr>
             <w:r>
               <w:rPr>
-                <w:rFonts w:hint="default" w:ascii="Arial Regular" w:hAnsi="Arial Regular" w:cs="Arial Regular"/>
+                <w:rFonts w:hint="default" w:ascii="Arial" w:hAnsi="Arial" w:cs="Arial" w:eastAsia="Arial"/>
                 <w:sz w:val="22"/>
                 <w:szCs w:val="22"/>
                 <w:rtl w:val="0"/>
@@ -7450,10 +7633,72 @@
             </w:pPr>
             <w:r>
               <w:rPr>
-                <w:rFonts w:hint="default" w:ascii="Arial Regular" w:hAnsi="Arial Regular" w:cs="Arial Regular"/>
-                <w:sz w:val="22"/>
-                <w:szCs w:val="22"/>
-                <w:rtl w:val="0"/>
+                <w:rFonts w:hint="default" w:ascii="Arial" w:hAnsi="Arial" w:cs="Arial" w:eastAsia="Arial"/>
+                <w:sz w:val="22"/>
+                <w:szCs w:val="22"/>
+                <w:rtl w:val="0"/>
+              </w:rPr>
+              <w:t>Implemented</w:t>
+            </w:r>
+          </w:p>
+        </w:tc>
+      </w:tr>
+      <w:tr>
+        <w:tc>
+          <w:tcPr>
+            <w:tcW w:w="3001" w:type="dxa"/>
+            <w:vAlign w:val="top"/>
+          </w:tcPr>
+          <w:p>
+            <w:r>
+              <w:rPr>
+                <w:rFonts w:ascii="Arial" w:hAnsi="Arial" w:eastAsia="Arial" w:cs="Arial"/>
+                <w:sz w:val="22"/>
+              </w:rPr>
+              <w:t>The system must continue synchronized feeding schedules and automatic actuator control during temporary internet interruptions.</w:t>
+            </w:r>
+          </w:p>
+        </w:tc>
+        <w:tc>
+          <w:tcPr>
+            <w:tcW w:w="3123" w:type="dxa"/>
+            <w:vAlign w:val="top"/>
+          </w:tcPr>
+          <w:p>
+            <w:r>
+              <w:rPr>
+                <w:rFonts w:ascii="Arial" w:hAnsi="Arial" w:eastAsia="Arial" w:cs="Arial"/>
+                <w:sz w:val="22"/>
+              </w:rPr>
+              <w:t>Local execution of synchronized feeding schedules and AUTO actuator rules while offline.</w:t>
+            </w:r>
+          </w:p>
+        </w:tc>
+        <w:tc>
+          <w:tcPr>
+            <w:tcW w:w="1383" w:type="dxa"/>
+            <w:vAlign w:val="top"/>
+          </w:tcPr>
+          <w:p>
+            <w:r>
+              <w:rPr>
+                <w:rFonts w:ascii="Arial" w:hAnsi="Arial" w:eastAsia="Arial" w:cs="Arial"/>
+                <w:sz w:val="22"/>
+              </w:rPr>
+              <w:t>High</w:t>
+            </w:r>
+          </w:p>
+        </w:tc>
+        <w:tc>
+          <w:tcPr>
+            <w:tcW w:w="1493" w:type="dxa"/>
+            <w:vAlign w:val="top"/>
+          </w:tcPr>
+          <w:p>
+            <w:r>
+              <w:rPr>
+                <w:rFonts w:ascii="Arial" w:hAnsi="Arial" w:eastAsia="Arial" w:cs="Arial"/>
+                <w:sz w:val="22"/>
               </w:rPr>
               <w:t>Implemented</w:t>
             </w:r>
@@ -7730,6 +7975,9 @@
             <w:right w:w="108" w:type="dxa"/>
           </w:tblCellMar>
         </w:tblPrEx>
+        <w:trPr>
+          <w:cantSplit w:val="true"/>
+        </w:trPr>
         <w:tc>
           <w:tcPr>
             <w:tcW w:w="9000" w:type="dxa"/>
@@ -7762,27 +8010,7 @@
               </w:rPr>
             </w:pPr>
             <w:r>
-              <w:rPr>
-                <w:rFonts w:hint="default" w:ascii="Arial Bold" w:hAnsi="Arial Bold" w:cs="Arial Bold"/>
-                <w:b/>
-                <w:bCs/>
-                <w:sz w:val="22"/>
-                <w:szCs w:val="22"/>
-                <w:rtl w:val="0"/>
-                <w:lang w:val="en-US"/>
-              </w:rPr>
-              <w:t>Hardware</w:t>
-            </w:r>
-            <w:r>
-              <w:rPr>
-                <w:rFonts w:hint="default" w:ascii="Arial Bold" w:hAnsi="Arial Bold" w:cs="Arial Bold"/>
-                <w:b/>
-                <w:bCs/>
-                <w:sz w:val="22"/>
-                <w:szCs w:val="22"/>
-                <w:rtl w:val="0"/>
-              </w:rPr>
-              <w:t xml:space="preserve"> Requirements</w:t>
+              <w:t>Non-Functional Requirements</w:t>
             </w:r>
           </w:p>
         </w:tc>
@@ -7804,6 +8032,9 @@
             <w:right w:w="108" w:type="dxa"/>
           </w:tblCellMar>
         </w:tblPrEx>
+        <w:trPr>
+          <w:cantSplit w:val="true"/>
+        </w:trPr>
         <w:tc>
           <w:tcPr>
             <w:tcW w:w="3001" w:type="dxa"/>
@@ -7845,7 +8076,7 @@
             </w:pPr>
             <w:r>
               <w:rPr>
-                <w:rFonts w:hint="default" w:ascii="Arial Bold" w:hAnsi="Arial Bold" w:cs="Arial Bold"/>
+                <w:rFonts w:hint="default" w:ascii="Arial" w:hAnsi="Arial" w:cs="Arial" w:eastAsia="Arial"/>
                 <w:b/>
                 <w:bCs w:val="0"/>
                 <w:sz w:val="22"/>
@@ -7897,7 +8128,7 @@
             </w:pPr>
             <w:r>
               <w:rPr>
-                <w:rFonts w:hint="default" w:ascii="Arial Bold" w:hAnsi="Arial Bold" w:cs="Arial Bold"/>
+                <w:rFonts w:hint="default" w:ascii="Arial" w:hAnsi="Arial" w:cs="Arial" w:eastAsia="Arial"/>
                 <w:b/>
                 <w:bCs w:val="0"/>
                 <w:sz w:val="22"/>
@@ -7949,7 +8180,7 @@
             </w:pPr>
             <w:r>
               <w:rPr>
-                <w:rFonts w:hint="default" w:ascii="Arial Bold" w:hAnsi="Arial Bold" w:cs="Arial Bold"/>
+                <w:rFonts w:hint="default" w:ascii="Arial" w:hAnsi="Arial" w:cs="Arial" w:eastAsia="Arial"/>
                 <w:b/>
                 <w:bCs w:val="0"/>
                 <w:sz w:val="22"/>
@@ -8001,14 +8232,14 @@
             </w:pPr>
             <w:r>
               <w:rPr>
-                <w:rFonts w:hint="default" w:ascii="Arial Bold" w:hAnsi="Arial Bold" w:cs="Arial Bold"/>
+                <w:rFonts w:hint="default" w:ascii="Arial" w:hAnsi="Arial" w:cs="Arial" w:eastAsia="Arial"/>
                 <w:b/>
                 <w:bCs w:val="0"/>
                 <w:sz w:val="22"/>
                 <w:szCs w:val="22"/>
                 <w:rtl w:val="0"/>
               </w:rPr>
-              <w:t xml:space="preserve"> Status</w:t>
+              <w:t>Status</w:t>
             </w:r>
           </w:p>
         </w:tc>
@@ -8030,6 +8261,9 @@
             <w:right w:w="108" w:type="dxa"/>
           </w:tblCellMar>
         </w:tblPrEx>
+        <w:trPr>
+          <w:cantSplit w:val="true"/>
+        </w:trPr>
         <w:tc>
           <w:tcPr>
             <w:tcW w:w="3001" w:type="dxa"/>
@@ -8049,12 +8283,12 @@
             </w:pPr>
             <w:r>
               <w:rPr>
-                <w:rFonts w:hint="default" w:ascii="Arial Regular" w:hAnsi="Arial Regular" w:cs="Arial Regular"/>
-                <w:sz w:val="22"/>
-                <w:szCs w:val="22"/>
-                <w:rtl w:val="0"/>
-              </w:rPr>
-              <w:t xml:space="preserve">The system should operate continuously in real-time farm conditions </w:t>
+                <w:rFonts w:hint="default" w:ascii="Arial" w:hAnsi="Arial" w:cs="Arial" w:eastAsia="Arial"/>
+                <w:sz w:val="22"/>
+                <w:szCs w:val="22"/>
+                <w:rtl w:val="0"/>
+              </w:rPr>
+              <w:t>The system should remain available throughout each planned field-test period.</w:t>
             </w:r>
           </w:p>
         </w:tc>
@@ -8077,12 +8311,12 @@
             </w:pPr>
             <w:r>
               <w:rPr>
-                <w:rFonts w:hint="default" w:ascii="Arial Regular" w:hAnsi="Arial Regular" w:cs="Arial Regular"/>
-                <w:sz w:val="22"/>
-                <w:szCs w:val="22"/>
-                <w:rtl w:val="0"/>
-              </w:rPr>
-              <w:t>24/7 availability with stable real-time monitoring</w:t>
+                <w:rFonts w:hint="default" w:ascii="Arial" w:hAnsi="Arial" w:cs="Arial" w:eastAsia="Arial"/>
+                <w:sz w:val="22"/>
+                <w:szCs w:val="22"/>
+                <w:rtl w:val="0"/>
+              </w:rPr>
+              <w:t>Field-test uptime monitoring with sensor-record continuity during network interruptions.</w:t>
             </w:r>
           </w:p>
         </w:tc>
@@ -8105,12 +8339,12 @@
             </w:pPr>
             <w:r>
               <w:rPr>
-                <w:rFonts w:hint="default" w:ascii="Arial Regular" w:hAnsi="Arial Regular" w:cs="Arial Regular"/>
-                <w:sz w:val="22"/>
-                <w:szCs w:val="22"/>
-                <w:rtl w:val="0"/>
-              </w:rPr>
-              <w:t xml:space="preserve">High </w:t>
+                <w:rFonts w:hint="default" w:ascii="Arial" w:hAnsi="Arial" w:cs="Arial" w:eastAsia="Arial"/>
+                <w:sz w:val="22"/>
+                <w:szCs w:val="22"/>
+                <w:rtl w:val="0"/>
+              </w:rPr>
+              <w:t>High</w:t>
             </w:r>
           </w:p>
         </w:tc>
@@ -8132,13 +8366,7 @@
               </w:rPr>
             </w:pPr>
             <w:r>
-              <w:rPr>
-                <w:rFonts w:hint="default" w:ascii="Arial Regular" w:hAnsi="Arial Regular" w:cs="Arial Regular"/>
-                <w:sz w:val="22"/>
-                <w:szCs w:val="22"/>
-                <w:rtl w:val="0"/>
-              </w:rPr>
-              <w:t>Implemented - For Field Validation</w:t>
+              <w:t>For Field Testing</w:t>
             </w:r>
           </w:p>
         </w:tc>
@@ -8160,6 +8388,9 @@
             <w:right w:w="108" w:type="dxa"/>
           </w:tblCellMar>
         </w:tblPrEx>
+        <w:trPr>
+          <w:cantSplit w:val="true"/>
+        </w:trPr>
         <w:tc>
           <w:tcPr>
             <w:tcW w:w="3001" w:type="dxa"/>
@@ -8179,12 +8410,12 @@
             </w:pPr>
             <w:r>
               <w:rPr>
-                <w:rFonts w:hint="default" w:ascii="Arial Regular" w:hAnsi="Arial Regular" w:cs="Arial Regular"/>
-                <w:sz w:val="22"/>
-                <w:szCs w:val="22"/>
-                <w:rtl w:val="0"/>
-              </w:rPr>
-              <w:t xml:space="preserve">The system should ensure reliable sensor readings </w:t>
+                <w:rFonts w:hint="default" w:ascii="Arial" w:hAnsi="Arial" w:cs="Arial" w:eastAsia="Arial"/>
+                <w:sz w:val="22"/>
+                <w:szCs w:val="22"/>
+                <w:rtl w:val="0"/>
+              </w:rPr>
+              <w:t>Sensor readings should meet each installed sensor's documented accuracy after calibration.</w:t>
             </w:r>
           </w:p>
         </w:tc>
@@ -8207,12 +8438,12 @@
             </w:pPr>
             <w:r>
               <w:rPr>
-                <w:rFonts w:hint="default" w:ascii="Arial Regular" w:hAnsi="Arial Regular" w:cs="Arial Regular"/>
-                <w:sz w:val="22"/>
-                <w:szCs w:val="22"/>
-                <w:rtl w:val="0"/>
-              </w:rPr>
-              <w:t>High accuracy and consistency of sensor data</w:t>
+                <w:rFonts w:hint="default" w:ascii="Arial" w:hAnsi="Arial" w:cs="Arial" w:eastAsia="Arial"/>
+                <w:sz w:val="22"/>
+                <w:szCs w:val="22"/>
+                <w:rtl w:val="0"/>
+              </w:rPr>
+              <w:t>Calibration checks against suitable reference instruments for each installed sensor.</w:t>
             </w:r>
           </w:p>
         </w:tc>
@@ -8235,12 +8466,12 @@
             </w:pPr>
             <w:r>
               <w:rPr>
-                <w:rFonts w:hint="default" w:ascii="Arial Regular" w:hAnsi="Arial Regular" w:cs="Arial Regular"/>
-                <w:sz w:val="22"/>
-                <w:szCs w:val="22"/>
-                <w:rtl w:val="0"/>
-              </w:rPr>
-              <w:t xml:space="preserve">High </w:t>
+                <w:rFonts w:hint="default" w:ascii="Arial" w:hAnsi="Arial" w:cs="Arial" w:eastAsia="Arial"/>
+                <w:sz w:val="22"/>
+                <w:szCs w:val="22"/>
+                <w:rtl w:val="0"/>
+              </w:rPr>
+              <w:t>High</w:t>
             </w:r>
           </w:p>
         </w:tc>
@@ -8262,13 +8493,7 @@
               </w:rPr>
             </w:pPr>
             <w:r>
-              <w:rPr>
-                <w:rFonts w:hint="default" w:ascii="Arial Regular" w:hAnsi="Arial Regular" w:cs="Arial Regular"/>
-                <w:sz w:val="22"/>
-                <w:szCs w:val="22"/>
-                <w:rtl w:val="0"/>
-              </w:rPr>
-              <w:t>Implemented - For Field Validation</w:t>
+              <w:t>For Field Testing</w:t>
             </w:r>
           </w:p>
         </w:tc>
@@ -8290,6 +8515,9 @@
             <w:right w:w="108" w:type="dxa"/>
           </w:tblCellMar>
         </w:tblPrEx>
+        <w:trPr>
+          <w:cantSplit w:val="true"/>
+        </w:trPr>
         <w:tc>
           <w:tcPr>
             <w:tcW w:w="3001" w:type="dxa"/>
@@ -8309,12 +8537,12 @@
             </w:pPr>
             <w:r>
               <w:rPr>
-                <w:rFonts w:hint="default" w:ascii="Arial Regular" w:hAnsi="Arial Regular" w:cs="Arial Regular"/>
-                <w:sz w:val="22"/>
-                <w:szCs w:val="22"/>
-                <w:rtl w:val="0"/>
-              </w:rPr>
-              <w:t xml:space="preserve">The system should withstand aquaculture environment conditions </w:t>
+                <w:rFonts w:hint="default" w:ascii="Arial" w:hAnsi="Arial" w:cs="Arial" w:eastAsia="Arial"/>
+                <w:sz w:val="22"/>
+                <w:szCs w:val="22"/>
+                <w:rtl w:val="0"/>
+              </w:rPr>
+              <w:t>The hardware should operate reliably under the environmental conditions specified for the tank installation.</w:t>
             </w:r>
           </w:p>
         </w:tc>
@@ -8337,12 +8565,12 @@
             </w:pPr>
             <w:r>
               <w:rPr>
-                <w:rFonts w:hint="default" w:ascii="Arial Regular" w:hAnsi="Arial Regular" w:cs="Arial Regular"/>
-                <w:sz w:val="22"/>
-                <w:szCs w:val="22"/>
-                <w:rtl w:val="0"/>
-              </w:rPr>
-              <w:t>Durable and environment-resistant hardware design</w:t>
+                <w:rFonts w:hint="default" w:ascii="Arial" w:hAnsi="Arial" w:cs="Arial" w:eastAsia="Arial"/>
+                <w:sz w:val="22"/>
+                <w:szCs w:val="22"/>
+                <w:rtl w:val="0"/>
+              </w:rPr>
+              <w:t>Hardware checks under the expected moisture, splash, and operating conditions.</w:t>
             </w:r>
           </w:p>
         </w:tc>
@@ -8365,7 +8593,7 @@
             </w:pPr>
             <w:r>
               <w:rPr>
-                <w:rFonts w:hint="default" w:ascii="Arial Regular" w:hAnsi="Arial Regular" w:cs="Arial Regular"/>
+                <w:rFonts w:hint="default" w:ascii="Arial" w:hAnsi="Arial" w:cs="Arial" w:eastAsia="Arial"/>
                 <w:sz w:val="22"/>
                 <w:szCs w:val="22"/>
                 <w:rtl w:val="0"/>
@@ -8392,13 +8620,7 @@
               </w:rPr>
             </w:pPr>
             <w:r>
-              <w:rPr>
-                <w:rFonts w:hint="default" w:ascii="Arial Regular" w:hAnsi="Arial Regular" w:cs="Arial Regular"/>
-                <w:sz w:val="22"/>
-                <w:szCs w:val="22"/>
-                <w:rtl w:val="0"/>
-              </w:rPr>
-              <w:t>Implemented - For Field Validation</w:t>
+              <w:t>For Field Testing</w:t>
             </w:r>
           </w:p>
         </w:tc>
@@ -8420,6 +8642,9 @@
             <w:right w:w="108" w:type="dxa"/>
           </w:tblCellMar>
         </w:tblPrEx>
+        <w:trPr>
+          <w:cantSplit w:val="true"/>
+        </w:trPr>
         <w:tc>
           <w:tcPr>
             <w:tcW w:w="3001" w:type="dxa"/>
@@ -8439,12 +8664,12 @@
             </w:pPr>
             <w:r>
               <w:rPr>
-                <w:rFonts w:hint="default" w:ascii="Arial Regular" w:hAnsi="Arial Regular" w:cs="Arial Regular"/>
-                <w:sz w:val="22"/>
-                <w:szCs w:val="22"/>
-                <w:rtl w:val="0"/>
-              </w:rPr>
-              <w:t xml:space="preserve">The system should support continuous data transmission </w:t>
+                <w:rFonts w:hint="default" w:ascii="Arial" w:hAnsi="Arial" w:cs="Arial" w:eastAsia="Arial"/>
+                <w:sz w:val="22"/>
+                <w:szCs w:val="22"/>
+                <w:rtl w:val="0"/>
+              </w:rPr>
+              <w:t>Valid sensor records should not be lost during temporary Wi-Fi interruptions.</w:t>
             </w:r>
           </w:p>
         </w:tc>
@@ -8467,12 +8692,12 @@
             </w:pPr>
             <w:r>
               <w:rPr>
-                <w:rFonts w:hint="default" w:ascii="Arial Regular" w:hAnsi="Arial Regular" w:cs="Arial Regular"/>
-                <w:sz w:val="22"/>
-                <w:szCs w:val="22"/>
-                <w:rtl w:val="0"/>
-              </w:rPr>
-              <w:t>Reliable wireless communication with minimal downtime</w:t>
+                <w:rFonts w:hint="default" w:ascii="Arial" w:hAnsi="Arial" w:cs="Arial" w:eastAsia="Arial"/>
+                <w:sz w:val="22"/>
+                <w:szCs w:val="22"/>
+                <w:rtl w:val="0"/>
+              </w:rPr>
+              <w:t>Local queuing and post-reconnection synchronization of sensor records.</w:t>
             </w:r>
           </w:p>
         </w:tc>
@@ -8495,12 +8720,12 @@
             </w:pPr>
             <w:r>
               <w:rPr>
-                <w:rFonts w:hint="default" w:ascii="Arial Regular" w:hAnsi="Arial Regular" w:cs="Arial Regular"/>
-                <w:sz w:val="22"/>
-                <w:szCs w:val="22"/>
-                <w:rtl w:val="0"/>
-              </w:rPr>
-              <w:t xml:space="preserve">High </w:t>
+                <w:rFonts w:hint="default" w:ascii="Arial" w:hAnsi="Arial" w:cs="Arial" w:eastAsia="Arial"/>
+                <w:sz w:val="22"/>
+                <w:szCs w:val="22"/>
+                <w:rtl w:val="0"/>
+              </w:rPr>
+              <w:t>High</w:t>
             </w:r>
           </w:p>
         </w:tc>
@@ -8523,12 +8748,12 @@
             </w:pPr>
             <w:r>
               <w:rPr>
-                <w:rFonts w:hint="default" w:ascii="Arial Regular" w:hAnsi="Arial Regular" w:cs="Arial Regular"/>
-                <w:sz w:val="22"/>
-                <w:szCs w:val="22"/>
-                <w:rtl w:val="0"/>
-              </w:rPr>
-              <w:t>Implemented - For Field Validation</w:t>
+                <w:rFonts w:hint="default" w:ascii="Arial" w:hAnsi="Arial" w:cs="Arial" w:eastAsia="Arial"/>
+                <w:sz w:val="22"/>
+                <w:szCs w:val="22"/>
+                <w:rtl w:val="0"/>
+              </w:rPr>
+              <w:t>Implemented</w:t>
             </w:r>
           </w:p>
         </w:tc>
@@ -8550,6 +8775,9 @@
             <w:right w:w="108" w:type="dxa"/>
           </w:tblCellMar>
         </w:tblPrEx>
+        <w:trPr>
+          <w:cantSplit w:val="true"/>
+        </w:trPr>
         <w:tc>
           <w:tcPr>
             <w:tcW w:w="9000" w:type="dxa"/>
@@ -8582,27 +8810,7 @@
               </w:rPr>
             </w:pPr>
             <w:r>
-              <w:rPr>
-                <w:rFonts w:hint="default" w:ascii="Arial Bold" w:hAnsi="Arial Bold" w:cs="Arial Bold"/>
-                <w:b/>
-                <w:bCs/>
-                <w:sz w:val="22"/>
-                <w:szCs w:val="22"/>
-                <w:rtl w:val="0"/>
-                <w:lang w:val="en-US"/>
-              </w:rPr>
-              <w:t>Software</w:t>
-            </w:r>
-            <w:r>
-              <w:rPr>
-                <w:rFonts w:hint="default" w:ascii="Arial Bold" w:hAnsi="Arial Bold" w:cs="Arial Bold"/>
-                <w:b/>
-                <w:bCs/>
-                <w:sz w:val="22"/>
-                <w:szCs w:val="22"/>
-                <w:rtl w:val="0"/>
-              </w:rPr>
-              <w:t xml:space="preserve"> Requirements</w:t>
+              <w:t>Non-Functional Requirements</w:t>
             </w:r>
           </w:p>
         </w:tc>
@@ -8624,6 +8832,9 @@
             <w:right w:w="108" w:type="dxa"/>
           </w:tblCellMar>
         </w:tblPrEx>
+        <w:trPr>
+          <w:cantSplit w:val="true"/>
+        </w:trPr>
         <w:tc>
           <w:tcPr>
             <w:tcW w:w="3001" w:type="dxa"/>
@@ -8665,7 +8876,7 @@
             </w:pPr>
             <w:r>
               <w:rPr>
-                <w:rFonts w:hint="default" w:ascii="Arial Bold" w:hAnsi="Arial Bold" w:cs="Arial Bold"/>
+                <w:rFonts w:hint="default" w:ascii="Arial" w:hAnsi="Arial" w:cs="Arial" w:eastAsia="Arial"/>
                 <w:b/>
                 <w:bCs w:val="0"/>
                 <w:sz w:val="22"/>
@@ -8717,7 +8928,7 @@
             </w:pPr>
             <w:r>
               <w:rPr>
-                <w:rFonts w:hint="default" w:ascii="Arial Bold" w:hAnsi="Arial Bold" w:cs="Arial Bold"/>
+                <w:rFonts w:hint="default" w:ascii="Arial" w:hAnsi="Arial" w:cs="Arial" w:eastAsia="Arial"/>
                 <w:b/>
                 <w:bCs w:val="0"/>
                 <w:sz w:val="22"/>
@@ -8769,7 +8980,7 @@
             </w:pPr>
             <w:r>
               <w:rPr>
-                <w:rFonts w:hint="default" w:ascii="Arial Bold" w:hAnsi="Arial Bold" w:cs="Arial Bold"/>
+                <w:rFonts w:hint="default" w:ascii="Arial" w:hAnsi="Arial" w:cs="Arial" w:eastAsia="Arial"/>
                 <w:b/>
                 <w:bCs w:val="0"/>
                 <w:sz w:val="22"/>
@@ -8821,14 +9032,14 @@
             </w:pPr>
             <w:r>
               <w:rPr>
-                <w:rFonts w:hint="default" w:ascii="Arial Bold" w:hAnsi="Arial Bold" w:cs="Arial Bold"/>
+                <w:rFonts w:hint="default" w:ascii="Arial" w:hAnsi="Arial" w:cs="Arial" w:eastAsia="Arial"/>
                 <w:b/>
                 <w:bCs w:val="0"/>
                 <w:sz w:val="22"/>
                 <w:szCs w:val="22"/>
                 <w:rtl w:val="0"/>
               </w:rPr>
-              <w:t xml:space="preserve"> Status</w:t>
+              <w:t>Status</w:t>
             </w:r>
           </w:p>
         </w:tc>
@@ -8850,6 +9061,9 @@
             <w:right w:w="108" w:type="dxa"/>
           </w:tblCellMar>
         </w:tblPrEx>
+        <w:trPr>
+          <w:cantSplit w:val="true"/>
+        </w:trPr>
         <w:tc>
           <w:tcPr>
             <w:tcW w:w="3001" w:type="dxa"/>
@@ -8869,12 +9083,12 @@
             </w:pPr>
             <w:r>
               <w:rPr>
-                <w:rFonts w:hint="default" w:ascii="Arial Regular" w:hAnsi="Arial Regular" w:cs="Arial Regular"/>
-                <w:sz w:val="22"/>
-                <w:szCs w:val="22"/>
-                <w:rtl w:val="0"/>
-              </w:rPr>
-              <w:t xml:space="preserve">The system should provide fast real-time response </w:t>
+                <w:rFonts w:hint="default" w:ascii="Arial" w:hAnsi="Arial" w:cs="Arial" w:eastAsia="Arial"/>
+                <w:sz w:val="22"/>
+                <w:szCs w:val="22"/>
+                <w:rtl w:val="0"/>
+              </w:rPr>
+              <w:t>The dashboard should display a new sensor reading within five seconds of its Firestore write under stable connectivity.</w:t>
             </w:r>
           </w:p>
         </w:tc>
@@ -8897,12 +9111,12 @@
             </w:pPr>
             <w:r>
               <w:rPr>
-                <w:rFonts w:hint="default" w:ascii="Arial Regular" w:hAnsi="Arial Regular" w:cs="Arial Regular"/>
-                <w:sz w:val="22"/>
-                <w:szCs w:val="22"/>
-                <w:rtl w:val="0"/>
-              </w:rPr>
-              <w:t>Low latency in data processing and dashboard updates</w:t>
+                <w:rFonts w:hint="default" w:ascii="Arial" w:hAnsi="Arial" w:cs="Arial" w:eastAsia="Arial"/>
+                <w:sz w:val="22"/>
+                <w:szCs w:val="22"/>
+                <w:rtl w:val="0"/>
+              </w:rPr>
+              <w:t>Dashboard updates within five seconds of a new sensor record under stable connectivity.</w:t>
             </w:r>
           </w:p>
         </w:tc>
@@ -8925,12 +9139,12 @@
             </w:pPr>
             <w:r>
               <w:rPr>
-                <w:rFonts w:hint="default" w:ascii="Arial Regular" w:hAnsi="Arial Regular" w:cs="Arial Regular"/>
-                <w:sz w:val="22"/>
-                <w:szCs w:val="22"/>
-                <w:rtl w:val="0"/>
-              </w:rPr>
-              <w:t xml:space="preserve">High </w:t>
+                <w:rFonts w:hint="default" w:ascii="Arial" w:hAnsi="Arial" w:cs="Arial" w:eastAsia="Arial"/>
+                <w:sz w:val="22"/>
+                <w:szCs w:val="22"/>
+                <w:rtl w:val="0"/>
+              </w:rPr>
+              <w:t>High</w:t>
             </w:r>
           </w:p>
         </w:tc>
@@ -8952,13 +9166,7 @@
               </w:rPr>
             </w:pPr>
             <w:r>
-              <w:rPr>
-                <w:rFonts w:hint="default" w:ascii="Arial Regular" w:hAnsi="Arial Regular" w:cs="Arial Regular"/>
-                <w:sz w:val="22"/>
-                <w:szCs w:val="22"/>
-                <w:rtl w:val="0"/>
-              </w:rPr>
-              <w:t xml:space="preserve">Implemented </w:t>
+              <w:t>For Field Testing</w:t>
             </w:r>
           </w:p>
         </w:tc>
@@ -8980,6 +9188,9 @@
             <w:right w:w="108" w:type="dxa"/>
           </w:tblCellMar>
         </w:tblPrEx>
+        <w:trPr>
+          <w:cantSplit w:val="true"/>
+        </w:trPr>
         <w:tc>
           <w:tcPr>
             <w:tcW w:w="3001" w:type="dxa"/>
@@ -8999,12 +9210,12 @@
             </w:pPr>
             <w:r>
               <w:rPr>
-                <w:rFonts w:hint="default" w:ascii="Arial Regular" w:hAnsi="Arial Regular" w:cs="Arial Regular"/>
-                <w:sz w:val="22"/>
-                <w:szCs w:val="22"/>
-                <w:rtl w:val="0"/>
-              </w:rPr>
-              <w:t xml:space="preserve">The system should ensure system usability for farmers </w:t>
+                <w:rFonts w:hint="default" w:ascii="Arial" w:hAnsi="Arial" w:cs="Arial" w:eastAsia="Arial"/>
+                <w:sz w:val="22"/>
+                <w:szCs w:val="22"/>
+                <w:rtl w:val="0"/>
+              </w:rPr>
+              <w:t>The mobile app should support tank owners in completing core monitoring and production tasks through clear, consistent controls.</w:t>
             </w:r>
           </w:p>
         </w:tc>
@@ -9027,12 +9238,12 @@
             </w:pPr>
             <w:r>
               <w:rPr>
-                <w:rFonts w:hint="default" w:ascii="Arial Regular" w:hAnsi="Arial Regular" w:cs="Arial Regular"/>
-                <w:sz w:val="22"/>
-                <w:szCs w:val="22"/>
-                <w:rtl w:val="0"/>
-              </w:rPr>
-              <w:t>Simple, intuitive, and user-friendly mobile interface</w:t>
+                <w:rFonts w:hint="default" w:ascii="Arial" w:hAnsi="Arial" w:cs="Arial" w:eastAsia="Arial"/>
+                <w:sz w:val="22"/>
+                <w:szCs w:val="22"/>
+                <w:rtl w:val="0"/>
+              </w:rPr>
+              <w:t>Consistent controls for monitoring, sampling, feeding schedules, and actuator modes.</w:t>
             </w:r>
           </w:p>
         </w:tc>
@@ -9055,12 +9266,12 @@
             </w:pPr>
             <w:r>
               <w:rPr>
-                <w:rFonts w:hint="default" w:ascii="Arial Regular" w:hAnsi="Arial Regular" w:cs="Arial Regular"/>
-                <w:sz w:val="22"/>
-                <w:szCs w:val="22"/>
-                <w:rtl w:val="0"/>
-              </w:rPr>
-              <w:t xml:space="preserve">High </w:t>
+                <w:rFonts w:hint="default" w:ascii="Arial" w:hAnsi="Arial" w:cs="Arial" w:eastAsia="Arial"/>
+                <w:sz w:val="22"/>
+                <w:szCs w:val="22"/>
+                <w:rtl w:val="0"/>
+              </w:rPr>
+              <w:t>High</w:t>
             </w:r>
           </w:p>
         </w:tc>
@@ -9082,66 +9293,12 @@
               </w:rPr>
             </w:pPr>
             <w:r>
-              <w:rPr>
-                <w:rFonts w:hint="default" w:ascii="Arial Regular" w:hAnsi="Arial Regular" w:cs="Arial Regular"/>
-                <w:sz w:val="22"/>
-                <w:szCs w:val="22"/>
-                <w:rtl w:val="0"/>
-              </w:rPr>
-              <w:t xml:space="preserve">Implemented </w:t>
+              <w:t>For Field Testing</w:t>
             </w:r>
           </w:p>
         </w:tc>
       </w:tr>
     </w:tbl>
-    <w:p>
-      <w:pPr>
-        <w:keepNext w:val="0"/>
-        <w:keepLines w:val="0"/>
-        <w:pageBreakBefore w:val="0"/>
-        <w:widowControl/>
-        <w:numPr>
-          <w:ilvl w:val="0"/>
-          <w:numId w:val="0"/>
-        </w:numPr>
-        <w:kinsoku/>
-        <w:wordWrap/>
-        <w:overflowPunct/>
-        <w:topLinePunct w:val="0"/>
-        <w:autoSpaceDE/>
-        <w:autoSpaceDN/>
-        <w:bidi w:val="0"/>
-        <w:adjustRightInd/>
-        <w:snapToGrid/>
-        <w:spacing w:line="480" w:lineRule="auto"/>
-        <w:ind w:left="719" w:leftChars="0"/>
-        <w:jc w:val="both"/>
-        <w:textAlignment w:val="auto"/>
-        <w:rPr>
-          <w:rFonts w:hint="default" w:ascii="Arial Italic" w:hAnsi="Arial Italic" w:cs="Arial Italic"/>
-          <w:b w:val="0"/>
-          <w:bCs w:val="0"/>
-          <w:i/>
-          <w:iCs/>
-          <w:sz w:val="22"/>
-          <w:szCs w:val="22"/>
-          <w:lang w:val="en-US"/>
-        </w:rPr>
-      </w:pPr>
-      <w:r>
-        <w:rPr>
-          <w:rFonts w:hint="default" w:ascii="Arial Italic" w:hAnsi="Arial Italic" w:cs="Arial Italic"/>
-          <w:b w:val="0"/>
-          <w:bCs w:val="0"/>
-          <w:i/>
-          <w:iCs/>
-          <w:sz w:val="22"/>
-          <w:szCs w:val="22"/>
-          <w:lang w:val="en-US"/>
-        </w:rPr>
-        <w:t>Continuation of Table 3.2</w:t>
-      </w:r>
-    </w:p>
     <w:tbl>
       <w:tblPr>
         <w:tblStyle w:val="16"/>
@@ -9186,6 +9343,9 @@
             <w:right w:w="108" w:type="dxa"/>
           </w:tblCellMar>
         </w:tblPrEx>
+        <w:trPr>
+          <w:cantSplit w:val="true"/>
+        </w:trPr>
         <w:tc>
           <w:tcPr>
             <w:tcW w:w="9000" w:type="dxa"/>
@@ -9218,27 +9378,7 @@
               </w:rPr>
             </w:pPr>
             <w:r>
-              <w:rPr>
-                <w:rFonts w:hint="default" w:ascii="Arial Bold" w:hAnsi="Arial Bold" w:cs="Arial Bold"/>
-                <w:b/>
-                <w:bCs/>
-                <w:sz w:val="22"/>
-                <w:szCs w:val="22"/>
-                <w:rtl w:val="0"/>
-                <w:lang w:val="en-US"/>
-              </w:rPr>
-              <w:t>Software</w:t>
-            </w:r>
-            <w:r>
-              <w:rPr>
-                <w:rFonts w:hint="default" w:ascii="Arial Bold" w:hAnsi="Arial Bold" w:cs="Arial Bold"/>
-                <w:b/>
-                <w:bCs/>
-                <w:sz w:val="22"/>
-                <w:szCs w:val="22"/>
-                <w:rtl w:val="0"/>
-              </w:rPr>
-              <w:t xml:space="preserve"> Requirements</w:t>
+              <w:t>Non-Functional Requirements</w:t>
             </w:r>
           </w:p>
         </w:tc>
@@ -9260,6 +9400,9 @@
             <w:right w:w="108" w:type="dxa"/>
           </w:tblCellMar>
         </w:tblPrEx>
+        <w:trPr>
+          <w:cantSplit w:val="true"/>
+        </w:trPr>
         <w:tc>
           <w:tcPr>
             <w:tcW w:w="3001" w:type="dxa"/>
@@ -9301,7 +9444,7 @@
             </w:pPr>
             <w:r>
               <w:rPr>
-                <w:rFonts w:hint="default" w:ascii="Arial Bold" w:hAnsi="Arial Bold" w:cs="Arial Bold"/>
+                <w:rFonts w:hint="default" w:ascii="Arial" w:hAnsi="Arial" w:cs="Arial" w:eastAsia="Arial"/>
                 <w:b/>
                 <w:bCs w:val="0"/>
                 <w:sz w:val="22"/>
@@ -9353,7 +9496,7 @@
             </w:pPr>
             <w:r>
               <w:rPr>
-                <w:rFonts w:hint="default" w:ascii="Arial Bold" w:hAnsi="Arial Bold" w:cs="Arial Bold"/>
+                <w:rFonts w:hint="default" w:ascii="Arial" w:hAnsi="Arial" w:cs="Arial" w:eastAsia="Arial"/>
                 <w:b/>
                 <w:bCs w:val="0"/>
                 <w:sz w:val="22"/>
@@ -9405,7 +9548,7 @@
             </w:pPr>
             <w:r>
               <w:rPr>
-                <w:rFonts w:hint="default" w:ascii="Arial Bold" w:hAnsi="Arial Bold" w:cs="Arial Bold"/>
+                <w:rFonts w:hint="default" w:ascii="Arial" w:hAnsi="Arial" w:cs="Arial" w:eastAsia="Arial"/>
                 <w:b/>
                 <w:bCs w:val="0"/>
                 <w:sz w:val="22"/>
@@ -9457,14 +9600,14 @@
             </w:pPr>
             <w:r>
               <w:rPr>
-                <w:rFonts w:hint="default" w:ascii="Arial Bold" w:hAnsi="Arial Bold" w:cs="Arial Bold"/>
+                <w:rFonts w:hint="default" w:ascii="Arial" w:hAnsi="Arial" w:cs="Arial" w:eastAsia="Arial"/>
                 <w:b/>
                 <w:bCs w:val="0"/>
                 <w:sz w:val="22"/>
                 <w:szCs w:val="22"/>
                 <w:rtl w:val="0"/>
               </w:rPr>
-              <w:t xml:space="preserve"> Status</w:t>
+              <w:t>Status</w:t>
             </w:r>
           </w:p>
         </w:tc>
@@ -9486,6 +9629,9 @@
             <w:right w:w="108" w:type="dxa"/>
           </w:tblCellMar>
         </w:tblPrEx>
+        <w:trPr>
+          <w:cantSplit w:val="true"/>
+        </w:trPr>
         <w:tc>
           <w:tcPr>
             <w:tcW w:w="3001" w:type="dxa"/>
@@ -9505,12 +9651,12 @@
             </w:pPr>
             <w:r>
               <w:rPr>
-                <w:rFonts w:hint="default" w:ascii="Arial Regular" w:hAnsi="Arial Regular" w:cs="Arial Regular"/>
-                <w:sz w:val="22"/>
-                <w:szCs w:val="22"/>
-                <w:rtl w:val="0"/>
-              </w:rPr>
-              <w:t xml:space="preserve">The system should securely store farm data </w:t>
+                <w:rFonts w:hint="default" w:ascii="Arial" w:hAnsi="Arial" w:cs="Arial" w:eastAsia="Arial"/>
+                <w:sz w:val="22"/>
+                <w:szCs w:val="22"/>
+                <w:rtl w:val="0"/>
+              </w:rPr>
+              <w:t>The system must prevent users from accessing or changing farm data outside their authorized role and tank.</w:t>
             </w:r>
           </w:p>
         </w:tc>
@@ -9520,25 +9666,12 @@
             <w:vAlign w:val="top"/>
           </w:tcPr>
           <w:p>
-            <w:pPr>
-              <w:widowControl w:val="0"/>
-              <w:spacing w:line="240" w:lineRule="auto"/>
-              <w:jc w:val="both"/>
-              <w:rPr>
-                <w:rFonts w:hint="default" w:ascii="Arial Regular" w:hAnsi="Arial Regular" w:cs="Arial Regular"/>
-                <w:sz w:val="22"/>
-                <w:szCs w:val="22"/>
-                <w:rtl w:val="0"/>
-              </w:rPr>
-            </w:pPr>
-            <w:r>
-              <w:rPr>
-                <w:rFonts w:hint="default" w:ascii="Arial Regular" w:hAnsi="Arial Regular" w:cs="Arial Regular"/>
-                <w:sz w:val="22"/>
-                <w:szCs w:val="22"/>
-                <w:rtl w:val="0"/>
-              </w:rPr>
-              <w:t>Data encryption and secure storage mechanisms</w:t>
+            <w:r>
+              <w:rPr>
+                <w:rFonts w:ascii="Arial" w:hAnsi="Arial" w:eastAsia="Arial" w:cs="Arial"/>
+                <w:sz w:val="22"/>
+              </w:rPr>
+              <w:t>Authenticated, role-based, and owner-scoped access to protected system data and actions.</w:t>
             </w:r>
           </w:p>
         </w:tc>
@@ -9561,12 +9694,12 @@
             </w:pPr>
             <w:r>
               <w:rPr>
-                <w:rFonts w:hint="default" w:ascii="Arial Regular" w:hAnsi="Arial Regular" w:cs="Arial Regular"/>
-                <w:sz w:val="22"/>
-                <w:szCs w:val="22"/>
-                <w:rtl w:val="0"/>
-              </w:rPr>
-              <w:t xml:space="preserve">High </w:t>
+                <w:rFonts w:hint="default" w:ascii="Arial" w:hAnsi="Arial" w:cs="Arial" w:eastAsia="Arial"/>
+                <w:sz w:val="22"/>
+                <w:szCs w:val="22"/>
+                <w:rtl w:val="0"/>
+              </w:rPr>
+              <w:t>High</w:t>
             </w:r>
           </w:p>
         </w:tc>
@@ -9589,12 +9722,12 @@
             </w:pPr>
             <w:r>
               <w:rPr>
-                <w:rFonts w:hint="default" w:ascii="Arial Regular" w:hAnsi="Arial Regular" w:cs="Arial Regular"/>
-                <w:sz w:val="22"/>
-                <w:szCs w:val="22"/>
-                <w:rtl w:val="0"/>
-              </w:rPr>
-              <w:t xml:space="preserve">Implemented </w:t>
+                <w:rFonts w:hint="default" w:ascii="Arial" w:hAnsi="Arial" w:cs="Arial" w:eastAsia="Arial"/>
+                <w:sz w:val="22"/>
+                <w:szCs w:val="22"/>
+                <w:rtl w:val="0"/>
+              </w:rPr>
+              <w:t>Implemented</w:t>
             </w:r>
           </w:p>
         </w:tc>
@@ -9616,6 +9749,9 @@
             <w:right w:w="108" w:type="dxa"/>
           </w:tblCellMar>
         </w:tblPrEx>
+        <w:trPr>
+          <w:cantSplit w:val="true"/>
+        </w:trPr>
         <w:tc>
           <w:tcPr>
             <w:tcW w:w="3001" w:type="dxa"/>
@@ -9635,12 +9771,12 @@
             </w:pPr>
             <w:r>
               <w:rPr>
-                <w:rFonts w:hint="default" w:ascii="Arial Regular" w:hAnsi="Arial Regular" w:cs="Arial Regular"/>
-                <w:sz w:val="22"/>
-                <w:szCs w:val="22"/>
-                <w:rtl w:val="0"/>
-              </w:rPr>
-              <w:t xml:space="preserve">The system should support remote access and monitoring </w:t>
+                <w:rFonts w:hint="default" w:ascii="Arial" w:hAnsi="Arial" w:cs="Arial" w:eastAsia="Arial"/>
+                <w:sz w:val="22"/>
+                <w:szCs w:val="22"/>
+                <w:rtl w:val="0"/>
+              </w:rPr>
+              <w:t>The system should preserve valid sensor and production records without silent corruption or duplicate outcomes.</w:t>
             </w:r>
           </w:p>
         </w:tc>
@@ -9663,12 +9799,12 @@
             </w:pPr>
             <w:r>
               <w:rPr>
-                <w:rFonts w:hint="default" w:ascii="Arial Regular" w:hAnsi="Arial Regular" w:cs="Arial Regular"/>
-                <w:sz w:val="22"/>
-                <w:szCs w:val="22"/>
-                <w:rtl w:val="0"/>
-              </w:rPr>
-              <w:t>Secure remote IoT-based monitoring</w:t>
+                <w:rFonts w:hint="default" w:ascii="Arial" w:hAnsi="Arial" w:cs="Arial" w:eastAsia="Arial"/>
+                <w:sz w:val="22"/>
+                <w:szCs w:val="22"/>
+                <w:rtl w:val="0"/>
+              </w:rPr>
+              <w:t>Input validation and duplicate prevention for sensor and production records.</w:t>
             </w:r>
           </w:p>
         </w:tc>
@@ -9691,12 +9827,12 @@
             </w:pPr>
             <w:r>
               <w:rPr>
-                <w:rFonts w:hint="default" w:ascii="Arial Regular" w:hAnsi="Arial Regular" w:cs="Arial Regular"/>
-                <w:sz w:val="22"/>
-                <w:szCs w:val="22"/>
-                <w:rtl w:val="0"/>
-              </w:rPr>
-              <w:t xml:space="preserve">High </w:t>
+                <w:rFonts w:hint="default" w:ascii="Arial" w:hAnsi="Arial" w:cs="Arial" w:eastAsia="Arial"/>
+                <w:sz w:val="22"/>
+                <w:szCs w:val="22"/>
+                <w:rtl w:val="0"/>
+              </w:rPr>
+              <w:t>High</w:t>
             </w:r>
           </w:p>
         </w:tc>
@@ -9719,12 +9855,12 @@
             </w:pPr>
             <w:r>
               <w:rPr>
-                <w:rFonts w:hint="default" w:ascii="Arial Regular" w:hAnsi="Arial Regular" w:cs="Arial Regular"/>
-                <w:sz w:val="22"/>
-                <w:szCs w:val="22"/>
-                <w:rtl w:val="0"/>
-              </w:rPr>
-              <w:t xml:space="preserve">Implemented </w:t>
+                <w:rFonts w:hint="default" w:ascii="Arial" w:hAnsi="Arial" w:cs="Arial" w:eastAsia="Arial"/>
+                <w:sz w:val="22"/>
+                <w:szCs w:val="22"/>
+                <w:rtl w:val="0"/>
+              </w:rPr>
+              <w:t>Implemented</w:t>
             </w:r>
           </w:p>
         </w:tc>
@@ -9746,6 +9882,9 @@
             <w:right w:w="108" w:type="dxa"/>
           </w:tblCellMar>
         </w:tblPrEx>
+        <w:trPr>
+          <w:cantSplit w:val="true"/>
+        </w:trPr>
         <w:tc>
           <w:tcPr>
             <w:tcW w:w="3001" w:type="dxa"/>
@@ -9765,12 +9904,12 @@
             </w:pPr>
             <w:r>
               <w:rPr>
-                <w:rFonts w:hint="default" w:ascii="Arial Regular" w:hAnsi="Arial Regular" w:cs="Arial Regular"/>
-                <w:sz w:val="22"/>
-                <w:szCs w:val="22"/>
-                <w:rtl w:val="0"/>
-              </w:rPr>
-              <w:t xml:space="preserve">The system should maintain data accuracy and integrity </w:t>
+                <w:rFonts w:hint="default" w:ascii="Arial" w:hAnsi="Arial" w:cs="Arial" w:eastAsia="Arial"/>
+                <w:sz w:val="22"/>
+                <w:szCs w:val="22"/>
+                <w:rtl w:val="0"/>
+              </w:rPr>
+              <w:t>The system should be maintainable and updatable.</w:t>
             </w:r>
           </w:p>
         </w:tc>
@@ -9793,12 +9932,12 @@
             </w:pPr>
             <w:r>
               <w:rPr>
-                <w:rFonts w:hint="default" w:ascii="Arial Regular" w:hAnsi="Arial Regular" w:cs="Arial Regular"/>
-                <w:sz w:val="22"/>
-                <w:szCs w:val="22"/>
-                <w:rtl w:val="0"/>
-              </w:rPr>
-              <w:t>Data validation, filtering, and error correction</w:t>
+                <w:rFonts w:hint="default" w:ascii="Arial" w:hAnsi="Arial" w:cs="Arial" w:eastAsia="Arial"/>
+                <w:sz w:val="22"/>
+                <w:szCs w:val="22"/>
+                <w:rtl w:val="0"/>
+              </w:rPr>
+              <w:t>Modular and documented software architecture.</w:t>
             </w:r>
           </w:p>
         </w:tc>
@@ -9821,12 +9960,12 @@
             </w:pPr>
             <w:r>
               <w:rPr>
-                <w:rFonts w:hint="default" w:ascii="Arial Regular" w:hAnsi="Arial Regular" w:cs="Arial Regular"/>
-                <w:sz w:val="22"/>
-                <w:szCs w:val="22"/>
-                <w:rtl w:val="0"/>
-              </w:rPr>
-              <w:t xml:space="preserve">High </w:t>
+                <w:rFonts w:hint="default" w:ascii="Arial" w:hAnsi="Arial" w:cs="Arial" w:eastAsia="Arial"/>
+                <w:sz w:val="22"/>
+                <w:szCs w:val="22"/>
+                <w:rtl w:val="0"/>
+              </w:rPr>
+              <w:t>Medium</w:t>
             </w:r>
           </w:p>
         </w:tc>
@@ -9849,7 +9988,7 @@
             </w:pPr>
             <w:r>
               <w:rPr>
-                <w:rFonts w:hint="default" w:ascii="Arial Regular" w:hAnsi="Arial Regular" w:cs="Arial Regular"/>
+                <w:rFonts w:hint="default" w:ascii="Arial" w:hAnsi="Arial" w:cs="Arial" w:eastAsia="Arial"/>
                 <w:sz w:val="22"/>
                 <w:szCs w:val="22"/>
                 <w:rtl w:val="0"/>
@@ -9876,6 +10015,9 @@
             <w:right w:w="108" w:type="dxa"/>
           </w:tblCellMar>
         </w:tblPrEx>
+        <w:trPr>
+          <w:cantSplit w:val="true"/>
+        </w:trPr>
         <w:tc>
           <w:tcPr>
             <w:tcW w:w="3001" w:type="dxa"/>
@@ -9895,12 +10037,12 @@
             </w:pPr>
             <w:r>
               <w:rPr>
-                <w:rFonts w:hint="default" w:ascii="Arial Regular" w:hAnsi="Arial Regular" w:cs="Arial Regular"/>
-                <w:sz w:val="22"/>
-                <w:szCs w:val="22"/>
-                <w:rtl w:val="0"/>
-              </w:rPr>
-              <w:t xml:space="preserve">The system should be maintainable and updatable </w:t>
+                <w:rFonts w:hint="default" w:ascii="Arial" w:hAnsi="Arial" w:cs="Arial" w:eastAsia="Arial"/>
+                <w:sz w:val="22"/>
+                <w:szCs w:val="22"/>
+                <w:rtl w:val="0"/>
+              </w:rPr>
+              <w:t>The system should generate readable reports with labels, units, values, and calculations consistent with the app.</w:t>
             </w:r>
           </w:p>
         </w:tc>
@@ -9923,12 +10065,12 @@
             </w:pPr>
             <w:r>
               <w:rPr>
-                <w:rFonts w:hint="default" w:ascii="Arial Regular" w:hAnsi="Arial Regular" w:cs="Arial Regular"/>
-                <w:sz w:val="22"/>
-                <w:szCs w:val="22"/>
-                <w:rtl w:val="0"/>
-              </w:rPr>
-              <w:t>Modular and well-documented software architecture</w:t>
+                <w:rFonts w:hint="default" w:ascii="Arial" w:hAnsi="Arial" w:cs="Arial" w:eastAsia="Arial"/>
+                <w:sz w:val="22"/>
+                <w:szCs w:val="22"/>
+                <w:rtl w:val="0"/>
+              </w:rPr>
+              <w:t>Readable reports with labels, units, values, and calculations consistent with the app.</w:t>
             </w:r>
           </w:p>
         </w:tc>
@@ -9951,7 +10093,7 @@
             </w:pPr>
             <w:r>
               <w:rPr>
-                <w:rFonts w:hint="default" w:ascii="Arial Regular" w:hAnsi="Arial Regular" w:cs="Arial Regular"/>
+                <w:rFonts w:hint="default" w:ascii="Arial" w:hAnsi="Arial" w:cs="Arial" w:eastAsia="Arial"/>
                 <w:sz w:val="22"/>
                 <w:szCs w:val="22"/>
                 <w:rtl w:val="0"/>
@@ -9979,12 +10121,12 @@
             </w:pPr>
             <w:r>
               <w:rPr>
-                <w:rFonts w:hint="default" w:ascii="Arial Regular" w:hAnsi="Arial Regular" w:cs="Arial Regular"/>
-                <w:sz w:val="22"/>
-                <w:szCs w:val="22"/>
-                <w:rtl w:val="0"/>
-              </w:rPr>
-              <w:t xml:space="preserve">Implemented </w:t>
+                <w:rFonts w:hint="default" w:ascii="Arial" w:hAnsi="Arial" w:cs="Arial" w:eastAsia="Arial"/>
+                <w:sz w:val="22"/>
+                <w:szCs w:val="22"/>
+                <w:rtl w:val="0"/>
+              </w:rPr>
+              <w:t>Implemented</w:t>
             </w:r>
           </w:p>
         </w:tc>
@@ -10006,6 +10148,9 @@
             <w:right w:w="108" w:type="dxa"/>
           </w:tblCellMar>
         </w:tblPrEx>
+        <w:trPr>
+          <w:cantSplit w:val="true"/>
+        </w:trPr>
         <w:tc>
           <w:tcPr>
             <w:tcW w:w="3001" w:type="dxa"/>
@@ -10025,12 +10170,12 @@
             </w:pPr>
             <w:r>
               <w:rPr>
-                <w:rFonts w:hint="default" w:ascii="Arial Regular" w:hAnsi="Arial Regular" w:cs="Arial Regular"/>
-                <w:sz w:val="22"/>
-                <w:szCs w:val="22"/>
-                <w:rtl w:val="0"/>
-              </w:rPr>
-              <w:t>The system should generate consistent and readable reports</w:t>
+                <w:rFonts w:hint="default" w:ascii="Arial" w:hAnsi="Arial" w:cs="Arial" w:eastAsia="Arial"/>
+                <w:sz w:val="22"/>
+                <w:szCs w:val="22"/>
+                <w:rtl w:val="0"/>
+              </w:rPr>
+              <w:t>The system should maintain compatible data exchange among the Android mobile app, ESP32 hardware, Cloud Firestore, and Cloud Functions.</w:t>
             </w:r>
           </w:p>
         </w:tc>
@@ -10053,12 +10198,12 @@
             </w:pPr>
             <w:r>
               <w:rPr>
-                <w:rFonts w:hint="default" w:ascii="Arial Regular" w:hAnsi="Arial Regular" w:cs="Arial Regular"/>
-                <w:sz w:val="22"/>
-                <w:szCs w:val="22"/>
-                <w:rtl w:val="0"/>
-              </w:rPr>
-              <w:t>PDF and CSV exports preserve the selected date range, field labels, units, record values, and calculations consistently without modifying the stored source data</w:t>
+                <w:rFonts w:hint="default" w:ascii="Arial" w:hAnsi="Arial" w:cs="Arial" w:eastAsia="Arial"/>
+                <w:sz w:val="22"/>
+                <w:szCs w:val="22"/>
+                <w:rtl w:val="0"/>
+              </w:rPr>
+              <w:t>Compatible Firebase data formats, authenticated communication, and Android-to-ESP32 integration.</w:t>
             </w:r>
           </w:p>
         </w:tc>
@@ -10081,12 +10226,12 @@
             </w:pPr>
             <w:r>
               <w:rPr>
-                <w:rFonts w:hint="default" w:ascii="Arial Regular" w:hAnsi="Arial Regular" w:cs="Arial Regular"/>
-                <w:sz w:val="22"/>
-                <w:szCs w:val="22"/>
-                <w:rtl w:val="0"/>
-              </w:rPr>
-              <w:t>Medium</w:t>
+                <w:rFonts w:hint="default" w:ascii="Arial" w:hAnsi="Arial" w:cs="Arial" w:eastAsia="Arial"/>
+                <w:sz w:val="22"/>
+                <w:szCs w:val="22"/>
+                <w:rtl w:val="0"/>
+              </w:rPr>
+              <w:t>High</w:t>
             </w:r>
           </w:p>
         </w:tc>
@@ -10109,7 +10254,7 @@
             </w:pPr>
             <w:r>
               <w:rPr>
-                <w:rFonts w:hint="default" w:ascii="Arial Regular" w:hAnsi="Arial Regular" w:cs="Arial Regular"/>
+                <w:rFonts w:hint="default" w:ascii="Arial" w:hAnsi="Arial" w:cs="Arial" w:eastAsia="Arial"/>
                 <w:sz w:val="22"/>
                 <w:szCs w:val="22"/>
                 <w:rtl w:val="0"/>
@@ -10200,7 +10345,7 @@
           <w:szCs w:val="22"/>
           <w:lang w:val="en-US"/>
         </w:rPr>
-        <w:t>Table 3.2 presents the non-functional requirements and corresponding system features of the proposed crayfish monitoring and management system. These requirements define the expected quality, performance, and operational conditions of the system, including reliability, usability, security, scalability and real-time system responsiveness.</w:t>
+        <w:t>Table 3.2 presents the non-functional requirements and corresponding features of the proposed system. These requirements describe expected quality and operating conditions, including reliability, usability, security, compatibility, maintainability, data integrity, and response time.</w:t>
       </w:r>
     </w:p>
     <w:p>
@@ -10248,7 +10393,7 @@
           <w:szCs w:val="22"/>
           <w:lang w:val="en-US"/>
         </w:rPr>
-        <w:t>The hardware-related non-functional requirements focus on ensuring that the system components can operate consistently under aquaculture conditions. These include maintaining stable real-time monitoring, providing accurate sensor readings, supporting continuous data transmission, and ensuring that hardware components can withstand the environmental conditions of the crayfish culture setup.</w:t>
+        <w:t>The hardware-related non-functional requirements address sustained operation, sensor accuracy after calibration, reliable communication, and operation under the defined tank-side environment. Hardware accuracy, reliability, and environmental performance remain subject to field validation.</w:t>
       </w:r>
     </w:p>
     <w:p>
@@ -10296,7 +10441,7 @@
           <w:szCs w:val="22"/>
           <w:lang w:val="en-US"/>
         </w:rPr>
-        <w:t>The software-related non-functional requirements focus on ensuring efficient system operation and user interaction. These include fast data processing, responsive dashboard updates, and a simple and user-friendly mobile interface to support effective monitoring and management activities.</w:t>
+        <w:t>The software-related non-functional requirements address dashboard response time, usability, access control, data integrity, maintainability, and report consistency.</w:t>
       </w:r>
     </w:p>
     <w:p>
@@ -10344,7 +10489,7 @@
           <w:szCs w:val="22"/>
           <w:lang w:val="en-US"/>
         </w:rPr>
-        <w:t>These requirements serve as a basis for the development and assessment of the proposed system to ensure that the implemented features satisfy the expected operational and quality requirements.</w:t>
+        <w:t>An Implemented status indicates that the feature is present in the current prototype; it does not by itself confirm deployment or successful acceptance testing. Sensor accuracy, hardware reliability, model performance, and end-to-end response must be verified through the planned tests.</w:t>
       </w:r>
     </w:p>
     <w:sectPr>

</xml_diff>